<commit_message>
Ajouter les theories de la migration a la revue de litterature
La presentation passait directement aux motivations des transferts sans
exposer les theories de la migration elle-meme. Une diapositive expose
la theorie neoclassique et celle des reseaux, puis en tire la
consequence pour l'identification : l'acces au reseau n'est pas
distribue au hasard, les beneficiaires different des autres avant tout
transfert.

Le discours est mis a jour en consequence, les reperes de diapositive
etant decales a partir de la cinquieme.

Co-Authored-By: Claude <noreply@anthropic.com>
Claude-Session: https://claude.ai/code/session_01837AJxDdpW6rUH9DV9QD1H
</commit_message>
<xml_diff>
--- a/Presentation/discours/discours_soutenance.docx
+++ b/Presentation/discours/discours_soutenance.docx
@@ -94,7 +94,7 @@
           <w:sz w:val="22"/>
           <w:szCs w:val="22"/>
         </w:rPr>
-        <w:t xml:space="preserve">Durée visée : 18 minutes  ·  30 diapositives</w:t>
+        <w:t xml:space="preserve">Durée visée : 20 minutes  ·  31 diapositives</w:t>
       </w:r>
     </w:p>
     <w:p>
@@ -559,6 +559,105 @@
           <w:sz w:val="20"/>
           <w:szCs w:val="20"/>
         </w:rPr>
+        <w:t xml:space="preserve">  ·  Pourquoi l'on migre</w:t>
+      </w:r>
+      <w:r>
+        <w:rPr>
+          <w:rFonts w:ascii="Times New Roman" w:cs="Times New Roman" w:eastAsia="Times New Roman" w:hAnsi="Times New Roman"/>
+          <w:color w:val="6E747E"/>
+          <w:sz w:val="20"/>
+          <w:szCs w:val="20"/>
+        </w:rPr>
+        <w:t xml:space="preserve">	1 min 15</w:t>
+      </w:r>
+    </w:p>
+    <w:p>
+      <w:pPr>
+        <w:spacing w:after="160" w:line="360"/>
+        <w:jc w:val="both"/>
+      </w:pPr>
+      <w:r>
+        <w:rPr>
+          <w:rFonts w:ascii="Times New Roman" w:cs="Times New Roman" w:eastAsia="Times New Roman" w:hAnsi="Times New Roman"/>
+          <w:sz w:val="24"/>
+          <w:szCs w:val="24"/>
+        </w:rPr>
+        <w:t xml:space="preserve">Un mot d'abord sur la migration elle-même, car la décision de migrer et celle d'envoyer des fonds sont indissociables. La théorie néoclassique explique la migration par un calcul d'investissement : l'individu migre si la valeur actualisée des gains attendus à destination, nette des coûts du déplacement, excède ses gains d'origine, la décision se fondant sur le revenu espéré plutôt qu'effectif. Les envois de fonds sont alors le rendement de cet investissement migratoire.</w:t>
+      </w:r>
+    </w:p>
+    <w:p>
+      <w:pPr>
+        <w:spacing w:after="160" w:line="360"/>
+        <w:jc w:val="both"/>
+      </w:pPr>
+      <w:r>
+        <w:rPr>
+          <w:rFonts w:ascii="Times New Roman" w:cs="Times New Roman" w:eastAsia="Times New Roman" w:hAnsi="Times New Roman"/>
+          <w:sz w:val="24"/>
+          <w:szCs w:val="24"/>
+        </w:rPr>
+        <w:t xml:space="preserve">La théorie des réseaux complète cette approche. Les liens de parenté, d'amitié ou de communauté d'origine forment un capital social qui abaisse les coûts et les risques du départ : le migrant installé héberge le nouvel arrivant, l'informe et lui trouve un emploi. Chaque migration facilite ainsi les suivantes.</w:t>
+      </w:r>
+    </w:p>
+    <w:p>
+      <w:pPr>
+        <w:spacing w:after="160" w:line="360"/>
+        <w:jc w:val="both"/>
+      </w:pPr>
+      <w:r>
+        <w:rPr>
+          <w:rFonts w:ascii="Times New Roman" w:cs="Times New Roman" w:eastAsia="Times New Roman" w:hAnsi="Times New Roman"/>
+          <w:sz w:val="24"/>
+          <w:szCs w:val="24"/>
+        </w:rPr>
+        <w:t xml:space="preserve">J'insiste sur ce point, car il commande toute la suite du travail. Un ménage ne reçoit des transferts que si l'un des siens a pu émigrer, et il ne le peut que s'il dispose d'un réseau. Or l'accès au réseau dépend de l'histoire migratoire de la famille et du village, de la richesse initiale et des relations sociales du ménage. Les bénéficiaires diffèrent donc des autres avant même le premier franc reçu, et sur des caractéristiques dont certaines sont inobservables. C'est précisément ce que la stratégie d'identification devra traiter.</w:t>
+      </w:r>
+    </w:p>
+    <w:p>
+      <w:pPr>
+        <w:spacing w:after="160"/>
+        <w:ind w:left="340"/>
+      </w:pPr>
+      <w:r>
+        <w:rPr>
+          <w:rFonts w:ascii="Times New Roman" w:cs="Times New Roman" w:eastAsia="Times New Roman" w:hAnsi="Times New Roman"/>
+          <w:i/>
+          <w:iCs/>
+          <w:color w:val="6E747E"/>
+          <w:sz w:val="22"/>
+          <w:szCs w:val="22"/>
+        </w:rPr>
+        <w:t xml:space="preserve">C'est le point charnière de l'exposé : le dire lentement.</w:t>
+      </w:r>
+    </w:p>
+    <w:p>
+      <w:pPr>
+        <w:pBdr>
+          <w:bottom w:val="single" w:color="1CABE2" w:sz="6"/>
+        </w:pBdr>
+        <w:tabs>
+          <w:tab w:val="right" w:pos="9026"/>
+        </w:tabs>
+        <w:spacing w:after="120" w:before="320"/>
+      </w:pPr>
+      <w:r>
+        <w:rPr>
+          <w:rFonts w:ascii="Times New Roman" w:cs="Times New Roman" w:eastAsia="Times New Roman" w:hAnsi="Times New Roman"/>
+          <w:b/>
+          <w:bCs/>
+          <w:color w:val="0E6E96"/>
+          <w:sz w:val="20"/>
+          <w:szCs w:val="20"/>
+        </w:rPr>
+        <w:t xml:space="preserve">Diapositive 6</w:t>
+      </w:r>
+      <w:r>
+        <w:rPr>
+          <w:rFonts w:ascii="Times New Roman" w:cs="Times New Roman" w:eastAsia="Times New Roman" w:hAnsi="Times New Roman"/>
+          <w:color w:val="6E747E"/>
+          <w:sz w:val="20"/>
+          <w:szCs w:val="20"/>
+        </w:rPr>
         <w:t xml:space="preserve">  ·  Canaux de transmission</w:t>
       </w:r>
       <w:r>
@@ -632,7 +731,7 @@
           <w:sz w:val="20"/>
           <w:szCs w:val="20"/>
         </w:rPr>
-        <w:t xml:space="preserve">Diapositive 6</w:t>
+        <w:t xml:space="preserve">Diapositive 7</w:t>
       </w:r>
       <w:r>
         <w:rPr>
@@ -703,7 +802,7 @@
           <w:sz w:val="20"/>
           <w:szCs w:val="20"/>
         </w:rPr>
-        <w:t xml:space="preserve">Diapositive 7</w:t>
+        <w:t xml:space="preserve">Diapositive 8</w:t>
       </w:r>
       <w:r>
         <w:rPr>
@@ -771,7 +870,7 @@
           <w:sz w:val="20"/>
           <w:szCs w:val="20"/>
         </w:rPr>
-        <w:t xml:space="preserve">Diapositive 8</w:t>
+        <w:t xml:space="preserve">Diapositive 9</w:t>
       </w:r>
       <w:r>
         <w:rPr>
@@ -856,7 +955,7 @@
           <w:sz w:val="20"/>
           <w:szCs w:val="20"/>
         </w:rPr>
-        <w:t xml:space="preserve">Diapositive 9</w:t>
+        <w:t xml:space="preserve">Diapositive 10</w:t>
       </w:r>
       <w:r>
         <w:rPr>
@@ -938,7 +1037,7 @@
           <w:sz w:val="20"/>
           <w:szCs w:val="20"/>
         </w:rPr>
-        <w:t xml:space="preserve">Diapositive 10</w:t>
+        <w:t xml:space="preserve">Diapositive 11</w:t>
       </w:r>
       <w:r>
         <w:rPr>
@@ -992,7 +1091,7 @@
           <w:sz w:val="20"/>
           <w:szCs w:val="20"/>
         </w:rPr>
-        <w:t xml:space="preserve">Diapositive 11</w:t>
+        <w:t xml:space="preserve">Diapositive 12</w:t>
       </w:r>
       <w:r>
         <w:rPr>
@@ -1046,7 +1145,7 @@
           <w:sz w:val="20"/>
           <w:szCs w:val="20"/>
         </w:rPr>
-        <w:t xml:space="preserve">Diapositive 12</w:t>
+        <w:t xml:space="preserve">Diapositive 13</w:t>
       </w:r>
       <w:r>
         <w:rPr>
@@ -1117,7 +1216,7 @@
           <w:sz w:val="20"/>
           <w:szCs w:val="20"/>
         </w:rPr>
-        <w:t xml:space="preserve">Diapositive 13</w:t>
+        <w:t xml:space="preserve">Diapositive 14</w:t>
       </w:r>
       <w:r>
         <w:rPr>
@@ -1171,7 +1270,7 @@
           <w:sz w:val="20"/>
           <w:szCs w:val="20"/>
         </w:rPr>
-        <w:t xml:space="preserve">Diapositive 14</w:t>
+        <w:t xml:space="preserve">Diapositive 15</w:t>
       </w:r>
       <w:r>
         <w:rPr>
@@ -1225,7 +1324,7 @@
           <w:sz w:val="20"/>
           <w:szCs w:val="20"/>
         </w:rPr>
-        <w:t xml:space="preserve">Diapositive 15</w:t>
+        <w:t xml:space="preserve">Diapositive 16</w:t>
       </w:r>
       <w:r>
         <w:rPr>
@@ -1279,7 +1378,7 @@
           <w:sz w:val="20"/>
           <w:szCs w:val="20"/>
         </w:rPr>
-        <w:t xml:space="preserve">Diapositive 16</w:t>
+        <w:t xml:space="preserve">Diapositive 17</w:t>
       </w:r>
       <w:r>
         <w:rPr>
@@ -1333,7 +1432,7 @@
           <w:sz w:val="20"/>
           <w:szCs w:val="20"/>
         </w:rPr>
-        <w:t xml:space="preserve">Diapositive 17</w:t>
+        <w:t xml:space="preserve">Diapositive 18</w:t>
       </w:r>
       <w:r>
         <w:rPr>
@@ -1404,7 +1503,7 @@
           <w:sz w:val="20"/>
           <w:szCs w:val="20"/>
         </w:rPr>
-        <w:t xml:space="preserve">Diapositive 18</w:t>
+        <w:t xml:space="preserve">Diapositive 19</w:t>
       </w:r>
       <w:r>
         <w:rPr>
@@ -1486,7 +1585,7 @@
           <w:sz w:val="20"/>
           <w:szCs w:val="20"/>
         </w:rPr>
-        <w:t xml:space="preserve">Diapositive 19</w:t>
+        <w:t xml:space="preserve">Diapositive 20</w:t>
       </w:r>
       <w:r>
         <w:rPr>
@@ -1554,7 +1653,7 @@
           <w:sz w:val="20"/>
           <w:szCs w:val="20"/>
         </w:rPr>
-        <w:t xml:space="preserve">Diapositive 20</w:t>
+        <w:t xml:space="preserve">Diapositive 21</w:t>
       </w:r>
       <w:r>
         <w:rPr>
@@ -1639,7 +1738,7 @@
           <w:sz w:val="20"/>
           <w:szCs w:val="20"/>
         </w:rPr>
-        <w:t xml:space="preserve">Diapositive 21</w:t>
+        <w:t xml:space="preserve">Diapositive 22</w:t>
       </w:r>
       <w:r>
         <w:rPr>
@@ -1693,7 +1792,7 @@
           <w:sz w:val="20"/>
           <w:szCs w:val="20"/>
         </w:rPr>
-        <w:t xml:space="preserve">Diapositive 22</w:t>
+        <w:t xml:space="preserve">Diapositive 23</w:t>
       </w:r>
       <w:r>
         <w:rPr>
@@ -1747,7 +1846,7 @@
           <w:sz w:val="20"/>
           <w:szCs w:val="20"/>
         </w:rPr>
-        <w:t xml:space="preserve">Diapositive 23</w:t>
+        <w:t xml:space="preserve">Diapositive 24</w:t>
       </w:r>
       <w:r>
         <w:rPr>
@@ -1843,7 +1942,7 @@
           <w:sz w:val="20"/>
           <w:szCs w:val="20"/>
         </w:rPr>
-        <w:t xml:space="preserve">Diapositive 24</w:t>
+        <w:t xml:space="preserve">Diapositive 25</w:t>
       </w:r>
       <w:r>
         <w:rPr>
@@ -1914,7 +2013,7 @@
           <w:sz w:val="20"/>
           <w:szCs w:val="20"/>
         </w:rPr>
-        <w:t xml:space="preserve">Diapositive 25</w:t>
+        <w:t xml:space="preserve">Diapositive 26</w:t>
       </w:r>
       <w:r>
         <w:rPr>
@@ -1968,7 +2067,7 @@
           <w:sz w:val="20"/>
           <w:szCs w:val="20"/>
         </w:rPr>
-        <w:t xml:space="preserve">Diapositive 26</w:t>
+        <w:t xml:space="preserve">Diapositive 27</w:t>
       </w:r>
       <w:r>
         <w:rPr>
@@ -2050,7 +2149,7 @@
           <w:sz w:val="20"/>
           <w:szCs w:val="20"/>
         </w:rPr>
-        <w:t xml:space="preserve">Diapositive 27</w:t>
+        <w:t xml:space="preserve">Diapositive 28</w:t>
       </w:r>
       <w:r>
         <w:rPr>
@@ -2104,7 +2203,7 @@
           <w:sz w:val="20"/>
           <w:szCs w:val="20"/>
         </w:rPr>
-        <w:t xml:space="preserve">Diapositive 28</w:t>
+        <w:t xml:space="preserve">Diapositive 29</w:t>
       </w:r>
       <w:r>
         <w:rPr>

</xml_diff>

<commit_message>
Ajouter les theories de la migration a la revue de litterature (#748)
La presentation passait directement aux motivations des transferts sans
exposer les theories de la migration elle-meme. Une diapositive expose
la theorie neoclassique et celle des reseaux, puis en tire la
consequence pour l'identification : l'acces au reseau n'est pas
distribue au hasard, les beneficiaires different des autres avant tout
transfert.

Le discours est mis a jour en consequence, les reperes de diapositive
etant decales a partir de la cinquieme.


Claude-Session: https://claude.ai/code/session_01837AJxDdpW6rUH9DV9QD1H

Co-authored-by: Claude <noreply@anthropic.com>
</commit_message>
<xml_diff>
--- a/Presentation/discours/discours_soutenance.docx
+++ b/Presentation/discours/discours_soutenance.docx
@@ -94,7 +94,7 @@
           <w:sz w:val="22"/>
           <w:szCs w:val="22"/>
         </w:rPr>
-        <w:t xml:space="preserve">Durée visée : 18 minutes  ·  30 diapositives</w:t>
+        <w:t xml:space="preserve">Durée visée : 20 minutes  ·  31 diapositives</w:t>
       </w:r>
     </w:p>
     <w:p>
@@ -559,6 +559,105 @@
           <w:sz w:val="20"/>
           <w:szCs w:val="20"/>
         </w:rPr>
+        <w:t xml:space="preserve">  ·  Pourquoi l'on migre</w:t>
+      </w:r>
+      <w:r>
+        <w:rPr>
+          <w:rFonts w:ascii="Times New Roman" w:cs="Times New Roman" w:eastAsia="Times New Roman" w:hAnsi="Times New Roman"/>
+          <w:color w:val="6E747E"/>
+          <w:sz w:val="20"/>
+          <w:szCs w:val="20"/>
+        </w:rPr>
+        <w:t xml:space="preserve">	1 min 15</w:t>
+      </w:r>
+    </w:p>
+    <w:p>
+      <w:pPr>
+        <w:spacing w:after="160" w:line="360"/>
+        <w:jc w:val="both"/>
+      </w:pPr>
+      <w:r>
+        <w:rPr>
+          <w:rFonts w:ascii="Times New Roman" w:cs="Times New Roman" w:eastAsia="Times New Roman" w:hAnsi="Times New Roman"/>
+          <w:sz w:val="24"/>
+          <w:szCs w:val="24"/>
+        </w:rPr>
+        <w:t xml:space="preserve">Un mot d'abord sur la migration elle-même, car la décision de migrer et celle d'envoyer des fonds sont indissociables. La théorie néoclassique explique la migration par un calcul d'investissement : l'individu migre si la valeur actualisée des gains attendus à destination, nette des coûts du déplacement, excède ses gains d'origine, la décision se fondant sur le revenu espéré plutôt qu'effectif. Les envois de fonds sont alors le rendement de cet investissement migratoire.</w:t>
+      </w:r>
+    </w:p>
+    <w:p>
+      <w:pPr>
+        <w:spacing w:after="160" w:line="360"/>
+        <w:jc w:val="both"/>
+      </w:pPr>
+      <w:r>
+        <w:rPr>
+          <w:rFonts w:ascii="Times New Roman" w:cs="Times New Roman" w:eastAsia="Times New Roman" w:hAnsi="Times New Roman"/>
+          <w:sz w:val="24"/>
+          <w:szCs w:val="24"/>
+        </w:rPr>
+        <w:t xml:space="preserve">La théorie des réseaux complète cette approche. Les liens de parenté, d'amitié ou de communauté d'origine forment un capital social qui abaisse les coûts et les risques du départ : le migrant installé héberge le nouvel arrivant, l'informe et lui trouve un emploi. Chaque migration facilite ainsi les suivantes.</w:t>
+      </w:r>
+    </w:p>
+    <w:p>
+      <w:pPr>
+        <w:spacing w:after="160" w:line="360"/>
+        <w:jc w:val="both"/>
+      </w:pPr>
+      <w:r>
+        <w:rPr>
+          <w:rFonts w:ascii="Times New Roman" w:cs="Times New Roman" w:eastAsia="Times New Roman" w:hAnsi="Times New Roman"/>
+          <w:sz w:val="24"/>
+          <w:szCs w:val="24"/>
+        </w:rPr>
+        <w:t xml:space="preserve">J'insiste sur ce point, car il commande toute la suite du travail. Un ménage ne reçoit des transferts que si l'un des siens a pu émigrer, et il ne le peut que s'il dispose d'un réseau. Or l'accès au réseau dépend de l'histoire migratoire de la famille et du village, de la richesse initiale et des relations sociales du ménage. Les bénéficiaires diffèrent donc des autres avant même le premier franc reçu, et sur des caractéristiques dont certaines sont inobservables. C'est précisément ce que la stratégie d'identification devra traiter.</w:t>
+      </w:r>
+    </w:p>
+    <w:p>
+      <w:pPr>
+        <w:spacing w:after="160"/>
+        <w:ind w:left="340"/>
+      </w:pPr>
+      <w:r>
+        <w:rPr>
+          <w:rFonts w:ascii="Times New Roman" w:cs="Times New Roman" w:eastAsia="Times New Roman" w:hAnsi="Times New Roman"/>
+          <w:i/>
+          <w:iCs/>
+          <w:color w:val="6E747E"/>
+          <w:sz w:val="22"/>
+          <w:szCs w:val="22"/>
+        </w:rPr>
+        <w:t xml:space="preserve">C'est le point charnière de l'exposé : le dire lentement.</w:t>
+      </w:r>
+    </w:p>
+    <w:p>
+      <w:pPr>
+        <w:pBdr>
+          <w:bottom w:val="single" w:color="1CABE2" w:sz="6"/>
+        </w:pBdr>
+        <w:tabs>
+          <w:tab w:val="right" w:pos="9026"/>
+        </w:tabs>
+        <w:spacing w:after="120" w:before="320"/>
+      </w:pPr>
+      <w:r>
+        <w:rPr>
+          <w:rFonts w:ascii="Times New Roman" w:cs="Times New Roman" w:eastAsia="Times New Roman" w:hAnsi="Times New Roman"/>
+          <w:b/>
+          <w:bCs/>
+          <w:color w:val="0E6E96"/>
+          <w:sz w:val="20"/>
+          <w:szCs w:val="20"/>
+        </w:rPr>
+        <w:t xml:space="preserve">Diapositive 6</w:t>
+      </w:r>
+      <w:r>
+        <w:rPr>
+          <w:rFonts w:ascii="Times New Roman" w:cs="Times New Roman" w:eastAsia="Times New Roman" w:hAnsi="Times New Roman"/>
+          <w:color w:val="6E747E"/>
+          <w:sz w:val="20"/>
+          <w:szCs w:val="20"/>
+        </w:rPr>
         <w:t xml:space="preserve">  ·  Canaux de transmission</w:t>
       </w:r>
       <w:r>
@@ -632,7 +731,7 @@
           <w:sz w:val="20"/>
           <w:szCs w:val="20"/>
         </w:rPr>
-        <w:t xml:space="preserve">Diapositive 6</w:t>
+        <w:t xml:space="preserve">Diapositive 7</w:t>
       </w:r>
       <w:r>
         <w:rPr>
@@ -703,7 +802,7 @@
           <w:sz w:val="20"/>
           <w:szCs w:val="20"/>
         </w:rPr>
-        <w:t xml:space="preserve">Diapositive 7</w:t>
+        <w:t xml:space="preserve">Diapositive 8</w:t>
       </w:r>
       <w:r>
         <w:rPr>
@@ -771,7 +870,7 @@
           <w:sz w:val="20"/>
           <w:szCs w:val="20"/>
         </w:rPr>
-        <w:t xml:space="preserve">Diapositive 8</w:t>
+        <w:t xml:space="preserve">Diapositive 9</w:t>
       </w:r>
       <w:r>
         <w:rPr>
@@ -856,7 +955,7 @@
           <w:sz w:val="20"/>
           <w:szCs w:val="20"/>
         </w:rPr>
-        <w:t xml:space="preserve">Diapositive 9</w:t>
+        <w:t xml:space="preserve">Diapositive 10</w:t>
       </w:r>
       <w:r>
         <w:rPr>
@@ -938,7 +1037,7 @@
           <w:sz w:val="20"/>
           <w:szCs w:val="20"/>
         </w:rPr>
-        <w:t xml:space="preserve">Diapositive 10</w:t>
+        <w:t xml:space="preserve">Diapositive 11</w:t>
       </w:r>
       <w:r>
         <w:rPr>
@@ -992,7 +1091,7 @@
           <w:sz w:val="20"/>
           <w:szCs w:val="20"/>
         </w:rPr>
-        <w:t xml:space="preserve">Diapositive 11</w:t>
+        <w:t xml:space="preserve">Diapositive 12</w:t>
       </w:r>
       <w:r>
         <w:rPr>
@@ -1046,7 +1145,7 @@
           <w:sz w:val="20"/>
           <w:szCs w:val="20"/>
         </w:rPr>
-        <w:t xml:space="preserve">Diapositive 12</w:t>
+        <w:t xml:space="preserve">Diapositive 13</w:t>
       </w:r>
       <w:r>
         <w:rPr>
@@ -1117,7 +1216,7 @@
           <w:sz w:val="20"/>
           <w:szCs w:val="20"/>
         </w:rPr>
-        <w:t xml:space="preserve">Diapositive 13</w:t>
+        <w:t xml:space="preserve">Diapositive 14</w:t>
       </w:r>
       <w:r>
         <w:rPr>
@@ -1171,7 +1270,7 @@
           <w:sz w:val="20"/>
           <w:szCs w:val="20"/>
         </w:rPr>
-        <w:t xml:space="preserve">Diapositive 14</w:t>
+        <w:t xml:space="preserve">Diapositive 15</w:t>
       </w:r>
       <w:r>
         <w:rPr>
@@ -1225,7 +1324,7 @@
           <w:sz w:val="20"/>
           <w:szCs w:val="20"/>
         </w:rPr>
-        <w:t xml:space="preserve">Diapositive 15</w:t>
+        <w:t xml:space="preserve">Diapositive 16</w:t>
       </w:r>
       <w:r>
         <w:rPr>
@@ -1279,7 +1378,7 @@
           <w:sz w:val="20"/>
           <w:szCs w:val="20"/>
         </w:rPr>
-        <w:t xml:space="preserve">Diapositive 16</w:t>
+        <w:t xml:space="preserve">Diapositive 17</w:t>
       </w:r>
       <w:r>
         <w:rPr>
@@ -1333,7 +1432,7 @@
           <w:sz w:val="20"/>
           <w:szCs w:val="20"/>
         </w:rPr>
-        <w:t xml:space="preserve">Diapositive 17</w:t>
+        <w:t xml:space="preserve">Diapositive 18</w:t>
       </w:r>
       <w:r>
         <w:rPr>
@@ -1404,7 +1503,7 @@
           <w:sz w:val="20"/>
           <w:szCs w:val="20"/>
         </w:rPr>
-        <w:t xml:space="preserve">Diapositive 18</w:t>
+        <w:t xml:space="preserve">Diapositive 19</w:t>
       </w:r>
       <w:r>
         <w:rPr>
@@ -1486,7 +1585,7 @@
           <w:sz w:val="20"/>
           <w:szCs w:val="20"/>
         </w:rPr>
-        <w:t xml:space="preserve">Diapositive 19</w:t>
+        <w:t xml:space="preserve">Diapositive 20</w:t>
       </w:r>
       <w:r>
         <w:rPr>
@@ -1554,7 +1653,7 @@
           <w:sz w:val="20"/>
           <w:szCs w:val="20"/>
         </w:rPr>
-        <w:t xml:space="preserve">Diapositive 20</w:t>
+        <w:t xml:space="preserve">Diapositive 21</w:t>
       </w:r>
       <w:r>
         <w:rPr>
@@ -1639,7 +1738,7 @@
           <w:sz w:val="20"/>
           <w:szCs w:val="20"/>
         </w:rPr>
-        <w:t xml:space="preserve">Diapositive 21</w:t>
+        <w:t xml:space="preserve">Diapositive 22</w:t>
       </w:r>
       <w:r>
         <w:rPr>
@@ -1693,7 +1792,7 @@
           <w:sz w:val="20"/>
           <w:szCs w:val="20"/>
         </w:rPr>
-        <w:t xml:space="preserve">Diapositive 22</w:t>
+        <w:t xml:space="preserve">Diapositive 23</w:t>
       </w:r>
       <w:r>
         <w:rPr>
@@ -1747,7 +1846,7 @@
           <w:sz w:val="20"/>
           <w:szCs w:val="20"/>
         </w:rPr>
-        <w:t xml:space="preserve">Diapositive 23</w:t>
+        <w:t xml:space="preserve">Diapositive 24</w:t>
       </w:r>
       <w:r>
         <w:rPr>
@@ -1843,7 +1942,7 @@
           <w:sz w:val="20"/>
           <w:szCs w:val="20"/>
         </w:rPr>
-        <w:t xml:space="preserve">Diapositive 24</w:t>
+        <w:t xml:space="preserve">Diapositive 25</w:t>
       </w:r>
       <w:r>
         <w:rPr>
@@ -1914,7 +2013,7 @@
           <w:sz w:val="20"/>
           <w:szCs w:val="20"/>
         </w:rPr>
-        <w:t xml:space="preserve">Diapositive 25</w:t>
+        <w:t xml:space="preserve">Diapositive 26</w:t>
       </w:r>
       <w:r>
         <w:rPr>
@@ -1968,7 +2067,7 @@
           <w:sz w:val="20"/>
           <w:szCs w:val="20"/>
         </w:rPr>
-        <w:t xml:space="preserve">Diapositive 26</w:t>
+        <w:t xml:space="preserve">Diapositive 27</w:t>
       </w:r>
       <w:r>
         <w:rPr>
@@ -2050,7 +2149,7 @@
           <w:sz w:val="20"/>
           <w:szCs w:val="20"/>
         </w:rPr>
-        <w:t xml:space="preserve">Diapositive 27</w:t>
+        <w:t xml:space="preserve">Diapositive 28</w:t>
       </w:r>
       <w:r>
         <w:rPr>
@@ -2104,7 +2203,7 @@
           <w:sz w:val="20"/>
           <w:szCs w:val="20"/>
         </w:rPr>
-        <w:t xml:space="preserve">Diapositive 28</w:t>
+        <w:t xml:space="preserve">Diapositive 29</w:t>
       </w:r>
       <w:r>
         <w:rPr>

</xml_diff>

<commit_message>
Ouvrir chaque diapositive du discours par une phrase d'attaque
Chaque section du discours commence par une phrase courte, composee en
gras et dans un corps superieur, immediatement reperable a l'oeil. Elle
donne la premiere phrase a prononcer devant la diapositive, avant le
texte detaille qui suit.

Co-Authored-By: Claude <noreply@anthropic.com>
Claude-Session: https://claude.ai/code/session_01837AJxDdpW6rUH9DV9QD1H
</commit_message>
<xml_diff>
--- a/Presentation/discours/discours_soutenance.docx
+++ b/Presentation/discours/discours_soutenance.docx
@@ -165,6 +165,22 @@
     </w:p>
     <w:p>
       <w:pPr>
+        <w:spacing w:after="200" w:before="60"/>
+      </w:pPr>
+      <w:r>
+        <w:rPr>
+          <w:rFonts w:ascii="Times New Roman" w:cs="Times New Roman" w:eastAsia="Times New Roman" w:hAnsi="Times New Roman"/>
+          <w:b/>
+          <w:bCs/>
+          <w:color w:val="0E6E96"/>
+          <w:sz w:val="30"/>
+          <w:szCs w:val="30"/>
+        </w:rPr>
+        <w:t xml:space="preserve">Monsieur le Président du jury, mesdames et messieurs, bonjour.</w:t>
+      </w:r>
+    </w:p>
+    <w:p>
+      <w:pPr>
         <w:spacing w:after="160" w:line="360"/>
         <w:jc w:val="both"/>
       </w:pPr>
@@ -250,6 +266,22 @@
     </w:p>
     <w:p>
       <w:pPr>
+        <w:spacing w:after="200" w:before="60"/>
+      </w:pPr>
+      <w:r>
+        <w:rPr>
+          <w:rFonts w:ascii="Times New Roman" w:cs="Times New Roman" w:eastAsia="Times New Roman" w:hAnsi="Times New Roman"/>
+          <w:b/>
+          <w:bCs/>
+          <w:color w:val="0E6E96"/>
+          <w:sz w:val="30"/>
+          <w:szCs w:val="30"/>
+        </w:rPr>
+        <w:t xml:space="preserve">Mon exposé suivra six temps.</w:t>
+      </w:r>
+    </w:p>
+    <w:p>
+      <w:pPr>
         <w:spacing w:after="160" w:line="360"/>
         <w:jc w:val="both"/>
       </w:pPr>
@@ -321,6 +353,22 @@
     </w:p>
     <w:p>
       <w:pPr>
+        <w:spacing w:after="200" w:before="60"/>
+      </w:pPr>
+      <w:r>
+        <w:rPr>
+          <w:rFonts w:ascii="Times New Roman" w:cs="Times New Roman" w:eastAsia="Times New Roman" w:hAnsi="Times New Roman"/>
+          <w:b/>
+          <w:bCs/>
+          <w:color w:val="0E6E96"/>
+          <w:sz w:val="30"/>
+          <w:szCs w:val="30"/>
+        </w:rPr>
+        <w:t xml:space="preserve">Deux réalités coexistent au Sénégal.</w:t>
+      </w:r>
+    </w:p>
+    <w:p>
+      <w:pPr>
         <w:spacing w:after="160" w:line="360"/>
         <w:jc w:val="both"/>
       </w:pPr>
@@ -420,6 +468,22 @@
     </w:p>
     <w:p>
       <w:pPr>
+        <w:spacing w:after="200" w:before="60"/>
+      </w:pPr>
+      <w:r>
+        <w:rPr>
+          <w:rFonts w:ascii="Times New Roman" w:cs="Times New Roman" w:eastAsia="Times New Roman" w:hAnsi="Times New Roman"/>
+          <w:b/>
+          <w:bCs/>
+          <w:color w:val="0E6E96"/>
+          <w:sz w:val="30"/>
+          <w:szCs w:val="30"/>
+        </w:rPr>
+        <w:t xml:space="preserve">D'où la question qui structure ce mémoire.</w:t>
+      </w:r>
+    </w:p>
+    <w:p>
+      <w:pPr>
         <w:spacing w:after="160" w:line="360"/>
         <w:jc w:val="both"/>
       </w:pPr>
@@ -488,6 +552,22 @@
     </w:p>
     <w:p>
       <w:pPr>
+        <w:spacing w:after="200" w:before="60"/>
+      </w:pPr>
+      <w:r>
+        <w:rPr>
+          <w:rFonts w:ascii="Times New Roman" w:cs="Times New Roman" w:eastAsia="Times New Roman" w:hAnsi="Times New Roman"/>
+          <w:b/>
+          <w:bCs/>
+          <w:color w:val="0E6E96"/>
+          <w:sz w:val="30"/>
+          <w:szCs w:val="30"/>
+        </w:rPr>
+        <w:t xml:space="preserve">Cette question se décline en deux objectifs et deux hypothèses.</w:t>
+      </w:r>
+    </w:p>
+    <w:p>
+      <w:pPr>
         <w:spacing w:after="160" w:line="360"/>
         <w:jc w:val="both"/>
       </w:pPr>
@@ -573,6 +653,22 @@
     </w:p>
     <w:p>
       <w:pPr>
+        <w:spacing w:after="200" w:before="60"/>
+      </w:pPr>
+      <w:r>
+        <w:rPr>
+          <w:rFonts w:ascii="Times New Roman" w:cs="Times New Roman" w:eastAsia="Times New Roman" w:hAnsi="Times New Roman"/>
+          <w:b/>
+          <w:bCs/>
+          <w:color w:val="0E6E96"/>
+          <w:sz w:val="30"/>
+          <w:szCs w:val="30"/>
+        </w:rPr>
+        <w:t xml:space="preserve">Un mot d'abord sur la migration elle-même.</w:t>
+      </w:r>
+    </w:p>
+    <w:p>
+      <w:pPr>
         <w:spacing w:after="160" w:line="360"/>
         <w:jc w:val="both"/>
       </w:pPr>
@@ -672,6 +768,22 @@
     </w:p>
     <w:p>
       <w:pPr>
+        <w:spacing w:after="200" w:before="60"/>
+      </w:pPr>
+      <w:r>
+        <w:rPr>
+          <w:rFonts w:ascii="Times New Roman" w:cs="Times New Roman" w:eastAsia="Times New Roman" w:hAnsi="Times New Roman"/>
+          <w:b/>
+          <w:bCs/>
+          <w:color w:val="0E6E96"/>
+          <w:sz w:val="30"/>
+          <w:szCs w:val="30"/>
+        </w:rPr>
+        <w:t xml:space="preserve">Pourquoi les migrants transfèrent-ils, et avec quels effets ?</w:t>
+      </w:r>
+    </w:p>
+    <w:p>
+      <w:pPr>
         <w:spacing w:after="160" w:line="360"/>
         <w:jc w:val="both"/>
       </w:pPr>
@@ -754,6 +866,22 @@
     </w:p>
     <w:p>
       <w:pPr>
+        <w:spacing w:after="200" w:before="60"/>
+      </w:pPr>
+      <w:r>
+        <w:rPr>
+          <w:rFonts w:ascii="Times New Roman" w:cs="Times New Roman" w:eastAsia="Times New Roman" w:hAnsi="Times New Roman"/>
+          <w:b/>
+          <w:bCs/>
+          <w:color w:val="0E6E96"/>
+          <w:sz w:val="30"/>
+          <w:szCs w:val="30"/>
+        </w:rPr>
+        <w:t xml:space="preserve">Mesurer la pauvreté d'un enfant par le seul revenu ne suffit pas.</w:t>
+      </w:r>
+    </w:p>
+    <w:p>
+      <w:pPr>
         <w:spacing w:after="160" w:line="360"/>
         <w:jc w:val="both"/>
       </w:pPr>
@@ -825,6 +953,22 @@
     </w:p>
     <w:p>
       <w:pPr>
+        <w:spacing w:after="200" w:before="60"/>
+      </w:pPr>
+      <w:r>
+        <w:rPr>
+          <w:rFonts w:ascii="Times New Roman" w:cs="Times New Roman" w:eastAsia="Times New Roman" w:hAnsi="Times New Roman"/>
+          <w:b/>
+          <w:bCs/>
+          <w:color w:val="0E6E96"/>
+          <w:sz w:val="30"/>
+          <w:szCs w:val="30"/>
+        </w:rPr>
+        <w:t xml:space="preserve">J'en viens aux données.</w:t>
+      </w:r>
+    </w:p>
+    <w:p>
+      <w:pPr>
         <w:spacing w:after="160" w:line="360"/>
         <w:jc w:val="both"/>
       </w:pPr>
@@ -893,6 +1037,22 @@
     </w:p>
     <w:p>
       <w:pPr>
+        <w:spacing w:after="200" w:before="60"/>
+      </w:pPr>
+      <w:r>
+        <w:rPr>
+          <w:rFonts w:ascii="Times New Roman" w:cs="Times New Roman" w:eastAsia="Times New Roman" w:hAnsi="Times New Roman"/>
+          <w:b/>
+          <w:bCs/>
+          <w:color w:val="0E6E96"/>
+          <w:sz w:val="30"/>
+          <w:szCs w:val="30"/>
+        </w:rPr>
+        <w:t xml:space="preserve">Comment mesure-t-on cette pauvreté ?</w:t>
+      </w:r>
+    </w:p>
+    <w:p>
+      <w:pPr>
         <w:spacing w:after="160" w:line="360"/>
         <w:jc w:val="both"/>
       </w:pPr>
@@ -978,6 +1138,22 @@
     </w:p>
     <w:p>
       <w:pPr>
+        <w:spacing w:after="200" w:before="60"/>
+      </w:pPr>
+      <w:r>
+        <w:rPr>
+          <w:rFonts w:ascii="Times New Roman" w:cs="Times New Roman" w:eastAsia="Times New Roman" w:hAnsi="Times New Roman"/>
+          <w:b/>
+          <w:bCs/>
+          <w:color w:val="0E6E96"/>
+          <w:sz w:val="30"/>
+          <w:szCs w:val="30"/>
+        </w:rPr>
+        <w:t xml:space="preserve">J'en viens au cœur méthodologique du travail.</w:t>
+      </w:r>
+    </w:p>
+    <w:p>
+      <w:pPr>
         <w:spacing w:after="160" w:line="360"/>
         <w:jc w:val="both"/>
       </w:pPr>
@@ -1060,6 +1236,22 @@
     </w:p>
     <w:p>
       <w:pPr>
+        <w:spacing w:after="200" w:before="60"/>
+      </w:pPr>
+      <w:r>
+        <w:rPr>
+          <w:rFonts w:ascii="Times New Roman" w:cs="Times New Roman" w:eastAsia="Times New Roman" w:hAnsi="Times New Roman"/>
+          <w:b/>
+          <w:bCs/>
+          <w:color w:val="0E6E96"/>
+          <w:sz w:val="30"/>
+          <w:szCs w:val="30"/>
+        </w:rPr>
+        <w:t xml:space="preserve">Première brique, l'appariement.</w:t>
+      </w:r>
+    </w:p>
+    <w:p>
+      <w:pPr>
         <w:spacing w:after="160" w:line="360"/>
         <w:jc w:val="both"/>
       </w:pPr>
@@ -1114,6 +1306,22 @@
     </w:p>
     <w:p>
       <w:pPr>
+        <w:spacing w:after="200" w:before="60"/>
+      </w:pPr>
+      <w:r>
+        <w:rPr>
+          <w:rFonts w:ascii="Times New Roman" w:cs="Times New Roman" w:eastAsia="Times New Roman" w:hAnsi="Times New Roman"/>
+          <w:b/>
+          <w:bCs/>
+          <w:color w:val="0E6E96"/>
+          <w:sz w:val="30"/>
+          <w:szCs w:val="30"/>
+        </w:rPr>
+        <w:t xml:space="preserve">Seconde brique, la double différence.</w:t>
+      </w:r>
+    </w:p>
+    <w:p>
+      <w:pPr>
         <w:spacing w:after="160" w:line="360"/>
         <w:jc w:val="both"/>
       </w:pPr>
@@ -1168,6 +1376,22 @@
     </w:p>
     <w:p>
       <w:pPr>
+        <w:spacing w:after="200" w:before="60"/>
+      </w:pPr>
+      <w:r>
+        <w:rPr>
+          <w:rFonts w:ascii="Times New Roman" w:cs="Times New Roman" w:eastAsia="Times New Roman" w:hAnsi="Times New Roman"/>
+          <w:b/>
+          <w:bCs/>
+          <w:color w:val="0E6E96"/>
+          <w:sz w:val="30"/>
+          <w:szCs w:val="30"/>
+        </w:rPr>
+        <w:t xml:space="preserve">L'estimateur retenu combine les deux.</w:t>
+      </w:r>
+    </w:p>
+    <w:p>
+      <w:pPr>
         <w:spacing w:after="160" w:line="360"/>
         <w:jc w:val="both"/>
       </w:pPr>
@@ -1239,6 +1463,22 @@
     </w:p>
     <w:p>
       <w:pPr>
+        <w:spacing w:after="200" w:before="60"/>
+      </w:pPr>
+      <w:r>
+        <w:rPr>
+          <w:rFonts w:ascii="Times New Roman" w:cs="Times New Roman" w:eastAsia="Times New Roman" w:hAnsi="Times New Roman"/>
+          <w:b/>
+          <w:bCs/>
+          <w:color w:val="0E6E96"/>
+          <w:sz w:val="30"/>
+          <w:szCs w:val="30"/>
+        </w:rPr>
+        <w:t xml:space="preserve">Avant l'effet des transferts, un état des lieux.</w:t>
+      </w:r>
+    </w:p>
+    <w:p>
+      <w:pPr>
         <w:spacing w:after="160" w:line="360"/>
         <w:jc w:val="both"/>
       </w:pPr>
@@ -1293,6 +1533,22 @@
     </w:p>
     <w:p>
       <w:pPr>
+        <w:spacing w:after="200" w:before="60"/>
+      </w:pPr>
+      <w:r>
+        <w:rPr>
+          <w:rFonts w:ascii="Times New Roman" w:cs="Times New Roman" w:eastAsia="Times New Roman" w:hAnsi="Times New Roman"/>
+          <w:b/>
+          <w:bCs/>
+          <w:color w:val="0E6E96"/>
+          <w:sz w:val="30"/>
+          <w:szCs w:val="30"/>
+        </w:rPr>
+        <w:t xml:space="preserve">Cette moyenne nationale recouvre des écarts considérables.</w:t>
+      </w:r>
+    </w:p>
+    <w:p>
+      <w:pPr>
         <w:spacing w:after="160" w:line="360"/>
         <w:jc w:val="both"/>
       </w:pPr>
@@ -1347,6 +1603,22 @@
     </w:p>
     <w:p>
       <w:pPr>
+        <w:spacing w:after="200" w:before="60"/>
+      </w:pPr>
+      <w:r>
+        <w:rPr>
+          <w:rFonts w:ascii="Times New Roman" w:cs="Times New Roman" w:eastAsia="Times New Roman" w:hAnsi="Times New Roman"/>
+          <w:b/>
+          <w:bCs/>
+          <w:color w:val="0E6E96"/>
+          <w:sz w:val="30"/>
+          <w:szCs w:val="30"/>
+        </w:rPr>
+        <w:t xml:space="preserve">Un fait ressort de la ventilation par sous-groupe.</w:t>
+      </w:r>
+    </w:p>
+    <w:p>
+      <w:pPr>
         <w:spacing w:after="160" w:line="360"/>
         <w:jc w:val="both"/>
       </w:pPr>
@@ -1401,6 +1673,22 @@
     </w:p>
     <w:p>
       <w:pPr>
+        <w:spacing w:after="200" w:before="60"/>
+      </w:pPr>
+      <w:r>
+        <w:rPr>
+          <w:rFonts w:ascii="Times New Roman" w:cs="Times New Roman" w:eastAsia="Times New Roman" w:hAnsi="Times New Roman"/>
+          <w:b/>
+          <w:bCs/>
+          <w:color w:val="0E6E96"/>
+          <w:sz w:val="30"/>
+          <w:szCs w:val="30"/>
+        </w:rPr>
+        <w:t xml:space="preserve">Voici la même incidence, décomposée par statut.</w:t>
+      </w:r>
+    </w:p>
+    <w:p>
+      <w:pPr>
         <w:spacing w:after="160" w:line="360"/>
         <w:jc w:val="both"/>
       </w:pPr>
@@ -1455,6 +1743,22 @@
     </w:p>
     <w:p>
       <w:pPr>
+        <w:spacing w:after="200" w:before="60"/>
+      </w:pPr>
+      <w:r>
+        <w:rPr>
+          <w:rFonts w:ascii="Times New Roman" w:cs="Times New Roman" w:eastAsia="Times New Roman" w:hAnsi="Times New Roman"/>
+          <w:b/>
+          <w:bCs/>
+          <w:color w:val="0E6E96"/>
+          <w:sz w:val="30"/>
+          <w:szCs w:val="30"/>
+        </w:rPr>
+        <w:t xml:space="preserve">Un mot sur la qualité de l'appariement, dont tout dépend.</w:t>
+      </w:r>
+    </w:p>
+    <w:p>
+      <w:pPr>
         <w:spacing w:after="160" w:line="360"/>
         <w:jc w:val="both"/>
       </w:pPr>
@@ -1526,6 +1830,22 @@
     </w:p>
     <w:p>
       <w:pPr>
+        <w:spacing w:after="200" w:before="60"/>
+      </w:pPr>
+      <w:r>
+        <w:rPr>
+          <w:rFonts w:ascii="Times New Roman" w:cs="Times New Roman" w:eastAsia="Times New Roman" w:hAnsi="Times New Roman"/>
+          <w:b/>
+          <w:bCs/>
+          <w:color w:val="0E6E96"/>
+          <w:sz w:val="30"/>
+          <w:szCs w:val="30"/>
+        </w:rPr>
+        <w:t xml:space="preserve">J'en viens au résultat central, et je vais l'énoncer sans détour.</w:t>
+      </w:r>
+    </w:p>
+    <w:p>
+      <w:pPr>
         <w:spacing w:after="160" w:line="360"/>
         <w:jc w:val="both"/>
       </w:pPr>
@@ -1608,6 +1928,22 @@
     </w:p>
     <w:p>
       <w:pPr>
+        <w:spacing w:after="200" w:before="60"/>
+      </w:pPr>
+      <w:r>
+        <w:rPr>
+          <w:rFonts w:ascii="Times New Roman" w:cs="Times New Roman" w:eastAsia="Times New Roman" w:hAnsi="Times New Roman"/>
+          <w:b/>
+          <w:bCs/>
+          <w:color w:val="0E6E96"/>
+          <w:sz w:val="30"/>
+          <w:szCs w:val="30"/>
+        </w:rPr>
+        <w:t xml:space="preserve">Cet effet n'est pas diffus : il se localise.</w:t>
+      </w:r>
+    </w:p>
+    <w:p>
+      <w:pPr>
         <w:spacing w:after="160" w:line="360"/>
         <w:jc w:val="both"/>
       </w:pPr>
@@ -1676,6 +2012,22 @@
     </w:p>
     <w:p>
       <w:pPr>
+        <w:spacing w:after="200" w:before="60"/>
+      </w:pPr>
+      <w:r>
+        <w:rPr>
+          <w:rFonts w:ascii="Times New Roman" w:cs="Times New Roman" w:eastAsia="Times New Roman" w:hAnsi="Times New Roman"/>
+          <w:b/>
+          <w:bCs/>
+          <w:color w:val="0E6E96"/>
+          <w:sz w:val="30"/>
+          <w:szCs w:val="30"/>
+        </w:rPr>
+        <w:t xml:space="preserve">Dernier volet, l'intensité du traitement.</w:t>
+      </w:r>
+    </w:p>
+    <w:p>
+      <w:pPr>
         <w:spacing w:after="160" w:line="360"/>
         <w:jc w:val="both"/>
       </w:pPr>
@@ -1761,6 +2113,22 @@
     </w:p>
     <w:p>
       <w:pPr>
+        <w:spacing w:after="200" w:before="60"/>
+      </w:pPr>
+      <w:r>
+        <w:rPr>
+          <w:rFonts w:ascii="Times New Roman" w:cs="Times New Roman" w:eastAsia="Times New Roman" w:hAnsi="Times New Roman"/>
+          <w:b/>
+          <w:bCs/>
+          <w:color w:val="0E6E96"/>
+          <w:sz w:val="30"/>
+          <w:szCs w:val="30"/>
+        </w:rPr>
+        <w:t xml:space="preserve">Ce résultat a été mis à l'épreuve de trois façons.</w:t>
+      </w:r>
+    </w:p>
+    <w:p>
+      <w:pPr>
         <w:spacing w:after="160" w:line="360"/>
         <w:jc w:val="both"/>
       </w:pPr>
@@ -1815,6 +2183,22 @@
     </w:p>
     <w:p>
       <w:pPr>
+        <w:spacing w:after="200" w:before="60"/>
+      </w:pPr>
+      <w:r>
+        <w:rPr>
+          <w:rFonts w:ascii="Times New Roman" w:cs="Times New Roman" w:eastAsia="Times New Roman" w:hAnsi="Times New Roman"/>
+          <w:b/>
+          <w:bCs/>
+          <w:color w:val="0E6E96"/>
+          <w:sz w:val="30"/>
+          <w:szCs w:val="30"/>
+        </w:rPr>
+        <w:t xml:space="preserve">Un test mérite d'être signalé, car il nuance la portée du résultat.</w:t>
+      </w:r>
+    </w:p>
+    <w:p>
+      <w:pPr>
         <w:spacing w:after="160" w:line="360"/>
         <w:jc w:val="both"/>
       </w:pPr>
@@ -1869,6 +2253,22 @@
     </w:p>
     <w:p>
       <w:pPr>
+        <w:spacing w:after="200" w:before="60"/>
+      </w:pPr>
+      <w:r>
+        <w:rPr>
+          <w:rFonts w:ascii="Times New Roman" w:cs="Times New Roman" w:eastAsia="Times New Roman" w:hAnsi="Times New Roman"/>
+          <w:b/>
+          <w:bCs/>
+          <w:color w:val="0E6E96"/>
+          <w:sz w:val="30"/>
+          <w:szCs w:val="30"/>
+        </w:rPr>
+        <w:t xml:space="preserve">Comment expliquer qu'une ressource de cette ampleur ne réduise pas les privations ?</w:t>
+      </w:r>
+    </w:p>
+    <w:p>
+      <w:pPr>
         <w:spacing w:after="160" w:line="360"/>
         <w:jc w:val="both"/>
       </w:pPr>
@@ -1965,6 +2365,22 @@
     </w:p>
     <w:p>
       <w:pPr>
+        <w:spacing w:after="200" w:before="60"/>
+      </w:pPr>
+      <w:r>
+        <w:rPr>
+          <w:rFonts w:ascii="Times New Roman" w:cs="Times New Roman" w:eastAsia="Times New Roman" w:hAnsi="Times New Roman"/>
+          <w:b/>
+          <w:bCs/>
+          <w:color w:val="0E6E96"/>
+          <w:sz w:val="30"/>
+          <w:szCs w:val="30"/>
+        </w:rPr>
+        <w:t xml:space="preserve">Que deviennent alors mes deux hypothèses ?</w:t>
+      </w:r>
+    </w:p>
+    <w:p>
+      <w:pPr>
         <w:spacing w:after="160" w:line="360"/>
         <w:jc w:val="both"/>
       </w:pPr>
@@ -2036,6 +2452,22 @@
     </w:p>
     <w:p>
       <w:pPr>
+        <w:spacing w:after="200" w:before="60"/>
+      </w:pPr>
+      <w:r>
+        <w:rPr>
+          <w:rFonts w:ascii="Times New Roman" w:cs="Times New Roman" w:eastAsia="Times New Roman" w:hAnsi="Times New Roman"/>
+          <w:b/>
+          <w:bCs/>
+          <w:color w:val="0E6E96"/>
+          <w:sz w:val="30"/>
+          <w:szCs w:val="30"/>
+        </w:rPr>
+        <w:t xml:space="preserve">Quatre apports se dégagent de ce travail.</w:t>
+      </w:r>
+    </w:p>
+    <w:p>
+      <w:pPr>
         <w:spacing w:after="160" w:line="360"/>
         <w:jc w:val="both"/>
       </w:pPr>
@@ -2090,6 +2522,22 @@
     </w:p>
     <w:p>
       <w:pPr>
+        <w:spacing w:after="200" w:before="60"/>
+      </w:pPr>
+      <w:r>
+        <w:rPr>
+          <w:rFonts w:ascii="Times New Roman" w:cs="Times New Roman" w:eastAsia="Times New Roman" w:hAnsi="Times New Roman"/>
+          <w:b/>
+          <w:bCs/>
+          <w:color w:val="0E6E96"/>
+          <w:sz w:val="30"/>
+          <w:szCs w:val="30"/>
+        </w:rPr>
+        <w:t xml:space="preserve">Les recommandations suivent l'ordre de ces faits.</w:t>
+      </w:r>
+    </w:p>
+    <w:p>
+      <w:pPr>
         <w:spacing w:after="160" w:line="360"/>
         <w:jc w:val="both"/>
       </w:pPr>
@@ -2172,6 +2620,22 @@
     </w:p>
     <w:p>
       <w:pPr>
+        <w:spacing w:after="200" w:before="60"/>
+      </w:pPr>
+      <w:r>
+        <w:rPr>
+          <w:rFonts w:ascii="Times New Roman" w:cs="Times New Roman" w:eastAsia="Times New Roman" w:hAnsi="Times New Roman"/>
+          <w:b/>
+          <w:bCs/>
+          <w:color w:val="0E6E96"/>
+          <w:sz w:val="30"/>
+          <w:szCs w:val="30"/>
+        </w:rPr>
+        <w:t xml:space="preserve">Ce travail a ses limites, et je préfère les énoncer moi-même.</w:t>
+      </w:r>
+    </w:p>
+    <w:p>
+      <w:pPr>
         <w:spacing w:after="160" w:line="360"/>
         <w:jc w:val="both"/>
       </w:pPr>
@@ -2226,6 +2690,22 @@
     </w:p>
     <w:p>
       <w:pPr>
+        <w:spacing w:after="200" w:before="60"/>
+      </w:pPr>
+      <w:r>
+        <w:rPr>
+          <w:rFonts w:ascii="Times New Roman" w:cs="Times New Roman" w:eastAsia="Times New Roman" w:hAnsi="Times New Roman"/>
+          <w:b/>
+          <w:bCs/>
+          <w:color w:val="0E6E96"/>
+          <w:sz w:val="30"/>
+          <w:szCs w:val="30"/>
+        </w:rPr>
+        <w:t xml:space="preserve">Trois prolongements me semblent utiles.</w:t>
+      </w:r>
+    </w:p>
+    <w:p>
+      <w:pPr>
         <w:spacing w:after="160" w:line="360"/>
         <w:jc w:val="both"/>
       </w:pPr>
@@ -2293,6 +2773,22 @@
           <w:szCs w:val="20"/>
         </w:rPr>
         <w:t xml:space="preserve">	20 s</w:t>
+      </w:r>
+    </w:p>
+    <w:p>
+      <w:pPr>
+        <w:spacing w:after="200" w:before="60"/>
+      </w:pPr>
+      <w:r>
+        <w:rPr>
+          <w:rFonts w:ascii="Times New Roman" w:cs="Times New Roman" w:eastAsia="Times New Roman" w:hAnsi="Times New Roman"/>
+          <w:b/>
+          <w:bCs/>
+          <w:color w:val="0E6E96"/>
+          <w:sz w:val="30"/>
+          <w:szCs w:val="30"/>
+        </w:rPr>
+        <w:t xml:space="preserve">Je vous remercie de votre attention.</w:t>
       </w:r>
     </w:p>
     <w:p>

</xml_diff>

<commit_message>
Ouvrir chaque diapositive du discours par une phrase d'attaque (#752)
Chaque section du discours commence par une phrase courte, composee en
gras et dans un corps superieur, immediatement reperable a l'oeil. Elle
donne la premiere phrase a prononcer devant la diapositive, avant le
texte detaille qui suit.


Claude-Session: https://claude.ai/code/session_01837AJxDdpW6rUH9DV9QD1H

Co-authored-by: Claude <noreply@anthropic.com>
</commit_message>
<xml_diff>
--- a/Presentation/discours/discours_soutenance.docx
+++ b/Presentation/discours/discours_soutenance.docx
@@ -165,6 +165,22 @@
     </w:p>
     <w:p>
       <w:pPr>
+        <w:spacing w:after="200" w:before="60"/>
+      </w:pPr>
+      <w:r>
+        <w:rPr>
+          <w:rFonts w:ascii="Times New Roman" w:cs="Times New Roman" w:eastAsia="Times New Roman" w:hAnsi="Times New Roman"/>
+          <w:b/>
+          <w:bCs/>
+          <w:color w:val="0E6E96"/>
+          <w:sz w:val="30"/>
+          <w:szCs w:val="30"/>
+        </w:rPr>
+        <w:t xml:space="preserve">Monsieur le Président du jury, mesdames et messieurs, bonjour.</w:t>
+      </w:r>
+    </w:p>
+    <w:p>
+      <w:pPr>
         <w:spacing w:after="160" w:line="360"/>
         <w:jc w:val="both"/>
       </w:pPr>
@@ -250,6 +266,22 @@
     </w:p>
     <w:p>
       <w:pPr>
+        <w:spacing w:after="200" w:before="60"/>
+      </w:pPr>
+      <w:r>
+        <w:rPr>
+          <w:rFonts w:ascii="Times New Roman" w:cs="Times New Roman" w:eastAsia="Times New Roman" w:hAnsi="Times New Roman"/>
+          <w:b/>
+          <w:bCs/>
+          <w:color w:val="0E6E96"/>
+          <w:sz w:val="30"/>
+          <w:szCs w:val="30"/>
+        </w:rPr>
+        <w:t xml:space="preserve">Mon exposé suivra six temps.</w:t>
+      </w:r>
+    </w:p>
+    <w:p>
+      <w:pPr>
         <w:spacing w:after="160" w:line="360"/>
         <w:jc w:val="both"/>
       </w:pPr>
@@ -321,6 +353,22 @@
     </w:p>
     <w:p>
       <w:pPr>
+        <w:spacing w:after="200" w:before="60"/>
+      </w:pPr>
+      <w:r>
+        <w:rPr>
+          <w:rFonts w:ascii="Times New Roman" w:cs="Times New Roman" w:eastAsia="Times New Roman" w:hAnsi="Times New Roman"/>
+          <w:b/>
+          <w:bCs/>
+          <w:color w:val="0E6E96"/>
+          <w:sz w:val="30"/>
+          <w:szCs w:val="30"/>
+        </w:rPr>
+        <w:t xml:space="preserve">Deux réalités coexistent au Sénégal.</w:t>
+      </w:r>
+    </w:p>
+    <w:p>
+      <w:pPr>
         <w:spacing w:after="160" w:line="360"/>
         <w:jc w:val="both"/>
       </w:pPr>
@@ -420,6 +468,22 @@
     </w:p>
     <w:p>
       <w:pPr>
+        <w:spacing w:after="200" w:before="60"/>
+      </w:pPr>
+      <w:r>
+        <w:rPr>
+          <w:rFonts w:ascii="Times New Roman" w:cs="Times New Roman" w:eastAsia="Times New Roman" w:hAnsi="Times New Roman"/>
+          <w:b/>
+          <w:bCs/>
+          <w:color w:val="0E6E96"/>
+          <w:sz w:val="30"/>
+          <w:szCs w:val="30"/>
+        </w:rPr>
+        <w:t xml:space="preserve">D'où la question qui structure ce mémoire.</w:t>
+      </w:r>
+    </w:p>
+    <w:p>
+      <w:pPr>
         <w:spacing w:after="160" w:line="360"/>
         <w:jc w:val="both"/>
       </w:pPr>
@@ -488,6 +552,22 @@
     </w:p>
     <w:p>
       <w:pPr>
+        <w:spacing w:after="200" w:before="60"/>
+      </w:pPr>
+      <w:r>
+        <w:rPr>
+          <w:rFonts w:ascii="Times New Roman" w:cs="Times New Roman" w:eastAsia="Times New Roman" w:hAnsi="Times New Roman"/>
+          <w:b/>
+          <w:bCs/>
+          <w:color w:val="0E6E96"/>
+          <w:sz w:val="30"/>
+          <w:szCs w:val="30"/>
+        </w:rPr>
+        <w:t xml:space="preserve">Cette question se décline en deux objectifs et deux hypothèses.</w:t>
+      </w:r>
+    </w:p>
+    <w:p>
+      <w:pPr>
         <w:spacing w:after="160" w:line="360"/>
         <w:jc w:val="both"/>
       </w:pPr>
@@ -573,6 +653,22 @@
     </w:p>
     <w:p>
       <w:pPr>
+        <w:spacing w:after="200" w:before="60"/>
+      </w:pPr>
+      <w:r>
+        <w:rPr>
+          <w:rFonts w:ascii="Times New Roman" w:cs="Times New Roman" w:eastAsia="Times New Roman" w:hAnsi="Times New Roman"/>
+          <w:b/>
+          <w:bCs/>
+          <w:color w:val="0E6E96"/>
+          <w:sz w:val="30"/>
+          <w:szCs w:val="30"/>
+        </w:rPr>
+        <w:t xml:space="preserve">Un mot d'abord sur la migration elle-même.</w:t>
+      </w:r>
+    </w:p>
+    <w:p>
+      <w:pPr>
         <w:spacing w:after="160" w:line="360"/>
         <w:jc w:val="both"/>
       </w:pPr>
@@ -672,6 +768,22 @@
     </w:p>
     <w:p>
       <w:pPr>
+        <w:spacing w:after="200" w:before="60"/>
+      </w:pPr>
+      <w:r>
+        <w:rPr>
+          <w:rFonts w:ascii="Times New Roman" w:cs="Times New Roman" w:eastAsia="Times New Roman" w:hAnsi="Times New Roman"/>
+          <w:b/>
+          <w:bCs/>
+          <w:color w:val="0E6E96"/>
+          <w:sz w:val="30"/>
+          <w:szCs w:val="30"/>
+        </w:rPr>
+        <w:t xml:space="preserve">Pourquoi les migrants transfèrent-ils, et avec quels effets ?</w:t>
+      </w:r>
+    </w:p>
+    <w:p>
+      <w:pPr>
         <w:spacing w:after="160" w:line="360"/>
         <w:jc w:val="both"/>
       </w:pPr>
@@ -754,6 +866,22 @@
     </w:p>
     <w:p>
       <w:pPr>
+        <w:spacing w:after="200" w:before="60"/>
+      </w:pPr>
+      <w:r>
+        <w:rPr>
+          <w:rFonts w:ascii="Times New Roman" w:cs="Times New Roman" w:eastAsia="Times New Roman" w:hAnsi="Times New Roman"/>
+          <w:b/>
+          <w:bCs/>
+          <w:color w:val="0E6E96"/>
+          <w:sz w:val="30"/>
+          <w:szCs w:val="30"/>
+        </w:rPr>
+        <w:t xml:space="preserve">Mesurer la pauvreté d'un enfant par le seul revenu ne suffit pas.</w:t>
+      </w:r>
+    </w:p>
+    <w:p>
+      <w:pPr>
         <w:spacing w:after="160" w:line="360"/>
         <w:jc w:val="both"/>
       </w:pPr>
@@ -825,6 +953,22 @@
     </w:p>
     <w:p>
       <w:pPr>
+        <w:spacing w:after="200" w:before="60"/>
+      </w:pPr>
+      <w:r>
+        <w:rPr>
+          <w:rFonts w:ascii="Times New Roman" w:cs="Times New Roman" w:eastAsia="Times New Roman" w:hAnsi="Times New Roman"/>
+          <w:b/>
+          <w:bCs/>
+          <w:color w:val="0E6E96"/>
+          <w:sz w:val="30"/>
+          <w:szCs w:val="30"/>
+        </w:rPr>
+        <w:t xml:space="preserve">J'en viens aux données.</w:t>
+      </w:r>
+    </w:p>
+    <w:p>
+      <w:pPr>
         <w:spacing w:after="160" w:line="360"/>
         <w:jc w:val="both"/>
       </w:pPr>
@@ -893,6 +1037,22 @@
     </w:p>
     <w:p>
       <w:pPr>
+        <w:spacing w:after="200" w:before="60"/>
+      </w:pPr>
+      <w:r>
+        <w:rPr>
+          <w:rFonts w:ascii="Times New Roman" w:cs="Times New Roman" w:eastAsia="Times New Roman" w:hAnsi="Times New Roman"/>
+          <w:b/>
+          <w:bCs/>
+          <w:color w:val="0E6E96"/>
+          <w:sz w:val="30"/>
+          <w:szCs w:val="30"/>
+        </w:rPr>
+        <w:t xml:space="preserve">Comment mesure-t-on cette pauvreté ?</w:t>
+      </w:r>
+    </w:p>
+    <w:p>
+      <w:pPr>
         <w:spacing w:after="160" w:line="360"/>
         <w:jc w:val="both"/>
       </w:pPr>
@@ -978,6 +1138,22 @@
     </w:p>
     <w:p>
       <w:pPr>
+        <w:spacing w:after="200" w:before="60"/>
+      </w:pPr>
+      <w:r>
+        <w:rPr>
+          <w:rFonts w:ascii="Times New Roman" w:cs="Times New Roman" w:eastAsia="Times New Roman" w:hAnsi="Times New Roman"/>
+          <w:b/>
+          <w:bCs/>
+          <w:color w:val="0E6E96"/>
+          <w:sz w:val="30"/>
+          <w:szCs w:val="30"/>
+        </w:rPr>
+        <w:t xml:space="preserve">J'en viens au cœur méthodologique du travail.</w:t>
+      </w:r>
+    </w:p>
+    <w:p>
+      <w:pPr>
         <w:spacing w:after="160" w:line="360"/>
         <w:jc w:val="both"/>
       </w:pPr>
@@ -1060,6 +1236,22 @@
     </w:p>
     <w:p>
       <w:pPr>
+        <w:spacing w:after="200" w:before="60"/>
+      </w:pPr>
+      <w:r>
+        <w:rPr>
+          <w:rFonts w:ascii="Times New Roman" w:cs="Times New Roman" w:eastAsia="Times New Roman" w:hAnsi="Times New Roman"/>
+          <w:b/>
+          <w:bCs/>
+          <w:color w:val="0E6E96"/>
+          <w:sz w:val="30"/>
+          <w:szCs w:val="30"/>
+        </w:rPr>
+        <w:t xml:space="preserve">Première brique, l'appariement.</w:t>
+      </w:r>
+    </w:p>
+    <w:p>
+      <w:pPr>
         <w:spacing w:after="160" w:line="360"/>
         <w:jc w:val="both"/>
       </w:pPr>
@@ -1114,6 +1306,22 @@
     </w:p>
     <w:p>
       <w:pPr>
+        <w:spacing w:after="200" w:before="60"/>
+      </w:pPr>
+      <w:r>
+        <w:rPr>
+          <w:rFonts w:ascii="Times New Roman" w:cs="Times New Roman" w:eastAsia="Times New Roman" w:hAnsi="Times New Roman"/>
+          <w:b/>
+          <w:bCs/>
+          <w:color w:val="0E6E96"/>
+          <w:sz w:val="30"/>
+          <w:szCs w:val="30"/>
+        </w:rPr>
+        <w:t xml:space="preserve">Seconde brique, la double différence.</w:t>
+      </w:r>
+    </w:p>
+    <w:p>
+      <w:pPr>
         <w:spacing w:after="160" w:line="360"/>
         <w:jc w:val="both"/>
       </w:pPr>
@@ -1168,6 +1376,22 @@
     </w:p>
     <w:p>
       <w:pPr>
+        <w:spacing w:after="200" w:before="60"/>
+      </w:pPr>
+      <w:r>
+        <w:rPr>
+          <w:rFonts w:ascii="Times New Roman" w:cs="Times New Roman" w:eastAsia="Times New Roman" w:hAnsi="Times New Roman"/>
+          <w:b/>
+          <w:bCs/>
+          <w:color w:val="0E6E96"/>
+          <w:sz w:val="30"/>
+          <w:szCs w:val="30"/>
+        </w:rPr>
+        <w:t xml:space="preserve">L'estimateur retenu combine les deux.</w:t>
+      </w:r>
+    </w:p>
+    <w:p>
+      <w:pPr>
         <w:spacing w:after="160" w:line="360"/>
         <w:jc w:val="both"/>
       </w:pPr>
@@ -1239,6 +1463,22 @@
     </w:p>
     <w:p>
       <w:pPr>
+        <w:spacing w:after="200" w:before="60"/>
+      </w:pPr>
+      <w:r>
+        <w:rPr>
+          <w:rFonts w:ascii="Times New Roman" w:cs="Times New Roman" w:eastAsia="Times New Roman" w:hAnsi="Times New Roman"/>
+          <w:b/>
+          <w:bCs/>
+          <w:color w:val="0E6E96"/>
+          <w:sz w:val="30"/>
+          <w:szCs w:val="30"/>
+        </w:rPr>
+        <w:t xml:space="preserve">Avant l'effet des transferts, un état des lieux.</w:t>
+      </w:r>
+    </w:p>
+    <w:p>
+      <w:pPr>
         <w:spacing w:after="160" w:line="360"/>
         <w:jc w:val="both"/>
       </w:pPr>
@@ -1293,6 +1533,22 @@
     </w:p>
     <w:p>
       <w:pPr>
+        <w:spacing w:after="200" w:before="60"/>
+      </w:pPr>
+      <w:r>
+        <w:rPr>
+          <w:rFonts w:ascii="Times New Roman" w:cs="Times New Roman" w:eastAsia="Times New Roman" w:hAnsi="Times New Roman"/>
+          <w:b/>
+          <w:bCs/>
+          <w:color w:val="0E6E96"/>
+          <w:sz w:val="30"/>
+          <w:szCs w:val="30"/>
+        </w:rPr>
+        <w:t xml:space="preserve">Cette moyenne nationale recouvre des écarts considérables.</w:t>
+      </w:r>
+    </w:p>
+    <w:p>
+      <w:pPr>
         <w:spacing w:after="160" w:line="360"/>
         <w:jc w:val="both"/>
       </w:pPr>
@@ -1347,6 +1603,22 @@
     </w:p>
     <w:p>
       <w:pPr>
+        <w:spacing w:after="200" w:before="60"/>
+      </w:pPr>
+      <w:r>
+        <w:rPr>
+          <w:rFonts w:ascii="Times New Roman" w:cs="Times New Roman" w:eastAsia="Times New Roman" w:hAnsi="Times New Roman"/>
+          <w:b/>
+          <w:bCs/>
+          <w:color w:val="0E6E96"/>
+          <w:sz w:val="30"/>
+          <w:szCs w:val="30"/>
+        </w:rPr>
+        <w:t xml:space="preserve">Un fait ressort de la ventilation par sous-groupe.</w:t>
+      </w:r>
+    </w:p>
+    <w:p>
+      <w:pPr>
         <w:spacing w:after="160" w:line="360"/>
         <w:jc w:val="both"/>
       </w:pPr>
@@ -1401,6 +1673,22 @@
     </w:p>
     <w:p>
       <w:pPr>
+        <w:spacing w:after="200" w:before="60"/>
+      </w:pPr>
+      <w:r>
+        <w:rPr>
+          <w:rFonts w:ascii="Times New Roman" w:cs="Times New Roman" w:eastAsia="Times New Roman" w:hAnsi="Times New Roman"/>
+          <w:b/>
+          <w:bCs/>
+          <w:color w:val="0E6E96"/>
+          <w:sz w:val="30"/>
+          <w:szCs w:val="30"/>
+        </w:rPr>
+        <w:t xml:space="preserve">Voici la même incidence, décomposée par statut.</w:t>
+      </w:r>
+    </w:p>
+    <w:p>
+      <w:pPr>
         <w:spacing w:after="160" w:line="360"/>
         <w:jc w:val="both"/>
       </w:pPr>
@@ -1455,6 +1743,22 @@
     </w:p>
     <w:p>
       <w:pPr>
+        <w:spacing w:after="200" w:before="60"/>
+      </w:pPr>
+      <w:r>
+        <w:rPr>
+          <w:rFonts w:ascii="Times New Roman" w:cs="Times New Roman" w:eastAsia="Times New Roman" w:hAnsi="Times New Roman"/>
+          <w:b/>
+          <w:bCs/>
+          <w:color w:val="0E6E96"/>
+          <w:sz w:val="30"/>
+          <w:szCs w:val="30"/>
+        </w:rPr>
+        <w:t xml:space="preserve">Un mot sur la qualité de l'appariement, dont tout dépend.</w:t>
+      </w:r>
+    </w:p>
+    <w:p>
+      <w:pPr>
         <w:spacing w:after="160" w:line="360"/>
         <w:jc w:val="both"/>
       </w:pPr>
@@ -1526,6 +1830,22 @@
     </w:p>
     <w:p>
       <w:pPr>
+        <w:spacing w:after="200" w:before="60"/>
+      </w:pPr>
+      <w:r>
+        <w:rPr>
+          <w:rFonts w:ascii="Times New Roman" w:cs="Times New Roman" w:eastAsia="Times New Roman" w:hAnsi="Times New Roman"/>
+          <w:b/>
+          <w:bCs/>
+          <w:color w:val="0E6E96"/>
+          <w:sz w:val="30"/>
+          <w:szCs w:val="30"/>
+        </w:rPr>
+        <w:t xml:space="preserve">J'en viens au résultat central, et je vais l'énoncer sans détour.</w:t>
+      </w:r>
+    </w:p>
+    <w:p>
+      <w:pPr>
         <w:spacing w:after="160" w:line="360"/>
         <w:jc w:val="both"/>
       </w:pPr>
@@ -1608,6 +1928,22 @@
     </w:p>
     <w:p>
       <w:pPr>
+        <w:spacing w:after="200" w:before="60"/>
+      </w:pPr>
+      <w:r>
+        <w:rPr>
+          <w:rFonts w:ascii="Times New Roman" w:cs="Times New Roman" w:eastAsia="Times New Roman" w:hAnsi="Times New Roman"/>
+          <w:b/>
+          <w:bCs/>
+          <w:color w:val="0E6E96"/>
+          <w:sz w:val="30"/>
+          <w:szCs w:val="30"/>
+        </w:rPr>
+        <w:t xml:space="preserve">Cet effet n'est pas diffus : il se localise.</w:t>
+      </w:r>
+    </w:p>
+    <w:p>
+      <w:pPr>
         <w:spacing w:after="160" w:line="360"/>
         <w:jc w:val="both"/>
       </w:pPr>
@@ -1676,6 +2012,22 @@
     </w:p>
     <w:p>
       <w:pPr>
+        <w:spacing w:after="200" w:before="60"/>
+      </w:pPr>
+      <w:r>
+        <w:rPr>
+          <w:rFonts w:ascii="Times New Roman" w:cs="Times New Roman" w:eastAsia="Times New Roman" w:hAnsi="Times New Roman"/>
+          <w:b/>
+          <w:bCs/>
+          <w:color w:val="0E6E96"/>
+          <w:sz w:val="30"/>
+          <w:szCs w:val="30"/>
+        </w:rPr>
+        <w:t xml:space="preserve">Dernier volet, l'intensité du traitement.</w:t>
+      </w:r>
+    </w:p>
+    <w:p>
+      <w:pPr>
         <w:spacing w:after="160" w:line="360"/>
         <w:jc w:val="both"/>
       </w:pPr>
@@ -1761,6 +2113,22 @@
     </w:p>
     <w:p>
       <w:pPr>
+        <w:spacing w:after="200" w:before="60"/>
+      </w:pPr>
+      <w:r>
+        <w:rPr>
+          <w:rFonts w:ascii="Times New Roman" w:cs="Times New Roman" w:eastAsia="Times New Roman" w:hAnsi="Times New Roman"/>
+          <w:b/>
+          <w:bCs/>
+          <w:color w:val="0E6E96"/>
+          <w:sz w:val="30"/>
+          <w:szCs w:val="30"/>
+        </w:rPr>
+        <w:t xml:space="preserve">Ce résultat a été mis à l'épreuve de trois façons.</w:t>
+      </w:r>
+    </w:p>
+    <w:p>
+      <w:pPr>
         <w:spacing w:after="160" w:line="360"/>
         <w:jc w:val="both"/>
       </w:pPr>
@@ -1815,6 +2183,22 @@
     </w:p>
     <w:p>
       <w:pPr>
+        <w:spacing w:after="200" w:before="60"/>
+      </w:pPr>
+      <w:r>
+        <w:rPr>
+          <w:rFonts w:ascii="Times New Roman" w:cs="Times New Roman" w:eastAsia="Times New Roman" w:hAnsi="Times New Roman"/>
+          <w:b/>
+          <w:bCs/>
+          <w:color w:val="0E6E96"/>
+          <w:sz w:val="30"/>
+          <w:szCs w:val="30"/>
+        </w:rPr>
+        <w:t xml:space="preserve">Un test mérite d'être signalé, car il nuance la portée du résultat.</w:t>
+      </w:r>
+    </w:p>
+    <w:p>
+      <w:pPr>
         <w:spacing w:after="160" w:line="360"/>
         <w:jc w:val="both"/>
       </w:pPr>
@@ -1869,6 +2253,22 @@
     </w:p>
     <w:p>
       <w:pPr>
+        <w:spacing w:after="200" w:before="60"/>
+      </w:pPr>
+      <w:r>
+        <w:rPr>
+          <w:rFonts w:ascii="Times New Roman" w:cs="Times New Roman" w:eastAsia="Times New Roman" w:hAnsi="Times New Roman"/>
+          <w:b/>
+          <w:bCs/>
+          <w:color w:val="0E6E96"/>
+          <w:sz w:val="30"/>
+          <w:szCs w:val="30"/>
+        </w:rPr>
+        <w:t xml:space="preserve">Comment expliquer qu'une ressource de cette ampleur ne réduise pas les privations ?</w:t>
+      </w:r>
+    </w:p>
+    <w:p>
+      <w:pPr>
         <w:spacing w:after="160" w:line="360"/>
         <w:jc w:val="both"/>
       </w:pPr>
@@ -1965,6 +2365,22 @@
     </w:p>
     <w:p>
       <w:pPr>
+        <w:spacing w:after="200" w:before="60"/>
+      </w:pPr>
+      <w:r>
+        <w:rPr>
+          <w:rFonts w:ascii="Times New Roman" w:cs="Times New Roman" w:eastAsia="Times New Roman" w:hAnsi="Times New Roman"/>
+          <w:b/>
+          <w:bCs/>
+          <w:color w:val="0E6E96"/>
+          <w:sz w:val="30"/>
+          <w:szCs w:val="30"/>
+        </w:rPr>
+        <w:t xml:space="preserve">Que deviennent alors mes deux hypothèses ?</w:t>
+      </w:r>
+    </w:p>
+    <w:p>
+      <w:pPr>
         <w:spacing w:after="160" w:line="360"/>
         <w:jc w:val="both"/>
       </w:pPr>
@@ -2036,6 +2452,22 @@
     </w:p>
     <w:p>
       <w:pPr>
+        <w:spacing w:after="200" w:before="60"/>
+      </w:pPr>
+      <w:r>
+        <w:rPr>
+          <w:rFonts w:ascii="Times New Roman" w:cs="Times New Roman" w:eastAsia="Times New Roman" w:hAnsi="Times New Roman"/>
+          <w:b/>
+          <w:bCs/>
+          <w:color w:val="0E6E96"/>
+          <w:sz w:val="30"/>
+          <w:szCs w:val="30"/>
+        </w:rPr>
+        <w:t xml:space="preserve">Quatre apports se dégagent de ce travail.</w:t>
+      </w:r>
+    </w:p>
+    <w:p>
+      <w:pPr>
         <w:spacing w:after="160" w:line="360"/>
         <w:jc w:val="both"/>
       </w:pPr>
@@ -2090,6 +2522,22 @@
     </w:p>
     <w:p>
       <w:pPr>
+        <w:spacing w:after="200" w:before="60"/>
+      </w:pPr>
+      <w:r>
+        <w:rPr>
+          <w:rFonts w:ascii="Times New Roman" w:cs="Times New Roman" w:eastAsia="Times New Roman" w:hAnsi="Times New Roman"/>
+          <w:b/>
+          <w:bCs/>
+          <w:color w:val="0E6E96"/>
+          <w:sz w:val="30"/>
+          <w:szCs w:val="30"/>
+        </w:rPr>
+        <w:t xml:space="preserve">Les recommandations suivent l'ordre de ces faits.</w:t>
+      </w:r>
+    </w:p>
+    <w:p>
+      <w:pPr>
         <w:spacing w:after="160" w:line="360"/>
         <w:jc w:val="both"/>
       </w:pPr>
@@ -2172,6 +2620,22 @@
     </w:p>
     <w:p>
       <w:pPr>
+        <w:spacing w:after="200" w:before="60"/>
+      </w:pPr>
+      <w:r>
+        <w:rPr>
+          <w:rFonts w:ascii="Times New Roman" w:cs="Times New Roman" w:eastAsia="Times New Roman" w:hAnsi="Times New Roman"/>
+          <w:b/>
+          <w:bCs/>
+          <w:color w:val="0E6E96"/>
+          <w:sz w:val="30"/>
+          <w:szCs w:val="30"/>
+        </w:rPr>
+        <w:t xml:space="preserve">Ce travail a ses limites, et je préfère les énoncer moi-même.</w:t>
+      </w:r>
+    </w:p>
+    <w:p>
+      <w:pPr>
         <w:spacing w:after="160" w:line="360"/>
         <w:jc w:val="both"/>
       </w:pPr>
@@ -2226,6 +2690,22 @@
     </w:p>
     <w:p>
       <w:pPr>
+        <w:spacing w:after="200" w:before="60"/>
+      </w:pPr>
+      <w:r>
+        <w:rPr>
+          <w:rFonts w:ascii="Times New Roman" w:cs="Times New Roman" w:eastAsia="Times New Roman" w:hAnsi="Times New Roman"/>
+          <w:b/>
+          <w:bCs/>
+          <w:color w:val="0E6E96"/>
+          <w:sz w:val="30"/>
+          <w:szCs w:val="30"/>
+        </w:rPr>
+        <w:t xml:space="preserve">Trois prolongements me semblent utiles.</w:t>
+      </w:r>
+    </w:p>
+    <w:p>
+      <w:pPr>
         <w:spacing w:after="160" w:line="360"/>
         <w:jc w:val="both"/>
       </w:pPr>
@@ -2293,6 +2773,22 @@
           <w:szCs w:val="20"/>
         </w:rPr>
         <w:t xml:space="preserve">	20 s</w:t>
+      </w:r>
+    </w:p>
+    <w:p>
+      <w:pPr>
+        <w:spacing w:after="200" w:before="60"/>
+      </w:pPr>
+      <w:r>
+        <w:rPr>
+          <w:rFonts w:ascii="Times New Roman" w:cs="Times New Roman" w:eastAsia="Times New Roman" w:hAnsi="Times New Roman"/>
+          <w:b/>
+          <w:bCs/>
+          <w:color w:val="0E6E96"/>
+          <w:sz w:val="30"/>
+          <w:szCs w:val="30"/>
+        </w:rPr>
+        <w:t xml:space="preserve">Je vous remercie de votre attention.</w:t>
       </w:r>
     </w:p>
     <w:p>

</xml_diff>

<commit_message>
Reformuler les intitules trop parles
Les titres de diapositive et de bloc construits comme des tournures
orales cedent la place a des intitules nominaux. La diapositive
d'interpretation s'appelle desormais Mecanismes d'interpretation du
resultat, celle sur la definition alternative Sensibilite a la
definition du traitement, et les blocs formules en Ce que ... prennent
un intitule direct.

Le discours reprend les memes libelles.

Co-Authored-By: Claude <noreply@anthropic.com>
Claude-Session: https://claude.ai/code/session_01837AJxDdpW6rUH9DV9QD1H
</commit_message>
<xml_diff>
--- a/Presentation/discours/discours_soutenance.docx
+++ b/Presentation/discours/discours_soutenance.docx
@@ -639,7 +639,7 @@
           <w:sz w:val="20"/>
           <w:szCs w:val="20"/>
         </w:rPr>
-        <w:t xml:space="preserve">  ·  Pourquoi l'on migre</w:t>
+        <w:t xml:space="preserve">  ·  Théories de la migration</w:t>
       </w:r>
       <w:r>
         <w:rPr>
@@ -852,7 +852,7 @@
           <w:sz w:val="20"/>
           <w:szCs w:val="20"/>
         </w:rPr>
-        <w:t xml:space="preserve">  ·  Approche multidimensionnelle</w:t>
+        <w:t xml:space="preserve">  ·  Mesure multidimensionnelle</w:t>
       </w:r>
       <w:r>
         <w:rPr>
@@ -1659,7 +1659,7 @@
           <w:sz w:val="20"/>
           <w:szCs w:val="20"/>
         </w:rPr>
-        <w:t xml:space="preserve">  ·  Évolution par statut</w:t>
+        <w:t xml:space="preserve">  ·  Incidence selon le statut</w:t>
       </w:r>
       <w:r>
         <w:rPr>
@@ -2169,7 +2169,7 @@
           <w:sz w:val="20"/>
           <w:szCs w:val="20"/>
         </w:rPr>
-        <w:t xml:space="preserve">  ·  La définition alternative</w:t>
+        <w:t xml:space="preserve">  ·  Sensibilité à la définition du traitement</w:t>
       </w:r>
       <w:r>
         <w:rPr>
@@ -2239,7 +2239,7 @@
           <w:sz w:val="20"/>
           <w:szCs w:val="20"/>
         </w:rPr>
-        <w:t xml:space="preserve">  ·  Comment comprendre ce résultat</w:t>
+        <w:t xml:space="preserve">  ·  Mécanismes d'interprétation</w:t>
       </w:r>
       <w:r>
         <w:rPr>

</xml_diff>

<commit_message>
Reformuler les intitules trop parles (#753)
Les titres de diapositive et de bloc construits comme des tournures
orales cedent la place a des intitules nominaux. La diapositive
d'interpretation s'appelle desormais Mecanismes d'interpretation du
resultat, celle sur la definition alternative Sensibilite a la
definition du traitement, et les blocs formules en Ce que ... prennent
un intitule direct.

Le discours reprend les memes libelles.


Claude-Session: https://claude.ai/code/session_01837AJxDdpW6rUH9DV9QD1H

Co-authored-by: Claude <noreply@anthropic.com>
</commit_message>
<xml_diff>
--- a/Presentation/discours/discours_soutenance.docx
+++ b/Presentation/discours/discours_soutenance.docx
@@ -639,7 +639,7 @@
           <w:sz w:val="20"/>
           <w:szCs w:val="20"/>
         </w:rPr>
-        <w:t xml:space="preserve">  ·  Pourquoi l'on migre</w:t>
+        <w:t xml:space="preserve">  ·  Théories de la migration</w:t>
       </w:r>
       <w:r>
         <w:rPr>
@@ -852,7 +852,7 @@
           <w:sz w:val="20"/>
           <w:szCs w:val="20"/>
         </w:rPr>
-        <w:t xml:space="preserve">  ·  Approche multidimensionnelle</w:t>
+        <w:t xml:space="preserve">  ·  Mesure multidimensionnelle</w:t>
       </w:r>
       <w:r>
         <w:rPr>
@@ -1659,7 +1659,7 @@
           <w:sz w:val="20"/>
           <w:szCs w:val="20"/>
         </w:rPr>
-        <w:t xml:space="preserve">  ·  Évolution par statut</w:t>
+        <w:t xml:space="preserve">  ·  Incidence selon le statut</w:t>
       </w:r>
       <w:r>
         <w:rPr>
@@ -2169,7 +2169,7 @@
           <w:sz w:val="20"/>
           <w:szCs w:val="20"/>
         </w:rPr>
-        <w:t xml:space="preserve">  ·  La définition alternative</w:t>
+        <w:t xml:space="preserve">  ·  Sensibilité à la définition du traitement</w:t>
       </w:r>
       <w:r>
         <w:rPr>
@@ -2239,7 +2239,7 @@
           <w:sz w:val="20"/>
           <w:szCs w:val="20"/>
         </w:rPr>
-        <w:t xml:space="preserve">  ·  Comment comprendre ce résultat</w:t>
+        <w:t xml:space="preserve">  ·  Mécanismes d'interprétation</w:t>
       </w:r>
       <w:r>
         <w:rPr>

</xml_diff>

<commit_message>
Retirer la diapositive des disparites regionales
Le discours est mis a jour : la section correspondante est supprimee et
les reperes de diapositive sont renumerotes a partir de la quinzieme.

Co-Authored-By: Claude <noreply@anthropic.com>
Claude-Session: https://claude.ai/code/session_01837AJxDdpW6rUH9DV9QD1H
</commit_message>
<xml_diff>
--- a/Presentation/discours/discours_soutenance.docx
+++ b/Presentation/discours/discours_soutenance.docx
@@ -94,7 +94,7 @@
           <w:sz w:val="22"/>
           <w:szCs w:val="22"/>
         </w:rPr>
-        <w:t xml:space="preserve">Durée visée : 20 minutes  ·  31 diapositives</w:t>
+        <w:t xml:space="preserve">Durée visée : 19 minutes  ·  31 diapositives</w:t>
       </w:r>
     </w:p>
     <w:p>
@@ -1519,7 +1519,7 @@
           <w:sz w:val="20"/>
           <w:szCs w:val="20"/>
         </w:rPr>
-        <w:t xml:space="preserve">  ·  Disparités régionales</w:t>
+        <w:t xml:space="preserve">  ·  Ventilation par sous-groupe</w:t>
       </w:r>
       <w:r>
         <w:rPr>
@@ -1544,21 +1544,21 @@
           <w:sz w:val="30"/>
           <w:szCs w:val="30"/>
         </w:rPr>
-        <w:t xml:space="preserve">Cette moyenne nationale recouvre des écarts considérables.</w:t>
-      </w:r>
-    </w:p>
-    <w:p>
-      <w:pPr>
-        <w:spacing w:after="160" w:line="360"/>
-        <w:jc w:val="both"/>
-      </w:pPr>
-      <w:r>
-        <w:rPr>
-          <w:rFonts w:ascii="Times New Roman" w:cs="Times New Roman" w:eastAsia="Times New Roman" w:hAnsi="Times New Roman"/>
-          <w:sz w:val="24"/>
-          <w:szCs w:val="24"/>
-        </w:rPr>
-        <w:t xml:space="preserve">Cette moyenne nationale recouvre des écarts considérables. En 2021, l'incidence va de 16,7 pour cent à Dakar à 78,1 pour cent à Kolda, soit un rapport de un à cinq. Les régions du sud et de l'est concentrent les privations. Le recul est général sur la période, à deux exceptions près, Thiès et Kaolack, où l'incidence progresse.</w:t>
+        <w:t xml:space="preserve">Un fait ressort de la ventilation par sous-groupe.</w:t>
+      </w:r>
+    </w:p>
+    <w:p>
+      <w:pPr>
+        <w:spacing w:after="160" w:line="360"/>
+        <w:jc w:val="both"/>
+      </w:pPr>
+      <w:r>
+        <w:rPr>
+          <w:rFonts w:ascii="Times New Roman" w:cs="Times New Roman" w:eastAsia="Times New Roman" w:hAnsi="Times New Roman"/>
+          <w:sz w:val="24"/>
+          <w:szCs w:val="24"/>
+        </w:rPr>
+        <w:t xml:space="preserve">Par groupe d'âge et par genre du chef de ménage, un fait ressort : les enfants des ménages bénéficiaires partent d'un niveau nettement plus favorable. Chez les 0 à 4 ans, leur avantage passe de 23,7 à 16,9 points entre les deux vagues, tiré par la nutrition. Cet avantage précède le traitement, et c'est exactement ce que l'appariement doit corriger.</w:t>
       </w:r>
     </w:p>
     <w:p>
@@ -1589,16 +1589,16 @@
           <w:sz w:val="20"/>
           <w:szCs w:val="20"/>
         </w:rPr>
-        <w:t xml:space="preserve">  ·  Ventilation par sous-groupe</w:t>
-      </w:r>
-      <w:r>
-        <w:rPr>
-          <w:rFonts w:ascii="Times New Roman" w:cs="Times New Roman" w:eastAsia="Times New Roman" w:hAnsi="Times New Roman"/>
-          <w:color w:val="6E747E"/>
-          <w:sz w:val="20"/>
-          <w:szCs w:val="20"/>
-        </w:rPr>
-        <w:t xml:space="preserve">	45 s</w:t>
+        <w:t xml:space="preserve">  ·  Incidence selon le statut</w:t>
+      </w:r>
+      <w:r>
+        <w:rPr>
+          <w:rFonts w:ascii="Times New Roman" w:cs="Times New Roman" w:eastAsia="Times New Roman" w:hAnsi="Times New Roman"/>
+          <w:color w:val="6E747E"/>
+          <w:sz w:val="20"/>
+          <w:szCs w:val="20"/>
+        </w:rPr>
+        <w:t xml:space="preserve">	30 s</w:t>
       </w:r>
     </w:p>
     <w:p>
@@ -1614,21 +1614,21 @@
           <w:sz w:val="30"/>
           <w:szCs w:val="30"/>
         </w:rPr>
-        <w:t xml:space="preserve">Un fait ressort de la ventilation par sous-groupe.</w:t>
-      </w:r>
-    </w:p>
-    <w:p>
-      <w:pPr>
-        <w:spacing w:after="160" w:line="360"/>
-        <w:jc w:val="both"/>
-      </w:pPr>
-      <w:r>
-        <w:rPr>
-          <w:rFonts w:ascii="Times New Roman" w:cs="Times New Roman" w:eastAsia="Times New Roman" w:hAnsi="Times New Roman"/>
-          <w:sz w:val="24"/>
-          <w:szCs w:val="24"/>
-        </w:rPr>
-        <w:t xml:space="preserve">Par groupe d'âge et par genre du chef de ménage, un fait ressort : les enfants des ménages bénéficiaires partent d'un niveau nettement plus favorable. Chez les 0 à 4 ans, leur avantage passe de 23,7 à 16,9 points entre les deux vagues, tiré par la nutrition. Cet avantage précède le traitement, et c'est exactement ce que l'appariement doit corriger.</w:t>
+        <w:t xml:space="preserve">Voici la même incidence, décomposée par statut.</w:t>
+      </w:r>
+    </w:p>
+    <w:p>
+      <w:pPr>
+        <w:spacing w:after="160" w:line="360"/>
+        <w:jc w:val="both"/>
+      </w:pPr>
+      <w:r>
+        <w:rPr>
+          <w:rFonts w:ascii="Times New Roman" w:cs="Times New Roman" w:eastAsia="Times New Roman" w:hAnsi="Times New Roman"/>
+          <w:sz w:val="24"/>
+          <w:szCs w:val="24"/>
+        </w:rPr>
+        <w:t xml:space="preserve">La courbe décompose l'incidence d'ensemble selon le statut du ménage. Les deux groupes reculent, mais l'écart de départ est manifeste et il ne se referme pas.</w:t>
       </w:r>
     </w:p>
     <w:p>
@@ -1659,16 +1659,16 @@
           <w:sz w:val="20"/>
           <w:szCs w:val="20"/>
         </w:rPr>
-        <w:t xml:space="preserve">  ·  Incidence selon le statut</w:t>
-      </w:r>
-      <w:r>
-        <w:rPr>
-          <w:rFonts w:ascii="Times New Roman" w:cs="Times New Roman" w:eastAsia="Times New Roman" w:hAnsi="Times New Roman"/>
-          <w:color w:val="6E747E"/>
-          <w:sz w:val="20"/>
-          <w:szCs w:val="20"/>
-        </w:rPr>
-        <w:t xml:space="preserve">	30 s</w:t>
+        <w:t xml:space="preserve">  ·  Qualité de l'appariement</w:t>
+      </w:r>
+      <w:r>
+        <w:rPr>
+          <w:rFonts w:ascii="Times New Roman" w:cs="Times New Roman" w:eastAsia="Times New Roman" w:hAnsi="Times New Roman"/>
+          <w:color w:val="6E747E"/>
+          <w:sz w:val="20"/>
+          <w:szCs w:val="20"/>
+        </w:rPr>
+        <w:t xml:space="preserve">	1 min</w:t>
       </w:r>
     </w:p>
     <w:p>
@@ -1684,21 +1684,38 @@
           <w:sz w:val="30"/>
           <w:szCs w:val="30"/>
         </w:rPr>
-        <w:t xml:space="preserve">Voici la même incidence, décomposée par statut.</w:t>
-      </w:r>
-    </w:p>
-    <w:p>
-      <w:pPr>
-        <w:spacing w:after="160" w:line="360"/>
-        <w:jc w:val="both"/>
-      </w:pPr>
-      <w:r>
-        <w:rPr>
-          <w:rFonts w:ascii="Times New Roman" w:cs="Times New Roman" w:eastAsia="Times New Roman" w:hAnsi="Times New Roman"/>
-          <w:sz w:val="24"/>
-          <w:szCs w:val="24"/>
-        </w:rPr>
-        <w:t xml:space="preserve">La courbe décompose l'incidence d'ensemble selon le statut du ménage. Les deux groupes reculent, mais l'écart de départ est manifeste et il ne se referme pas.</w:t>
+        <w:t xml:space="preserve">Un mot sur la qualité de l'appariement, dont tout dépend.</w:t>
+      </w:r>
+    </w:p>
+    <w:p>
+      <w:pPr>
+        <w:spacing w:after="160" w:line="360"/>
+        <w:jc w:val="both"/>
+      </w:pPr>
+      <w:r>
+        <w:rPr>
+          <w:rFonts w:ascii="Times New Roman" w:cs="Times New Roman" w:eastAsia="Times New Roman" w:hAnsi="Times New Roman"/>
+          <w:sz w:val="24"/>
+          <w:szCs w:val="24"/>
+        </w:rPr>
+        <w:t xml:space="preserve">Avant de commenter l'effet, un mot sur la qualité de l'appariement, dont dépend la crédibilité de tout ce qui suit. Le logit est estimé sur 17 735 enfants. La différence standardisée moyenne entre traités et témoins passe de 11,4 pour cent avant appariement à 2,4 pour cent après, très en deçà du seuil usuel de 10 pour cent, et le test joint de nullité des covariables n'est plus rejeté. Le panel apparié compte 16 210 observations-enfants sur le support commun.</w:t>
+      </w:r>
+    </w:p>
+    <w:p>
+      <w:pPr>
+        <w:spacing w:after="160"/>
+        <w:ind w:left="340"/>
+      </w:pPr>
+      <w:r>
+        <w:rPr>
+          <w:rFonts w:ascii="Times New Roman" w:cs="Times New Roman" w:eastAsia="Times New Roman" w:hAnsi="Times New Roman"/>
+          <w:i/>
+          <w:iCs/>
+          <w:color w:val="6E747E"/>
+          <w:sz w:val="22"/>
+          <w:szCs w:val="22"/>
+        </w:rPr>
+        <w:t xml:space="preserve">Ne pas s'attarder : le jury retient surtout que l'équilibre est atteint.</w:t>
       </w:r>
     </w:p>
     <w:p>
@@ -1729,16 +1746,16 @@
           <w:sz w:val="20"/>
           <w:szCs w:val="20"/>
         </w:rPr>
-        <w:t xml:space="preserve">  ·  Qualité de l'appariement</w:t>
-      </w:r>
-      <w:r>
-        <w:rPr>
-          <w:rFonts w:ascii="Times New Roman" w:cs="Times New Roman" w:eastAsia="Times New Roman" w:hAnsi="Times New Roman"/>
-          <w:color w:val="6E747E"/>
-          <w:sz w:val="20"/>
-          <w:szCs w:val="20"/>
-        </w:rPr>
-        <w:t xml:space="preserve">	1 min</w:t>
+        <w:t xml:space="preserve">  ·  Le résultat central</w:t>
+      </w:r>
+      <w:r>
+        <w:rPr>
+          <w:rFonts w:ascii="Times New Roman" w:cs="Times New Roman" w:eastAsia="Times New Roman" w:hAnsi="Times New Roman"/>
+          <w:color w:val="6E747E"/>
+          <w:sz w:val="20"/>
+          <w:szCs w:val="20"/>
+        </w:rPr>
+        <w:t xml:space="preserve">	2 min</w:t>
       </w:r>
     </w:p>
     <w:p>
@@ -1754,38 +1771,49 @@
           <w:sz w:val="30"/>
           <w:szCs w:val="30"/>
         </w:rPr>
-        <w:t xml:space="preserve">Un mot sur la qualité de l'appariement, dont tout dépend.</w:t>
-      </w:r>
-    </w:p>
-    <w:p>
-      <w:pPr>
-        <w:spacing w:after="160" w:line="360"/>
-        <w:jc w:val="both"/>
-      </w:pPr>
-      <w:r>
-        <w:rPr>
-          <w:rFonts w:ascii="Times New Roman" w:cs="Times New Roman" w:eastAsia="Times New Roman" w:hAnsi="Times New Roman"/>
-          <w:sz w:val="24"/>
-          <w:szCs w:val="24"/>
-        </w:rPr>
-        <w:t xml:space="preserve">Avant de commenter l'effet, un mot sur la qualité de l'appariement, dont dépend la crédibilité de tout ce qui suit. Le logit est estimé sur 17 735 enfants. La différence standardisée moyenne entre traités et témoins passe de 11,4 pour cent avant appariement à 2,4 pour cent après, très en deçà du seuil usuel de 10 pour cent, et le test joint de nullité des covariables n'est plus rejeté. Le panel apparié compte 16 210 observations-enfants sur le support commun.</w:t>
-      </w:r>
-    </w:p>
-    <w:p>
-      <w:pPr>
-        <w:spacing w:after="160"/>
-        <w:ind w:left="340"/>
-      </w:pPr>
-      <w:r>
-        <w:rPr>
-          <w:rFonts w:ascii="Times New Roman" w:cs="Times New Roman" w:eastAsia="Times New Roman" w:hAnsi="Times New Roman"/>
-          <w:i/>
-          <w:iCs/>
-          <w:color w:val="6E747E"/>
-          <w:sz w:val="22"/>
-          <w:szCs w:val="22"/>
-        </w:rPr>
-        <w:t xml:space="preserve">Ne pas s'attarder : le jury retient surtout que l'équilibre est atteint.</w:t>
+        <w:t xml:space="preserve">J'en viens au résultat central, et je vais l'énoncer sans détour.</w:t>
+      </w:r>
+    </w:p>
+    <w:p>
+      <w:pPr>
+        <w:spacing w:after="160" w:line="360"/>
+        <w:jc w:val="both"/>
+      </w:pPr>
+      <w:r>
+        <w:rPr>
+          <w:rFonts w:ascii="Times New Roman" w:cs="Times New Roman" w:eastAsia="Times New Roman" w:hAnsi="Times New Roman"/>
+          <w:sz w:val="24"/>
+          <w:szCs w:val="24"/>
+        </w:rPr>
+        <w:t xml:space="preserve">J'en viens au résultat central, et je vais l'énoncer sans détour.</w:t>
+      </w:r>
+    </w:p>
+    <w:p>
+      <w:pPr>
+        <w:spacing w:after="160" w:line="360"/>
+        <w:jc w:val="both"/>
+      </w:pPr>
+      <w:r>
+        <w:rPr>
+          <w:rFonts w:ascii="Times New Roman" w:cs="Times New Roman" w:eastAsia="Times New Roman" w:hAnsi="Times New Roman"/>
+          <w:sz w:val="24"/>
+          <w:szCs w:val="24"/>
+        </w:rPr>
+        <w:t xml:space="preserve">Sur la période 2018-2021, la pauvreté multidimensionnelle des enfants des ménages bénéficiaires recule plus lentement que celle des témoins appariés. L'écart est de 6,4 points de pourcentage, significatif au seuil de 5 pour cent. Le résultat ne tient pas au choix de l'algorithme : les trois appariements concordent, de 0,050 à 0,064. La double différence sans appariement, qui ne corrige pas l'avantage initial, donne le même signe atténué, à 0,035.</w:t>
+      </w:r>
+    </w:p>
+    <w:p>
+      <w:pPr>
+        <w:spacing w:after="160" w:line="360"/>
+        <w:jc w:val="both"/>
+      </w:pPr>
+      <w:r>
+        <w:rPr>
+          <w:rFonts w:ascii="Times New Roman" w:cs="Times New Roman" w:eastAsia="Times New Roman" w:hAnsi="Times New Roman"/>
+          <w:sz w:val="24"/>
+          <w:szCs w:val="24"/>
+        </w:rPr>
+        <w:t xml:space="preserve">La première hypothèse n'est donc pas validée. Je précise immédiatement le sens de ce résultat, car il se prête à un contresens : il ne dit pas que les transferts appauvrissent les enfants. Il dit que, sur cet horizon de trois ans, les conditions de vie des enfants bénéficiaires se sont améliorées plus lentement que celles de leurs témoins.</w:t>
       </w:r>
     </w:p>
     <w:p>
@@ -1816,16 +1844,16 @@
           <w:sz w:val="20"/>
           <w:szCs w:val="20"/>
         </w:rPr>
-        <w:t xml:space="preserve">  ·  Le résultat central</w:t>
-      </w:r>
-      <w:r>
-        <w:rPr>
-          <w:rFonts w:ascii="Times New Roman" w:cs="Times New Roman" w:eastAsia="Times New Roman" w:hAnsi="Times New Roman"/>
-          <w:color w:val="6E747E"/>
-          <w:sz w:val="20"/>
-          <w:szCs w:val="20"/>
-        </w:rPr>
-        <w:t xml:space="preserve">	2 min</w:t>
+        <w:t xml:space="preserve">  ·  Effets par dimension</w:t>
+      </w:r>
+      <w:r>
+        <w:rPr>
+          <w:rFonts w:ascii="Times New Roman" w:cs="Times New Roman" w:eastAsia="Times New Roman" w:hAnsi="Times New Roman"/>
+          <w:color w:val="6E747E"/>
+          <w:sz w:val="20"/>
+          <w:szCs w:val="20"/>
+        </w:rPr>
+        <w:t xml:space="preserve">	1 min</w:t>
       </w:r>
     </w:p>
     <w:p>
@@ -1841,49 +1869,35 @@
           <w:sz w:val="30"/>
           <w:szCs w:val="30"/>
         </w:rPr>
-        <w:t xml:space="preserve">J'en viens au résultat central, et je vais l'énoncer sans détour.</w:t>
-      </w:r>
-    </w:p>
-    <w:p>
-      <w:pPr>
-        <w:spacing w:after="160" w:line="360"/>
-        <w:jc w:val="both"/>
-      </w:pPr>
-      <w:r>
-        <w:rPr>
-          <w:rFonts w:ascii="Times New Roman" w:cs="Times New Roman" w:eastAsia="Times New Roman" w:hAnsi="Times New Roman"/>
-          <w:sz w:val="24"/>
-          <w:szCs w:val="24"/>
-        </w:rPr>
-        <w:t xml:space="preserve">J'en viens au résultat central, et je vais l'énoncer sans détour.</w:t>
-      </w:r>
-    </w:p>
-    <w:p>
-      <w:pPr>
-        <w:spacing w:after="160" w:line="360"/>
-        <w:jc w:val="both"/>
-      </w:pPr>
-      <w:r>
-        <w:rPr>
-          <w:rFonts w:ascii="Times New Roman" w:cs="Times New Roman" w:eastAsia="Times New Roman" w:hAnsi="Times New Roman"/>
-          <w:sz w:val="24"/>
-          <w:szCs w:val="24"/>
-        </w:rPr>
-        <w:t xml:space="preserve">Sur la période 2018-2021, la pauvreté multidimensionnelle des enfants des ménages bénéficiaires recule plus lentement que celle des témoins appariés. L'écart est de 6,4 points de pourcentage, significatif au seuil de 5 pour cent. Le résultat ne tient pas au choix de l'algorithme : les trois appariements concordent, de 0,050 à 0,064. La double différence sans appariement, qui ne corrige pas l'avantage initial, donne le même signe atténué, à 0,035.</w:t>
-      </w:r>
-    </w:p>
-    <w:p>
-      <w:pPr>
-        <w:spacing w:after="160" w:line="360"/>
-        <w:jc w:val="both"/>
-      </w:pPr>
-      <w:r>
-        <w:rPr>
-          <w:rFonts w:ascii="Times New Roman" w:cs="Times New Roman" w:eastAsia="Times New Roman" w:hAnsi="Times New Roman"/>
-          <w:sz w:val="24"/>
-          <w:szCs w:val="24"/>
-        </w:rPr>
-        <w:t xml:space="preserve">La première hypothèse n'est donc pas validée. Je précise immédiatement le sens de ce résultat, car il se prête à un contresens : il ne dit pas que les transferts appauvrissent les enfants. Il dit que, sur cet horizon de trois ans, les conditions de vie des enfants bénéficiaires se sont améliorées plus lentement que celles de leurs témoins.</w:t>
+        <w:t xml:space="preserve">Cet effet n'est pas diffus : il se localise.</w:t>
+      </w:r>
+    </w:p>
+    <w:p>
+      <w:pPr>
+        <w:spacing w:after="160" w:line="360"/>
+        <w:jc w:val="both"/>
+      </w:pPr>
+      <w:r>
+        <w:rPr>
+          <w:rFonts w:ascii="Times New Roman" w:cs="Times New Roman" w:eastAsia="Times New Roman" w:hAnsi="Times New Roman"/>
+          <w:sz w:val="24"/>
+          <w:szCs w:val="24"/>
+        </w:rPr>
+        <w:t xml:space="preserve">L'effet n'est pas diffus, il se localise. Sur les sept dimensions, une seule ressort : la nutrition, avec 6,8 points, significative à 10 pour cent, et c'est précisément la dimension qui dépend le plus directement du budget courant du ménage. L'assainissement va dans le même sens, à 4,6 points, sans atteindre la significativité. Les cinq autres dimensions restent comprises entre 0,5 et 2,4 points, toutes non significatives.</w:t>
+      </w:r>
+    </w:p>
+    <w:p>
+      <w:pPr>
+        <w:spacing w:after="160" w:line="360"/>
+        <w:jc w:val="both"/>
+      </w:pPr>
+      <w:r>
+        <w:rPr>
+          <w:rFonts w:ascii="Times New Roman" w:cs="Times New Roman" w:eastAsia="Times New Roman" w:hAnsi="Times New Roman"/>
+          <w:sz w:val="24"/>
+          <w:szCs w:val="24"/>
+        </w:rPr>
+        <w:t xml:space="preserve">Par groupe d'âge, l'effet n'est établi que chez les 0 à 4 ans, à 9,1 points, significatif à 5 pour cent. Effet par âge et effet par dimension se répondent : les besoins des plus jeunes passent d'abord par l'alimentation. En revanche, aucun test d'égalité ne conclut, ni entre milieux, ni selon le genre du chef, ni entre tranches d'âge : les sous-groupes se distinguent par la significativité de leur effet, non par une ampleur supérieure.</w:t>
       </w:r>
     </w:p>
     <w:p>
@@ -1914,7 +1928,7 @@
           <w:sz w:val="20"/>
           <w:szCs w:val="20"/>
         </w:rPr>
-        <w:t xml:space="preserve">  ·  Effets par dimension</w:t>
+        <w:t xml:space="preserve">  ·  Effet selon le montant</w:t>
       </w:r>
       <w:r>
         <w:rPr>
@@ -1939,35 +1953,52 @@
           <w:sz w:val="30"/>
           <w:szCs w:val="30"/>
         </w:rPr>
-        <w:t xml:space="preserve">Cet effet n'est pas diffus : il se localise.</w:t>
-      </w:r>
-    </w:p>
-    <w:p>
-      <w:pPr>
-        <w:spacing w:after="160" w:line="360"/>
-        <w:jc w:val="both"/>
-      </w:pPr>
-      <w:r>
-        <w:rPr>
-          <w:rFonts w:ascii="Times New Roman" w:cs="Times New Roman" w:eastAsia="Times New Roman" w:hAnsi="Times New Roman"/>
-          <w:sz w:val="24"/>
-          <w:szCs w:val="24"/>
-        </w:rPr>
-        <w:t xml:space="preserve">L'effet n'est pas diffus, il se localise. Sur les sept dimensions, une seule ressort : la nutrition, avec 6,8 points, significative à 10 pour cent, et c'est précisément la dimension qui dépend le plus directement du budget courant du ménage. L'assainissement va dans le même sens, à 4,6 points, sans atteindre la significativité. Les cinq autres dimensions restent comprises entre 0,5 et 2,4 points, toutes non significatives.</w:t>
-      </w:r>
-    </w:p>
-    <w:p>
-      <w:pPr>
-        <w:spacing w:after="160" w:line="360"/>
-        <w:jc w:val="both"/>
-      </w:pPr>
-      <w:r>
-        <w:rPr>
-          <w:rFonts w:ascii="Times New Roman" w:cs="Times New Roman" w:eastAsia="Times New Roman" w:hAnsi="Times New Roman"/>
-          <w:sz w:val="24"/>
-          <w:szCs w:val="24"/>
-        </w:rPr>
-        <w:t xml:space="preserve">Par groupe d'âge, l'effet n'est établi que chez les 0 à 4 ans, à 9,1 points, significatif à 5 pour cent. Effet par âge et effet par dimension se répondent : les besoins des plus jeunes passent d'abord par l'alimentation. En revanche, aucun test d'égalité ne conclut, ni entre milieux, ni selon le genre du chef, ni entre tranches d'âge : les sous-groupes se distinguent par la significativité de leur effet, non par une ampleur supérieure.</w:t>
+        <w:t xml:space="preserve">Dernier volet, l'intensité du traitement.</w:t>
+      </w:r>
+    </w:p>
+    <w:p>
+      <w:pPr>
+        <w:spacing w:after="160" w:line="360"/>
+        <w:jc w:val="both"/>
+      </w:pPr>
+      <w:r>
+        <w:rPr>
+          <w:rFonts w:ascii="Times New Roman" w:cs="Times New Roman" w:eastAsia="Times New Roman" w:hAnsi="Times New Roman"/>
+          <w:sz w:val="24"/>
+          <w:szCs w:val="24"/>
+        </w:rPr>
+        <w:t xml:space="preserve">Dernier volet, l'intensité du traitement. L'écart défavorable se concentre sur les plus faibles montants : seuls les deux premiers quintiles sont significatifs, à 12,9 et 9,9 points. Il ne se retrouve pas pour les transferts les plus élevés, le dernier quintile étant même très légèrement négatif. La pente dose-réponse, estimée sur le logarithme du montant, vaut moins 0,025 et est significative à 10 pour cent : plus le montant reçu est élevé, plus l'écart tend à se réduire.</w:t>
+      </w:r>
+    </w:p>
+    <w:p>
+      <w:pPr>
+        <w:spacing w:after="160" w:line="360"/>
+        <w:jc w:val="both"/>
+      </w:pPr>
+      <w:r>
+        <w:rPr>
+          <w:rFonts w:ascii="Times New Roman" w:cs="Times New Roman" w:eastAsia="Times New Roman" w:hAnsi="Times New Roman"/>
+          <w:sz w:val="24"/>
+          <w:szCs w:val="24"/>
+        </w:rPr>
+        <w:t xml:space="preserve">Je dois toutefois nuancer : le profil n'est pas strictement monotone, le quatrième quintile remontant sans être significatif. Et le montant relevant du choix du migrant, ce gradient se lit comme une association conditionnelle, non comme un effet causal du montant.</w:t>
+      </w:r>
+    </w:p>
+    <w:p>
+      <w:pPr>
+        <w:pStyle w:val="Heading1"/>
+        <w:spacing w:after="200" w:before="400"/>
+      </w:pPr>
+      <w:r>
+        <w:rPr>
+          <w:rFonts w:ascii="Times New Roman" w:cs="Times New Roman" w:eastAsia="Times New Roman" w:hAnsi="Times New Roman"/>
+          <w:b/>
+          <w:bCs/>
+          <w:color w:val="0E6E96"/>
+          <w:sz w:val="30"/>
+          <w:szCs w:val="30"/>
+        </w:rPr>
+        <w:t xml:space="preserve">Cinquième temps · Robustesse et discussion</w:t>
       </w:r>
     </w:p>
     <w:p>
@@ -1998,7 +2029,7 @@
           <w:sz w:val="20"/>
           <w:szCs w:val="20"/>
         </w:rPr>
-        <w:t xml:space="preserve">  ·  Effet selon le montant</w:t>
+        <w:t xml:space="preserve">  ·  Tests de robustesse</w:t>
       </w:r>
       <w:r>
         <w:rPr>
@@ -2023,52 +2054,21 @@
           <w:sz w:val="30"/>
           <w:szCs w:val="30"/>
         </w:rPr>
-        <w:t xml:space="preserve">Dernier volet, l'intensité du traitement.</w:t>
-      </w:r>
-    </w:p>
-    <w:p>
-      <w:pPr>
-        <w:spacing w:after="160" w:line="360"/>
-        <w:jc w:val="both"/>
-      </w:pPr>
-      <w:r>
-        <w:rPr>
-          <w:rFonts w:ascii="Times New Roman" w:cs="Times New Roman" w:eastAsia="Times New Roman" w:hAnsi="Times New Roman"/>
-          <w:sz w:val="24"/>
-          <w:szCs w:val="24"/>
-        </w:rPr>
-        <w:t xml:space="preserve">Dernier volet, l'intensité du traitement. L'écart défavorable se concentre sur les plus faibles montants : seuls les deux premiers quintiles sont significatifs, à 12,9 et 9,9 points. Il ne se retrouve pas pour les transferts les plus élevés, le dernier quintile étant même très légèrement négatif. La pente dose-réponse, estimée sur le logarithme du montant, vaut moins 0,025 et est significative à 10 pour cent : plus le montant reçu est élevé, plus l'écart tend à se réduire.</w:t>
-      </w:r>
-    </w:p>
-    <w:p>
-      <w:pPr>
-        <w:spacing w:after="160" w:line="360"/>
-        <w:jc w:val="both"/>
-      </w:pPr>
-      <w:r>
-        <w:rPr>
-          <w:rFonts w:ascii="Times New Roman" w:cs="Times New Roman" w:eastAsia="Times New Roman" w:hAnsi="Times New Roman"/>
-          <w:sz w:val="24"/>
-          <w:szCs w:val="24"/>
-        </w:rPr>
-        <w:t xml:space="preserve">Je dois toutefois nuancer : le profil n'est pas strictement monotone, le quatrième quintile remontant sans être significatif. Et le montant relevant du choix du migrant, ce gradient se lit comme une association conditionnelle, non comme un effet causal du montant.</w:t>
-      </w:r>
-    </w:p>
-    <w:p>
-      <w:pPr>
-        <w:pStyle w:val="Heading1"/>
-        <w:spacing w:after="200" w:before="400"/>
-      </w:pPr>
-      <w:r>
-        <w:rPr>
-          <w:rFonts w:ascii="Times New Roman" w:cs="Times New Roman" w:eastAsia="Times New Roman" w:hAnsi="Times New Roman"/>
-          <w:b/>
-          <w:bCs/>
-          <w:color w:val="0E6E96"/>
-          <w:sz w:val="30"/>
-          <w:szCs w:val="30"/>
-        </w:rPr>
-        <w:t xml:space="preserve">Cinquième temps · Robustesse et discussion</w:t>
+        <w:t xml:space="preserve">Ce résultat a été mis à l'épreuve de trois façons.</w:t>
+      </w:r>
+    </w:p>
+    <w:p>
+      <w:pPr>
+        <w:spacing w:after="160" w:line="360"/>
+        <w:jc w:val="both"/>
+      </w:pPr>
+      <w:r>
+        <w:rPr>
+          <w:rFonts w:ascii="Times New Roman" w:cs="Times New Roman" w:eastAsia="Times New Roman" w:hAnsi="Times New Roman"/>
+          <w:sz w:val="24"/>
+          <w:szCs w:val="24"/>
+        </w:rPr>
+        <w:t xml:space="preserve">Le résultat a été mis à l'épreuve de trois façons. Le choix de la méthode d'appariement, d'abord : les trois algorithmes donnent un effet de 0,050 à 0,064, tous significatifs au moins à 10 pour cent. Le seuil de privation ensuite : testé de une à sept dimensions, l'ampleur suit une courbe en cloche, maximale au seuil retenu et significative seulement pour deux, trois et quatre dimensions. Cela nous apprend quelque chose : l'effet se joue au milieu de la distribution des privations, pas dans son noyau. Enfin, une implémentation indépendante du même estimateur retrouve le résultat.</w:t>
       </w:r>
     </w:p>
     <w:p>
@@ -2099,16 +2099,16 @@
           <w:sz w:val="20"/>
           <w:szCs w:val="20"/>
         </w:rPr>
-        <w:t xml:space="preserve">  ·  Tests de robustesse</w:t>
-      </w:r>
-      <w:r>
-        <w:rPr>
-          <w:rFonts w:ascii="Times New Roman" w:cs="Times New Roman" w:eastAsia="Times New Roman" w:hAnsi="Times New Roman"/>
-          <w:color w:val="6E747E"/>
-          <w:sz w:val="20"/>
-          <w:szCs w:val="20"/>
-        </w:rPr>
-        <w:t xml:space="preserve">	1 min</w:t>
+        <w:t xml:space="preserve">  ·  Sensibilité à la définition du traitement</w:t>
+      </w:r>
+      <w:r>
+        <w:rPr>
+          <w:rFonts w:ascii="Times New Roman" w:cs="Times New Roman" w:eastAsia="Times New Roman" w:hAnsi="Times New Roman"/>
+          <w:color w:val="6E747E"/>
+          <w:sz w:val="20"/>
+          <w:szCs w:val="20"/>
+        </w:rPr>
+        <w:t xml:space="preserve">	45 s</w:t>
       </w:r>
     </w:p>
     <w:p>
@@ -2124,21 +2124,21 @@
           <w:sz w:val="30"/>
           <w:szCs w:val="30"/>
         </w:rPr>
-        <w:t xml:space="preserve">Ce résultat a été mis à l'épreuve de trois façons.</w:t>
-      </w:r>
-    </w:p>
-    <w:p>
-      <w:pPr>
-        <w:spacing w:after="160" w:line="360"/>
-        <w:jc w:val="both"/>
-      </w:pPr>
-      <w:r>
-        <w:rPr>
-          <w:rFonts w:ascii="Times New Roman" w:cs="Times New Roman" w:eastAsia="Times New Roman" w:hAnsi="Times New Roman"/>
-          <w:sz w:val="24"/>
-          <w:szCs w:val="24"/>
-        </w:rPr>
-        <w:t xml:space="preserve">Le résultat a été mis à l'épreuve de trois façons. Le choix de la méthode d'appariement, d'abord : les trois algorithmes donnent un effet de 0,050 à 0,064, tous significatifs au moins à 10 pour cent. Le seuil de privation ensuite : testé de une à sept dimensions, l'ampleur suit une courbe en cloche, maximale au seuil retenu et significative seulement pour deux, trois et quatre dimensions. Cela nous apprend quelque chose : l'effet se joue au milieu de la distribution des privations, pas dans son noyau. Enfin, une implémentation indépendante du même estimateur retrouve le résultat.</w:t>
+        <w:t xml:space="preserve">Un test mérite d'être signalé, car il nuance la portée du résultat.</w:t>
+      </w:r>
+    </w:p>
+    <w:p>
+      <w:pPr>
+        <w:spacing w:after="160" w:line="360"/>
+        <w:jc w:val="both"/>
+      </w:pPr>
+      <w:r>
+        <w:rPr>
+          <w:rFonts w:ascii="Times New Roman" w:cs="Times New Roman" w:eastAsia="Times New Roman" w:hAnsi="Times New Roman"/>
+          <w:sz w:val="24"/>
+          <w:szCs w:val="24"/>
+        </w:rPr>
+        <w:t xml:space="preserve">Un test mérite d'être signalé, car il nuance la portée du résultat. Si l'on restreint les traités aux bénéficiaires des deux vagues, l'effet tombe à 0,022 en double différence et à moins 0,008 avec appariement, tous deux non significatifs. L'exposition de ces ménages, déjà en cours en 2018, relève d'une autre question que celle du design principal. Autrement dit : le signe et l'ordre de grandeur résistent à l'algorithme comme au seuil, mais la définition du traitement les fait disparaître.</w:t>
       </w:r>
     </w:p>
     <w:p>
@@ -2169,16 +2169,16 @@
           <w:sz w:val="20"/>
           <w:szCs w:val="20"/>
         </w:rPr>
-        <w:t xml:space="preserve">  ·  Sensibilité à la définition du traitement</w:t>
-      </w:r>
-      <w:r>
-        <w:rPr>
-          <w:rFonts w:ascii="Times New Roman" w:cs="Times New Roman" w:eastAsia="Times New Roman" w:hAnsi="Times New Roman"/>
-          <w:color w:val="6E747E"/>
-          <w:sz w:val="20"/>
-          <w:szCs w:val="20"/>
-        </w:rPr>
-        <w:t xml:space="preserve">	45 s</w:t>
+        <w:t xml:space="preserve">  ·  Mécanismes d'interprétation</w:t>
+      </w:r>
+      <w:r>
+        <w:rPr>
+          <w:rFonts w:ascii="Times New Roman" w:cs="Times New Roman" w:eastAsia="Times New Roman" w:hAnsi="Times New Roman"/>
+          <w:color w:val="6E747E"/>
+          <w:sz w:val="20"/>
+          <w:szCs w:val="20"/>
+        </w:rPr>
+        <w:t xml:space="preserve">	1 min 30</w:t>
       </w:r>
     </w:p>
     <w:p>
@@ -2194,21 +2194,63 @@
           <w:sz w:val="30"/>
           <w:szCs w:val="30"/>
         </w:rPr>
-        <w:t xml:space="preserve">Un test mérite d'être signalé, car il nuance la portée du résultat.</w:t>
-      </w:r>
-    </w:p>
-    <w:p>
-      <w:pPr>
-        <w:spacing w:after="160" w:line="360"/>
-        <w:jc w:val="both"/>
-      </w:pPr>
-      <w:r>
-        <w:rPr>
-          <w:rFonts w:ascii="Times New Roman" w:cs="Times New Roman" w:eastAsia="Times New Roman" w:hAnsi="Times New Roman"/>
-          <w:sz w:val="24"/>
-          <w:szCs w:val="24"/>
-        </w:rPr>
-        <w:t xml:space="preserve">Un test mérite d'être signalé, car il nuance la portée du résultat. Si l'on restreint les traités aux bénéficiaires des deux vagues, l'effet tombe à 0,022 en double différence et à moins 0,008 avec appariement, tous deux non significatifs. L'exposition de ces ménages, déjà en cours en 2018, relève d'une autre question que celle du design principal. Autrement dit : le signe et l'ordre de grandeur résistent à l'algorithme comme au seuil, mais la définition du traitement les fait disparaître.</w:t>
+        <w:t xml:space="preserve">Comment expliquer qu'une ressource de cette ampleur ne réduise pas les privations ?</w:t>
+      </w:r>
+    </w:p>
+    <w:p>
+      <w:pPr>
+        <w:spacing w:after="160" w:line="360"/>
+        <w:jc w:val="both"/>
+      </w:pPr>
+      <w:r>
+        <w:rPr>
+          <w:rFonts w:ascii="Times New Roman" w:cs="Times New Roman" w:eastAsia="Times New Roman" w:hAnsi="Times New Roman"/>
+          <w:sz w:val="24"/>
+          <w:szCs w:val="24"/>
+        </w:rPr>
+        <w:t xml:space="preserve">Comment expliquer qu'une ressource de cette ampleur ne réduise pas les privations ? Trois mécanismes me paraissent devoir être avancés.</w:t>
+      </w:r>
+    </w:p>
+    <w:p>
+      <w:pPr>
+        <w:spacing w:after="160" w:line="360"/>
+        <w:jc w:val="both"/>
+      </w:pPr>
+      <w:r>
+        <w:rPr>
+          <w:rFonts w:ascii="Times New Roman" w:cs="Times New Roman" w:eastAsia="Times New Roman" w:hAnsi="Times New Roman"/>
+          <w:sz w:val="24"/>
+          <w:szCs w:val="24"/>
+        </w:rPr>
+        <w:t xml:space="preserve">L'usage des fonds, d'abord. 68,5 pour cent des transferts relèvent du soutien courant et moins d'un dixième va explicitement à la santé ou à la scolarité. Un flux qui finance l'ordinaire du ménage a peu de raisons de déplacer les seuils de privation retenus par l'indice.</w:t>
+      </w:r>
+    </w:p>
+    <w:p>
+      <w:pPr>
+        <w:spacing w:after="160" w:line="360"/>
+        <w:jc w:val="both"/>
+      </w:pPr>
+      <w:r>
+        <w:rPr>
+          <w:rFonts w:ascii="Times New Roman" w:cs="Times New Roman" w:eastAsia="Times New Roman" w:hAnsi="Times New Roman"/>
+          <w:sz w:val="24"/>
+          <w:szCs w:val="24"/>
+        </w:rPr>
+        <w:t xml:space="preserve">La contrainte d'offre, ensuite. L'eau, l'assainissement et l'accès aux soins supposent des investissements collectifs que le pouvoir d'achat privé ne remplace pas. Le fait que la privation en santé touche 97 pour cent des enfants aux deux vagues, quasiment sans écart entre bénéficiaires et témoins en 2021, en est l'illustration la plus nette.</w:t>
+      </w:r>
+    </w:p>
+    <w:p>
+      <w:pPr>
+        <w:spacing w:after="160" w:line="360"/>
+        <w:jc w:val="both"/>
+      </w:pPr>
+      <w:r>
+        <w:rPr>
+          <w:rFonts w:ascii="Times New Roman" w:cs="Times New Roman" w:eastAsia="Times New Roman" w:hAnsi="Times New Roman"/>
+          <w:sz w:val="24"/>
+          <w:szCs w:val="24"/>
+        </w:rPr>
+        <w:t xml:space="preserve">La marge sur laquelle l'effet opère, enfin. La sensibilité au seuil montre que l'écart se joue chez les enfants situés au milieu de la distribution. Le noyau des enfants cumulant six ou sept privations relève de déficits structurels qu'aucun flux monétaire privé ne déplace en trois ans.</w:t>
       </w:r>
     </w:p>
     <w:p>
@@ -2239,16 +2281,16 @@
           <w:sz w:val="20"/>
           <w:szCs w:val="20"/>
         </w:rPr>
-        <w:t xml:space="preserve">  ·  Mécanismes d'interprétation</w:t>
-      </w:r>
-      <w:r>
-        <w:rPr>
-          <w:rFonts w:ascii="Times New Roman" w:cs="Times New Roman" w:eastAsia="Times New Roman" w:hAnsi="Times New Roman"/>
-          <w:color w:val="6E747E"/>
-          <w:sz w:val="20"/>
-          <w:szCs w:val="20"/>
-        </w:rPr>
-        <w:t xml:space="preserve">	1 min 30</w:t>
+        <w:t xml:space="preserve">  ·  Validation des hypothèses</w:t>
+      </w:r>
+      <w:r>
+        <w:rPr>
+          <w:rFonts w:ascii="Times New Roman" w:cs="Times New Roman" w:eastAsia="Times New Roman" w:hAnsi="Times New Roman"/>
+          <w:color w:val="6E747E"/>
+          <w:sz w:val="20"/>
+          <w:szCs w:val="20"/>
+        </w:rPr>
+        <w:t xml:space="preserve">	30 s</w:t>
       </w:r>
     </w:p>
     <w:p>
@@ -2264,63 +2306,38 @@
           <w:sz w:val="30"/>
           <w:szCs w:val="30"/>
         </w:rPr>
-        <w:t xml:space="preserve">Comment expliquer qu'une ressource de cette ampleur ne réduise pas les privations ?</w:t>
-      </w:r>
-    </w:p>
-    <w:p>
-      <w:pPr>
-        <w:spacing w:after="160" w:line="360"/>
-        <w:jc w:val="both"/>
-      </w:pPr>
-      <w:r>
-        <w:rPr>
-          <w:rFonts w:ascii="Times New Roman" w:cs="Times New Roman" w:eastAsia="Times New Roman" w:hAnsi="Times New Roman"/>
-          <w:sz w:val="24"/>
-          <w:szCs w:val="24"/>
-        </w:rPr>
-        <w:t xml:space="preserve">Comment expliquer qu'une ressource de cette ampleur ne réduise pas les privations ? Trois mécanismes me paraissent devoir être avancés.</w:t>
-      </w:r>
-    </w:p>
-    <w:p>
-      <w:pPr>
-        <w:spacing w:after="160" w:line="360"/>
-        <w:jc w:val="both"/>
-      </w:pPr>
-      <w:r>
-        <w:rPr>
-          <w:rFonts w:ascii="Times New Roman" w:cs="Times New Roman" w:eastAsia="Times New Roman" w:hAnsi="Times New Roman"/>
-          <w:sz w:val="24"/>
-          <w:szCs w:val="24"/>
-        </w:rPr>
-        <w:t xml:space="preserve">L'usage des fonds, d'abord. 68,5 pour cent des transferts relèvent du soutien courant et moins d'un dixième va explicitement à la santé ou à la scolarité. Un flux qui finance l'ordinaire du ménage a peu de raisons de déplacer les seuils de privation retenus par l'indice.</w:t>
-      </w:r>
-    </w:p>
-    <w:p>
-      <w:pPr>
-        <w:spacing w:after="160" w:line="360"/>
-        <w:jc w:val="both"/>
-      </w:pPr>
-      <w:r>
-        <w:rPr>
-          <w:rFonts w:ascii="Times New Roman" w:cs="Times New Roman" w:eastAsia="Times New Roman" w:hAnsi="Times New Roman"/>
-          <w:sz w:val="24"/>
-          <w:szCs w:val="24"/>
-        </w:rPr>
-        <w:t xml:space="preserve">La contrainte d'offre, ensuite. L'eau, l'assainissement et l'accès aux soins supposent des investissements collectifs que le pouvoir d'achat privé ne remplace pas. Le fait que la privation en santé touche 97 pour cent des enfants aux deux vagues, quasiment sans écart entre bénéficiaires et témoins en 2021, en est l'illustration la plus nette.</w:t>
-      </w:r>
-    </w:p>
-    <w:p>
-      <w:pPr>
-        <w:spacing w:after="160" w:line="360"/>
-        <w:jc w:val="both"/>
-      </w:pPr>
-      <w:r>
-        <w:rPr>
-          <w:rFonts w:ascii="Times New Roman" w:cs="Times New Roman" w:eastAsia="Times New Roman" w:hAnsi="Times New Roman"/>
-          <w:sz w:val="24"/>
-          <w:szCs w:val="24"/>
-        </w:rPr>
-        <w:t xml:space="preserve">La marge sur laquelle l'effet opère, enfin. La sensibilité au seuil montre que l'écart se joue chez les enfants situés au milieu de la distribution. Le noyau des enfants cumulant six ou sept privations relève de déficits structurels qu'aucun flux monétaire privé ne déplace en trois ans.</w:t>
+        <w:t xml:space="preserve">Que deviennent alors mes deux hypothèses ?</w:t>
+      </w:r>
+    </w:p>
+    <w:p>
+      <w:pPr>
+        <w:spacing w:after="160" w:line="360"/>
+        <w:jc w:val="both"/>
+      </w:pPr>
+      <w:r>
+        <w:rPr>
+          <w:rFonts w:ascii="Times New Roman" w:cs="Times New Roman" w:eastAsia="Times New Roman" w:hAnsi="Times New Roman"/>
+          <w:sz w:val="24"/>
+          <w:szCs w:val="24"/>
+        </w:rPr>
+        <w:t xml:space="preserve">Au terme de ce parcours, la première hypothèse n'est pas validée : l'effet est de signe défavorable et aucune réduction n'est observée sur l'horizon. La seconde est partiellement validée : l'effet est bien hétérogène selon les dimensions et selon le montant, mais aucun test d'égalité ne conclut par milieu, genre du chef ou tranche d'âge.</w:t>
+      </w:r>
+    </w:p>
+    <w:p>
+      <w:pPr>
+        <w:pStyle w:val="Heading1"/>
+        <w:spacing w:after="200" w:before="400"/>
+      </w:pPr>
+      <w:r>
+        <w:rPr>
+          <w:rFonts w:ascii="Times New Roman" w:cs="Times New Roman" w:eastAsia="Times New Roman" w:hAnsi="Times New Roman"/>
+          <w:b/>
+          <w:bCs/>
+          <w:color w:val="0E6E96"/>
+          <w:sz w:val="30"/>
+          <w:szCs w:val="30"/>
+        </w:rPr>
+        <w:t xml:space="preserve">Sixième temps · Conclusion et recommandations</w:t>
       </w:r>
     </w:p>
     <w:p>
@@ -2351,16 +2368,16 @@
           <w:sz w:val="20"/>
           <w:szCs w:val="20"/>
         </w:rPr>
-        <w:t xml:space="preserve">  ·  Validation des hypothèses</w:t>
-      </w:r>
-      <w:r>
-        <w:rPr>
-          <w:rFonts w:ascii="Times New Roman" w:cs="Times New Roman" w:eastAsia="Times New Roman" w:hAnsi="Times New Roman"/>
-          <w:color w:val="6E747E"/>
-          <w:sz w:val="20"/>
-          <w:szCs w:val="20"/>
-        </w:rPr>
-        <w:t xml:space="preserve">	30 s</w:t>
+        <w:t xml:space="preserve">  ·  Conclusion générale</w:t>
+      </w:r>
+      <w:r>
+        <w:rPr>
+          <w:rFonts w:ascii="Times New Roman" w:cs="Times New Roman" w:eastAsia="Times New Roman" w:hAnsi="Times New Roman"/>
+          <w:color w:val="6E747E"/>
+          <w:sz w:val="20"/>
+          <w:szCs w:val="20"/>
+        </w:rPr>
+        <w:t xml:space="preserve">	1 min</w:t>
       </w:r>
     </w:p>
     <w:p>
@@ -2376,38 +2393,21 @@
           <w:sz w:val="30"/>
           <w:szCs w:val="30"/>
         </w:rPr>
-        <w:t xml:space="preserve">Que deviennent alors mes deux hypothèses ?</w:t>
-      </w:r>
-    </w:p>
-    <w:p>
-      <w:pPr>
-        <w:spacing w:after="160" w:line="360"/>
-        <w:jc w:val="both"/>
-      </w:pPr>
-      <w:r>
-        <w:rPr>
-          <w:rFonts w:ascii="Times New Roman" w:cs="Times New Roman" w:eastAsia="Times New Roman" w:hAnsi="Times New Roman"/>
-          <w:sz w:val="24"/>
-          <w:szCs w:val="24"/>
-        </w:rPr>
-        <w:t xml:space="preserve">Au terme de ce parcours, la première hypothèse n'est pas validée : l'effet est de signe défavorable et aucune réduction n'est observée sur l'horizon. La seconde est partiellement validée : l'effet est bien hétérogène selon les dimensions et selon le montant, mais aucun test d'égalité ne conclut par milieu, genre du chef ou tranche d'âge.</w:t>
-      </w:r>
-    </w:p>
-    <w:p>
-      <w:pPr>
-        <w:pStyle w:val="Heading1"/>
-        <w:spacing w:after="200" w:before="400"/>
-      </w:pPr>
-      <w:r>
-        <w:rPr>
-          <w:rFonts w:ascii="Times New Roman" w:cs="Times New Roman" w:eastAsia="Times New Roman" w:hAnsi="Times New Roman"/>
-          <w:b/>
-          <w:bCs/>
-          <w:color w:val="0E6E96"/>
-          <w:sz w:val="30"/>
-          <w:szCs w:val="30"/>
-        </w:rPr>
-        <w:t xml:space="preserve">Sixième temps · Conclusion et recommandations</w:t>
+        <w:t xml:space="preserve">Quatre apports se dégagent de ce travail.</w:t>
+      </w:r>
+    </w:p>
+    <w:p>
+      <w:pPr>
+        <w:spacing w:after="160" w:line="360"/>
+        <w:jc w:val="both"/>
+      </w:pPr>
+      <w:r>
+        <w:rPr>
+          <w:rFonts w:ascii="Times New Roman" w:cs="Times New Roman" w:eastAsia="Times New Roman" w:hAnsi="Times New Roman"/>
+          <w:sz w:val="24"/>
+          <w:szCs w:val="24"/>
+        </w:rPr>
+        <w:t xml:space="preserve">Quatre apports se dégagent. Une mesure de la pauvreté multidimensionnelle des enfants sur deux vagues de l'EHCVM, selon l'approche MODA. Le constat d'un recul réel de l'incidence, de 63,5 à 57,8 pour cent, sur fond d'une pauvreté qui reste massive. Le résultat central, à savoir que les transferts ne réduisent pas, à trois ans, la pauvreté multidimensionnelle des enfants. Et sa localisation précise : la nutrition, les 0 à 4 ans et les plus faibles montants reçus.</w:t>
       </w:r>
     </w:p>
     <w:p>
@@ -2438,16 +2438,16 @@
           <w:sz w:val="20"/>
           <w:szCs w:val="20"/>
         </w:rPr>
-        <w:t xml:space="preserve">  ·  Conclusion générale</w:t>
-      </w:r>
-      <w:r>
-        <w:rPr>
-          <w:rFonts w:ascii="Times New Roman" w:cs="Times New Roman" w:eastAsia="Times New Roman" w:hAnsi="Times New Roman"/>
-          <w:color w:val="6E747E"/>
-          <w:sz w:val="20"/>
-          <w:szCs w:val="20"/>
-        </w:rPr>
-        <w:t xml:space="preserve">	1 min</w:t>
+        <w:t xml:space="preserve">  ·  Recommandations</w:t>
+      </w:r>
+      <w:r>
+        <w:rPr>
+          <w:rFonts w:ascii="Times New Roman" w:cs="Times New Roman" w:eastAsia="Times New Roman" w:hAnsi="Times New Roman"/>
+          <w:color w:val="6E747E"/>
+          <w:sz w:val="20"/>
+          <w:szCs w:val="20"/>
+        </w:rPr>
+        <w:t xml:space="preserve">	1 min 30</w:t>
       </w:r>
     </w:p>
     <w:p>
@@ -2463,21 +2463,49 @@
           <w:sz w:val="30"/>
           <w:szCs w:val="30"/>
         </w:rPr>
-        <w:t xml:space="preserve">Quatre apports se dégagent de ce travail.</w:t>
-      </w:r>
-    </w:p>
-    <w:p>
-      <w:pPr>
-        <w:spacing w:after="160" w:line="360"/>
-        <w:jc w:val="both"/>
-      </w:pPr>
-      <w:r>
-        <w:rPr>
-          <w:rFonts w:ascii="Times New Roman" w:cs="Times New Roman" w:eastAsia="Times New Roman" w:hAnsi="Times New Roman"/>
-          <w:sz w:val="24"/>
-          <w:szCs w:val="24"/>
-        </w:rPr>
-        <w:t xml:space="preserve">Quatre apports se dégagent. Une mesure de la pauvreté multidimensionnelle des enfants sur deux vagues de l'EHCVM, selon l'approche MODA. Le constat d'un recul réel de l'incidence, de 63,5 à 57,8 pour cent, sur fond d'une pauvreté qui reste massive. Le résultat central, à savoir que les transferts ne réduisent pas, à trois ans, la pauvreté multidimensionnelle des enfants. Et sa localisation précise : la nutrition, les 0 à 4 ans et les plus faibles montants reçus.</w:t>
+        <w:t xml:space="preserve">Les recommandations suivent l'ordre de ces faits.</w:t>
+      </w:r>
+    </w:p>
+    <w:p>
+      <w:pPr>
+        <w:spacing w:after="160" w:line="360"/>
+        <w:jc w:val="both"/>
+      </w:pPr>
+      <w:r>
+        <w:rPr>
+          <w:rFonts w:ascii="Times New Roman" w:cs="Times New Roman" w:eastAsia="Times New Roman" w:hAnsi="Times New Roman"/>
+          <w:sz w:val="24"/>
+          <w:szCs w:val="24"/>
+        </w:rPr>
+        <w:t xml:space="preserve">Les recommandations suivent l'ordre de ces faits.</w:t>
+      </w:r>
+    </w:p>
+    <w:p>
+      <w:pPr>
+        <w:spacing w:after="160" w:line="360"/>
+        <w:jc w:val="both"/>
+      </w:pPr>
+      <w:r>
+        <w:rPr>
+          <w:rFonts w:ascii="Times New Roman" w:cs="Times New Roman" w:eastAsia="Times New Roman" w:hAnsi="Times New Roman"/>
+          <w:sz w:val="24"/>
+          <w:szCs w:val="24"/>
+        </w:rPr>
+        <w:t xml:space="preserve">Là où l'écart se concentre, d'abord : donner la priorité à la sécurité alimentaire des enfants dans les zones d'émigration, cibler les enfants de 0 à 4 ans des ménages bénéficiaires, et accompagner en priorité les ménages qui reçoivent les plus faibles montants. J'insiste sur un point : recevoir des transferts ne doit pas valoir exclusion des filets sociaux, puisque c'est précisément chez ces ménages que la trajectoire est la moins favorable.</w:t>
+      </w:r>
+    </w:p>
+    <w:p>
+      <w:pPr>
+        <w:spacing w:after="160" w:line="360"/>
+        <w:jc w:val="both"/>
+      </w:pPr>
+      <w:r>
+        <w:rPr>
+          <w:rFonts w:ascii="Times New Roman" w:cs="Times New Roman" w:eastAsia="Times New Roman" w:hAnsi="Times New Roman"/>
+          <w:sz w:val="24"/>
+          <w:szCs w:val="24"/>
+        </w:rPr>
+        <w:t xml:space="preserve">Sur les conditions de conversion des transferts, ensuite : réduire les coûts de transaction des envois formels, compléter les transferts par l'offre publique de services de base, et renforcer le suivi statistique des transferts. Le message est simple : le transfert privé ne remplace pas l'investissement collectif, il le suppose.</w:t>
       </w:r>
     </w:p>
     <w:p>
@@ -2508,16 +2536,16 @@
           <w:sz w:val="20"/>
           <w:szCs w:val="20"/>
         </w:rPr>
-        <w:t xml:space="preserve">  ·  Recommandations</w:t>
-      </w:r>
-      <w:r>
-        <w:rPr>
-          <w:rFonts w:ascii="Times New Roman" w:cs="Times New Roman" w:eastAsia="Times New Roman" w:hAnsi="Times New Roman"/>
-          <w:color w:val="6E747E"/>
-          <w:sz w:val="20"/>
-          <w:szCs w:val="20"/>
-        </w:rPr>
-        <w:t xml:space="preserve">	1 min 30</w:t>
+        <w:t xml:space="preserve">  ·  Limites de l'étude</w:t>
+      </w:r>
+      <w:r>
+        <w:rPr>
+          <w:rFonts w:ascii="Times New Roman" w:cs="Times New Roman" w:eastAsia="Times New Roman" w:hAnsi="Times New Roman"/>
+          <w:color w:val="6E747E"/>
+          <w:sz w:val="20"/>
+          <w:szCs w:val="20"/>
+        </w:rPr>
+        <w:t xml:space="preserve">	1 min</w:t>
       </w:r>
     </w:p>
     <w:p>
@@ -2533,49 +2561,21 @@
           <w:sz w:val="30"/>
           <w:szCs w:val="30"/>
         </w:rPr>
-        <w:t xml:space="preserve">Les recommandations suivent l'ordre de ces faits.</w:t>
-      </w:r>
-    </w:p>
-    <w:p>
-      <w:pPr>
-        <w:spacing w:after="160" w:line="360"/>
-        <w:jc w:val="both"/>
-      </w:pPr>
-      <w:r>
-        <w:rPr>
-          <w:rFonts w:ascii="Times New Roman" w:cs="Times New Roman" w:eastAsia="Times New Roman" w:hAnsi="Times New Roman"/>
-          <w:sz w:val="24"/>
-          <w:szCs w:val="24"/>
-        </w:rPr>
-        <w:t xml:space="preserve">Les recommandations suivent l'ordre de ces faits.</w:t>
-      </w:r>
-    </w:p>
-    <w:p>
-      <w:pPr>
-        <w:spacing w:after="160" w:line="360"/>
-        <w:jc w:val="both"/>
-      </w:pPr>
-      <w:r>
-        <w:rPr>
-          <w:rFonts w:ascii="Times New Roman" w:cs="Times New Roman" w:eastAsia="Times New Roman" w:hAnsi="Times New Roman"/>
-          <w:sz w:val="24"/>
-          <w:szCs w:val="24"/>
-        </w:rPr>
-        <w:t xml:space="preserve">Là où l'écart se concentre, d'abord : donner la priorité à la sécurité alimentaire des enfants dans les zones d'émigration, cibler les enfants de 0 à 4 ans des ménages bénéficiaires, et accompagner en priorité les ménages qui reçoivent les plus faibles montants. J'insiste sur un point : recevoir des transferts ne doit pas valoir exclusion des filets sociaux, puisque c'est précisément chez ces ménages que la trajectoire est la moins favorable.</w:t>
-      </w:r>
-    </w:p>
-    <w:p>
-      <w:pPr>
-        <w:spacing w:after="160" w:line="360"/>
-        <w:jc w:val="both"/>
-      </w:pPr>
-      <w:r>
-        <w:rPr>
-          <w:rFonts w:ascii="Times New Roman" w:cs="Times New Roman" w:eastAsia="Times New Roman" w:hAnsi="Times New Roman"/>
-          <w:sz w:val="24"/>
-          <w:szCs w:val="24"/>
-        </w:rPr>
-        <w:t xml:space="preserve">Sur les conditions de conversion des transferts, ensuite : réduire les coûts de transaction des envois formels, compléter les transferts par l'offre publique de services de base, et renforcer le suivi statistique des transferts. Le message est simple : le transfert privé ne remplace pas l'investissement collectif, il le suppose.</w:t>
+        <w:t xml:space="preserve">Ce travail a ses limites, et je préfère les énoncer moi-même.</w:t>
+      </w:r>
+    </w:p>
+    <w:p>
+      <w:pPr>
+        <w:spacing w:after="160" w:line="360"/>
+        <w:jc w:val="both"/>
+      </w:pPr>
+      <w:r>
+        <w:rPr>
+          <w:rFonts w:ascii="Times New Roman" w:cs="Times New Roman" w:eastAsia="Times New Roman" w:hAnsi="Times New Roman"/>
+          <w:sz w:val="24"/>
+          <w:szCs w:val="24"/>
+        </w:rPr>
+        <w:t xml:space="preserve">Ce travail a ses limites, et je préfère les énoncer moi-même. L'hypothèse de tendances parallèles n'est pas testable directement, deux vagues seulement étant disponibles ; l'appariement sur les niveaux initiaux la rend plus crédible sans la démontrer. Les enfants vieillissent entre les deux enquêtes et sont évalués sur la grille de leur âge courant ; le fait de figer les groupes d'âge à la période de base neutralise l'essentiel de cet effet. Enfin, la nutrition et la santé reposent sur les seuls indicateurs strictement comparables entre les deux vagues, car un indicateur redéfini entre 2018 et 2021 produirait un effet mesuré sans contenu causal.</w:t>
       </w:r>
     </w:p>
     <w:p>
@@ -2598,76 +2598,6 @@
           <w:szCs w:val="20"/>
         </w:rPr>
         <w:t xml:space="preserve">Diapositive 28</w:t>
-      </w:r>
-      <w:r>
-        <w:rPr>
-          <w:rFonts w:ascii="Times New Roman" w:cs="Times New Roman" w:eastAsia="Times New Roman" w:hAnsi="Times New Roman"/>
-          <w:color w:val="6E747E"/>
-          <w:sz w:val="20"/>
-          <w:szCs w:val="20"/>
-        </w:rPr>
-        <w:t xml:space="preserve">  ·  Limites de l'étude</w:t>
-      </w:r>
-      <w:r>
-        <w:rPr>
-          <w:rFonts w:ascii="Times New Roman" w:cs="Times New Roman" w:eastAsia="Times New Roman" w:hAnsi="Times New Roman"/>
-          <w:color w:val="6E747E"/>
-          <w:sz w:val="20"/>
-          <w:szCs w:val="20"/>
-        </w:rPr>
-        <w:t xml:space="preserve">	1 min</w:t>
-      </w:r>
-    </w:p>
-    <w:p>
-      <w:pPr>
-        <w:spacing w:after="200" w:before="60"/>
-      </w:pPr>
-      <w:r>
-        <w:rPr>
-          <w:rFonts w:ascii="Times New Roman" w:cs="Times New Roman" w:eastAsia="Times New Roman" w:hAnsi="Times New Roman"/>
-          <w:b/>
-          <w:bCs/>
-          <w:color w:val="0E6E96"/>
-          <w:sz w:val="30"/>
-          <w:szCs w:val="30"/>
-        </w:rPr>
-        <w:t xml:space="preserve">Ce travail a ses limites, et je préfère les énoncer moi-même.</w:t>
-      </w:r>
-    </w:p>
-    <w:p>
-      <w:pPr>
-        <w:spacing w:after="160" w:line="360"/>
-        <w:jc w:val="both"/>
-      </w:pPr>
-      <w:r>
-        <w:rPr>
-          <w:rFonts w:ascii="Times New Roman" w:cs="Times New Roman" w:eastAsia="Times New Roman" w:hAnsi="Times New Roman"/>
-          <w:sz w:val="24"/>
-          <w:szCs w:val="24"/>
-        </w:rPr>
-        <w:t xml:space="preserve">Ce travail a ses limites, et je préfère les énoncer moi-même. L'hypothèse de tendances parallèles n'est pas testable directement, deux vagues seulement étant disponibles ; l'appariement sur les niveaux initiaux la rend plus crédible sans la démontrer. Les enfants vieillissent entre les deux enquêtes et sont évalués sur la grille de leur âge courant ; le fait de figer les groupes d'âge à la période de base neutralise l'essentiel de cet effet. Enfin, la nutrition et la santé reposent sur les seuls indicateurs strictement comparables entre les deux vagues, car un indicateur redéfini entre 2018 et 2021 produirait un effet mesuré sans contenu causal.</w:t>
-      </w:r>
-    </w:p>
-    <w:p>
-      <w:pPr>
-        <w:pBdr>
-          <w:bottom w:val="single" w:color="1CABE2" w:sz="6"/>
-        </w:pBdr>
-        <w:tabs>
-          <w:tab w:val="right" w:pos="9026"/>
-        </w:tabs>
-        <w:spacing w:after="120" w:before="320"/>
-      </w:pPr>
-      <w:r>
-        <w:rPr>
-          <w:rFonts w:ascii="Times New Roman" w:cs="Times New Roman" w:eastAsia="Times New Roman" w:hAnsi="Times New Roman"/>
-          <w:b/>
-          <w:bCs/>
-          <w:color w:val="0E6E96"/>
-          <w:sz w:val="20"/>
-          <w:szCs w:val="20"/>
-        </w:rPr>
-        <w:t xml:space="preserve">Diapositive 29</w:t>
       </w:r>
       <w:r>
         <w:rPr>

</xml_diff>

<commit_message>
Retirer la diapositive des disparites regionales (#756)
Le discours est mis a jour : la section correspondante est supprimee et
les reperes de diapositive sont renumerotes a partir de la quinzieme.


Claude-Session: https://claude.ai/code/session_01837AJxDdpW6rUH9DV9QD1H

Co-authored-by: Claude <noreply@anthropic.com>
</commit_message>
<xml_diff>
--- a/Presentation/discours/discours_soutenance.docx
+++ b/Presentation/discours/discours_soutenance.docx
@@ -94,7 +94,7 @@
           <w:sz w:val="22"/>
           <w:szCs w:val="22"/>
         </w:rPr>
-        <w:t xml:space="preserve">Durée visée : 20 minutes  ·  31 diapositives</w:t>
+        <w:t xml:space="preserve">Durée visée : 19 minutes  ·  31 diapositives</w:t>
       </w:r>
     </w:p>
     <w:p>
@@ -1519,7 +1519,7 @@
           <w:sz w:val="20"/>
           <w:szCs w:val="20"/>
         </w:rPr>
-        <w:t xml:space="preserve">  ·  Disparités régionales</w:t>
+        <w:t xml:space="preserve">  ·  Ventilation par sous-groupe</w:t>
       </w:r>
       <w:r>
         <w:rPr>
@@ -1544,21 +1544,21 @@
           <w:sz w:val="30"/>
           <w:szCs w:val="30"/>
         </w:rPr>
-        <w:t xml:space="preserve">Cette moyenne nationale recouvre des écarts considérables.</w:t>
-      </w:r>
-    </w:p>
-    <w:p>
-      <w:pPr>
-        <w:spacing w:after="160" w:line="360"/>
-        <w:jc w:val="both"/>
-      </w:pPr>
-      <w:r>
-        <w:rPr>
-          <w:rFonts w:ascii="Times New Roman" w:cs="Times New Roman" w:eastAsia="Times New Roman" w:hAnsi="Times New Roman"/>
-          <w:sz w:val="24"/>
-          <w:szCs w:val="24"/>
-        </w:rPr>
-        <w:t xml:space="preserve">Cette moyenne nationale recouvre des écarts considérables. En 2021, l'incidence va de 16,7 pour cent à Dakar à 78,1 pour cent à Kolda, soit un rapport de un à cinq. Les régions du sud et de l'est concentrent les privations. Le recul est général sur la période, à deux exceptions près, Thiès et Kaolack, où l'incidence progresse.</w:t>
+        <w:t xml:space="preserve">Un fait ressort de la ventilation par sous-groupe.</w:t>
+      </w:r>
+    </w:p>
+    <w:p>
+      <w:pPr>
+        <w:spacing w:after="160" w:line="360"/>
+        <w:jc w:val="both"/>
+      </w:pPr>
+      <w:r>
+        <w:rPr>
+          <w:rFonts w:ascii="Times New Roman" w:cs="Times New Roman" w:eastAsia="Times New Roman" w:hAnsi="Times New Roman"/>
+          <w:sz w:val="24"/>
+          <w:szCs w:val="24"/>
+        </w:rPr>
+        <w:t xml:space="preserve">Par groupe d'âge et par genre du chef de ménage, un fait ressort : les enfants des ménages bénéficiaires partent d'un niveau nettement plus favorable. Chez les 0 à 4 ans, leur avantage passe de 23,7 à 16,9 points entre les deux vagues, tiré par la nutrition. Cet avantage précède le traitement, et c'est exactement ce que l'appariement doit corriger.</w:t>
       </w:r>
     </w:p>
     <w:p>
@@ -1589,16 +1589,16 @@
           <w:sz w:val="20"/>
           <w:szCs w:val="20"/>
         </w:rPr>
-        <w:t xml:space="preserve">  ·  Ventilation par sous-groupe</w:t>
-      </w:r>
-      <w:r>
-        <w:rPr>
-          <w:rFonts w:ascii="Times New Roman" w:cs="Times New Roman" w:eastAsia="Times New Roman" w:hAnsi="Times New Roman"/>
-          <w:color w:val="6E747E"/>
-          <w:sz w:val="20"/>
-          <w:szCs w:val="20"/>
-        </w:rPr>
-        <w:t xml:space="preserve">	45 s</w:t>
+        <w:t xml:space="preserve">  ·  Incidence selon le statut</w:t>
+      </w:r>
+      <w:r>
+        <w:rPr>
+          <w:rFonts w:ascii="Times New Roman" w:cs="Times New Roman" w:eastAsia="Times New Roman" w:hAnsi="Times New Roman"/>
+          <w:color w:val="6E747E"/>
+          <w:sz w:val="20"/>
+          <w:szCs w:val="20"/>
+        </w:rPr>
+        <w:t xml:space="preserve">	30 s</w:t>
       </w:r>
     </w:p>
     <w:p>
@@ -1614,21 +1614,21 @@
           <w:sz w:val="30"/>
           <w:szCs w:val="30"/>
         </w:rPr>
-        <w:t xml:space="preserve">Un fait ressort de la ventilation par sous-groupe.</w:t>
-      </w:r>
-    </w:p>
-    <w:p>
-      <w:pPr>
-        <w:spacing w:after="160" w:line="360"/>
-        <w:jc w:val="both"/>
-      </w:pPr>
-      <w:r>
-        <w:rPr>
-          <w:rFonts w:ascii="Times New Roman" w:cs="Times New Roman" w:eastAsia="Times New Roman" w:hAnsi="Times New Roman"/>
-          <w:sz w:val="24"/>
-          <w:szCs w:val="24"/>
-        </w:rPr>
-        <w:t xml:space="preserve">Par groupe d'âge et par genre du chef de ménage, un fait ressort : les enfants des ménages bénéficiaires partent d'un niveau nettement plus favorable. Chez les 0 à 4 ans, leur avantage passe de 23,7 à 16,9 points entre les deux vagues, tiré par la nutrition. Cet avantage précède le traitement, et c'est exactement ce que l'appariement doit corriger.</w:t>
+        <w:t xml:space="preserve">Voici la même incidence, décomposée par statut.</w:t>
+      </w:r>
+    </w:p>
+    <w:p>
+      <w:pPr>
+        <w:spacing w:after="160" w:line="360"/>
+        <w:jc w:val="both"/>
+      </w:pPr>
+      <w:r>
+        <w:rPr>
+          <w:rFonts w:ascii="Times New Roman" w:cs="Times New Roman" w:eastAsia="Times New Roman" w:hAnsi="Times New Roman"/>
+          <w:sz w:val="24"/>
+          <w:szCs w:val="24"/>
+        </w:rPr>
+        <w:t xml:space="preserve">La courbe décompose l'incidence d'ensemble selon le statut du ménage. Les deux groupes reculent, mais l'écart de départ est manifeste et il ne se referme pas.</w:t>
       </w:r>
     </w:p>
     <w:p>
@@ -1659,16 +1659,16 @@
           <w:sz w:val="20"/>
           <w:szCs w:val="20"/>
         </w:rPr>
-        <w:t xml:space="preserve">  ·  Incidence selon le statut</w:t>
-      </w:r>
-      <w:r>
-        <w:rPr>
-          <w:rFonts w:ascii="Times New Roman" w:cs="Times New Roman" w:eastAsia="Times New Roman" w:hAnsi="Times New Roman"/>
-          <w:color w:val="6E747E"/>
-          <w:sz w:val="20"/>
-          <w:szCs w:val="20"/>
-        </w:rPr>
-        <w:t xml:space="preserve">	30 s</w:t>
+        <w:t xml:space="preserve">  ·  Qualité de l'appariement</w:t>
+      </w:r>
+      <w:r>
+        <w:rPr>
+          <w:rFonts w:ascii="Times New Roman" w:cs="Times New Roman" w:eastAsia="Times New Roman" w:hAnsi="Times New Roman"/>
+          <w:color w:val="6E747E"/>
+          <w:sz w:val="20"/>
+          <w:szCs w:val="20"/>
+        </w:rPr>
+        <w:t xml:space="preserve">	1 min</w:t>
       </w:r>
     </w:p>
     <w:p>
@@ -1684,21 +1684,38 @@
           <w:sz w:val="30"/>
           <w:szCs w:val="30"/>
         </w:rPr>
-        <w:t xml:space="preserve">Voici la même incidence, décomposée par statut.</w:t>
-      </w:r>
-    </w:p>
-    <w:p>
-      <w:pPr>
-        <w:spacing w:after="160" w:line="360"/>
-        <w:jc w:val="both"/>
-      </w:pPr>
-      <w:r>
-        <w:rPr>
-          <w:rFonts w:ascii="Times New Roman" w:cs="Times New Roman" w:eastAsia="Times New Roman" w:hAnsi="Times New Roman"/>
-          <w:sz w:val="24"/>
-          <w:szCs w:val="24"/>
-        </w:rPr>
-        <w:t xml:space="preserve">La courbe décompose l'incidence d'ensemble selon le statut du ménage. Les deux groupes reculent, mais l'écart de départ est manifeste et il ne se referme pas.</w:t>
+        <w:t xml:space="preserve">Un mot sur la qualité de l'appariement, dont tout dépend.</w:t>
+      </w:r>
+    </w:p>
+    <w:p>
+      <w:pPr>
+        <w:spacing w:after="160" w:line="360"/>
+        <w:jc w:val="both"/>
+      </w:pPr>
+      <w:r>
+        <w:rPr>
+          <w:rFonts w:ascii="Times New Roman" w:cs="Times New Roman" w:eastAsia="Times New Roman" w:hAnsi="Times New Roman"/>
+          <w:sz w:val="24"/>
+          <w:szCs w:val="24"/>
+        </w:rPr>
+        <w:t xml:space="preserve">Avant de commenter l'effet, un mot sur la qualité de l'appariement, dont dépend la crédibilité de tout ce qui suit. Le logit est estimé sur 17 735 enfants. La différence standardisée moyenne entre traités et témoins passe de 11,4 pour cent avant appariement à 2,4 pour cent après, très en deçà du seuil usuel de 10 pour cent, et le test joint de nullité des covariables n'est plus rejeté. Le panel apparié compte 16 210 observations-enfants sur le support commun.</w:t>
+      </w:r>
+    </w:p>
+    <w:p>
+      <w:pPr>
+        <w:spacing w:after="160"/>
+        <w:ind w:left="340"/>
+      </w:pPr>
+      <w:r>
+        <w:rPr>
+          <w:rFonts w:ascii="Times New Roman" w:cs="Times New Roman" w:eastAsia="Times New Roman" w:hAnsi="Times New Roman"/>
+          <w:i/>
+          <w:iCs/>
+          <w:color w:val="6E747E"/>
+          <w:sz w:val="22"/>
+          <w:szCs w:val="22"/>
+        </w:rPr>
+        <w:t xml:space="preserve">Ne pas s'attarder : le jury retient surtout que l'équilibre est atteint.</w:t>
       </w:r>
     </w:p>
     <w:p>
@@ -1729,16 +1746,16 @@
           <w:sz w:val="20"/>
           <w:szCs w:val="20"/>
         </w:rPr>
-        <w:t xml:space="preserve">  ·  Qualité de l'appariement</w:t>
-      </w:r>
-      <w:r>
-        <w:rPr>
-          <w:rFonts w:ascii="Times New Roman" w:cs="Times New Roman" w:eastAsia="Times New Roman" w:hAnsi="Times New Roman"/>
-          <w:color w:val="6E747E"/>
-          <w:sz w:val="20"/>
-          <w:szCs w:val="20"/>
-        </w:rPr>
-        <w:t xml:space="preserve">	1 min</w:t>
+        <w:t xml:space="preserve">  ·  Le résultat central</w:t>
+      </w:r>
+      <w:r>
+        <w:rPr>
+          <w:rFonts w:ascii="Times New Roman" w:cs="Times New Roman" w:eastAsia="Times New Roman" w:hAnsi="Times New Roman"/>
+          <w:color w:val="6E747E"/>
+          <w:sz w:val="20"/>
+          <w:szCs w:val="20"/>
+        </w:rPr>
+        <w:t xml:space="preserve">	2 min</w:t>
       </w:r>
     </w:p>
     <w:p>
@@ -1754,38 +1771,49 @@
           <w:sz w:val="30"/>
           <w:szCs w:val="30"/>
         </w:rPr>
-        <w:t xml:space="preserve">Un mot sur la qualité de l'appariement, dont tout dépend.</w:t>
-      </w:r>
-    </w:p>
-    <w:p>
-      <w:pPr>
-        <w:spacing w:after="160" w:line="360"/>
-        <w:jc w:val="both"/>
-      </w:pPr>
-      <w:r>
-        <w:rPr>
-          <w:rFonts w:ascii="Times New Roman" w:cs="Times New Roman" w:eastAsia="Times New Roman" w:hAnsi="Times New Roman"/>
-          <w:sz w:val="24"/>
-          <w:szCs w:val="24"/>
-        </w:rPr>
-        <w:t xml:space="preserve">Avant de commenter l'effet, un mot sur la qualité de l'appariement, dont dépend la crédibilité de tout ce qui suit. Le logit est estimé sur 17 735 enfants. La différence standardisée moyenne entre traités et témoins passe de 11,4 pour cent avant appariement à 2,4 pour cent après, très en deçà du seuil usuel de 10 pour cent, et le test joint de nullité des covariables n'est plus rejeté. Le panel apparié compte 16 210 observations-enfants sur le support commun.</w:t>
-      </w:r>
-    </w:p>
-    <w:p>
-      <w:pPr>
-        <w:spacing w:after="160"/>
-        <w:ind w:left="340"/>
-      </w:pPr>
-      <w:r>
-        <w:rPr>
-          <w:rFonts w:ascii="Times New Roman" w:cs="Times New Roman" w:eastAsia="Times New Roman" w:hAnsi="Times New Roman"/>
-          <w:i/>
-          <w:iCs/>
-          <w:color w:val="6E747E"/>
-          <w:sz w:val="22"/>
-          <w:szCs w:val="22"/>
-        </w:rPr>
-        <w:t xml:space="preserve">Ne pas s'attarder : le jury retient surtout que l'équilibre est atteint.</w:t>
+        <w:t xml:space="preserve">J'en viens au résultat central, et je vais l'énoncer sans détour.</w:t>
+      </w:r>
+    </w:p>
+    <w:p>
+      <w:pPr>
+        <w:spacing w:after="160" w:line="360"/>
+        <w:jc w:val="both"/>
+      </w:pPr>
+      <w:r>
+        <w:rPr>
+          <w:rFonts w:ascii="Times New Roman" w:cs="Times New Roman" w:eastAsia="Times New Roman" w:hAnsi="Times New Roman"/>
+          <w:sz w:val="24"/>
+          <w:szCs w:val="24"/>
+        </w:rPr>
+        <w:t xml:space="preserve">J'en viens au résultat central, et je vais l'énoncer sans détour.</w:t>
+      </w:r>
+    </w:p>
+    <w:p>
+      <w:pPr>
+        <w:spacing w:after="160" w:line="360"/>
+        <w:jc w:val="both"/>
+      </w:pPr>
+      <w:r>
+        <w:rPr>
+          <w:rFonts w:ascii="Times New Roman" w:cs="Times New Roman" w:eastAsia="Times New Roman" w:hAnsi="Times New Roman"/>
+          <w:sz w:val="24"/>
+          <w:szCs w:val="24"/>
+        </w:rPr>
+        <w:t xml:space="preserve">Sur la période 2018-2021, la pauvreté multidimensionnelle des enfants des ménages bénéficiaires recule plus lentement que celle des témoins appariés. L'écart est de 6,4 points de pourcentage, significatif au seuil de 5 pour cent. Le résultat ne tient pas au choix de l'algorithme : les trois appariements concordent, de 0,050 à 0,064. La double différence sans appariement, qui ne corrige pas l'avantage initial, donne le même signe atténué, à 0,035.</w:t>
+      </w:r>
+    </w:p>
+    <w:p>
+      <w:pPr>
+        <w:spacing w:after="160" w:line="360"/>
+        <w:jc w:val="both"/>
+      </w:pPr>
+      <w:r>
+        <w:rPr>
+          <w:rFonts w:ascii="Times New Roman" w:cs="Times New Roman" w:eastAsia="Times New Roman" w:hAnsi="Times New Roman"/>
+          <w:sz w:val="24"/>
+          <w:szCs w:val="24"/>
+        </w:rPr>
+        <w:t xml:space="preserve">La première hypothèse n'est donc pas validée. Je précise immédiatement le sens de ce résultat, car il se prête à un contresens : il ne dit pas que les transferts appauvrissent les enfants. Il dit que, sur cet horizon de trois ans, les conditions de vie des enfants bénéficiaires se sont améliorées plus lentement que celles de leurs témoins.</w:t>
       </w:r>
     </w:p>
     <w:p>
@@ -1816,16 +1844,16 @@
           <w:sz w:val="20"/>
           <w:szCs w:val="20"/>
         </w:rPr>
-        <w:t xml:space="preserve">  ·  Le résultat central</w:t>
-      </w:r>
-      <w:r>
-        <w:rPr>
-          <w:rFonts w:ascii="Times New Roman" w:cs="Times New Roman" w:eastAsia="Times New Roman" w:hAnsi="Times New Roman"/>
-          <w:color w:val="6E747E"/>
-          <w:sz w:val="20"/>
-          <w:szCs w:val="20"/>
-        </w:rPr>
-        <w:t xml:space="preserve">	2 min</w:t>
+        <w:t xml:space="preserve">  ·  Effets par dimension</w:t>
+      </w:r>
+      <w:r>
+        <w:rPr>
+          <w:rFonts w:ascii="Times New Roman" w:cs="Times New Roman" w:eastAsia="Times New Roman" w:hAnsi="Times New Roman"/>
+          <w:color w:val="6E747E"/>
+          <w:sz w:val="20"/>
+          <w:szCs w:val="20"/>
+        </w:rPr>
+        <w:t xml:space="preserve">	1 min</w:t>
       </w:r>
     </w:p>
     <w:p>
@@ -1841,49 +1869,35 @@
           <w:sz w:val="30"/>
           <w:szCs w:val="30"/>
         </w:rPr>
-        <w:t xml:space="preserve">J'en viens au résultat central, et je vais l'énoncer sans détour.</w:t>
-      </w:r>
-    </w:p>
-    <w:p>
-      <w:pPr>
-        <w:spacing w:after="160" w:line="360"/>
-        <w:jc w:val="both"/>
-      </w:pPr>
-      <w:r>
-        <w:rPr>
-          <w:rFonts w:ascii="Times New Roman" w:cs="Times New Roman" w:eastAsia="Times New Roman" w:hAnsi="Times New Roman"/>
-          <w:sz w:val="24"/>
-          <w:szCs w:val="24"/>
-        </w:rPr>
-        <w:t xml:space="preserve">J'en viens au résultat central, et je vais l'énoncer sans détour.</w:t>
-      </w:r>
-    </w:p>
-    <w:p>
-      <w:pPr>
-        <w:spacing w:after="160" w:line="360"/>
-        <w:jc w:val="both"/>
-      </w:pPr>
-      <w:r>
-        <w:rPr>
-          <w:rFonts w:ascii="Times New Roman" w:cs="Times New Roman" w:eastAsia="Times New Roman" w:hAnsi="Times New Roman"/>
-          <w:sz w:val="24"/>
-          <w:szCs w:val="24"/>
-        </w:rPr>
-        <w:t xml:space="preserve">Sur la période 2018-2021, la pauvreté multidimensionnelle des enfants des ménages bénéficiaires recule plus lentement que celle des témoins appariés. L'écart est de 6,4 points de pourcentage, significatif au seuil de 5 pour cent. Le résultat ne tient pas au choix de l'algorithme : les trois appariements concordent, de 0,050 à 0,064. La double différence sans appariement, qui ne corrige pas l'avantage initial, donne le même signe atténué, à 0,035.</w:t>
-      </w:r>
-    </w:p>
-    <w:p>
-      <w:pPr>
-        <w:spacing w:after="160" w:line="360"/>
-        <w:jc w:val="both"/>
-      </w:pPr>
-      <w:r>
-        <w:rPr>
-          <w:rFonts w:ascii="Times New Roman" w:cs="Times New Roman" w:eastAsia="Times New Roman" w:hAnsi="Times New Roman"/>
-          <w:sz w:val="24"/>
-          <w:szCs w:val="24"/>
-        </w:rPr>
-        <w:t xml:space="preserve">La première hypothèse n'est donc pas validée. Je précise immédiatement le sens de ce résultat, car il se prête à un contresens : il ne dit pas que les transferts appauvrissent les enfants. Il dit que, sur cet horizon de trois ans, les conditions de vie des enfants bénéficiaires se sont améliorées plus lentement que celles de leurs témoins.</w:t>
+        <w:t xml:space="preserve">Cet effet n'est pas diffus : il se localise.</w:t>
+      </w:r>
+    </w:p>
+    <w:p>
+      <w:pPr>
+        <w:spacing w:after="160" w:line="360"/>
+        <w:jc w:val="both"/>
+      </w:pPr>
+      <w:r>
+        <w:rPr>
+          <w:rFonts w:ascii="Times New Roman" w:cs="Times New Roman" w:eastAsia="Times New Roman" w:hAnsi="Times New Roman"/>
+          <w:sz w:val="24"/>
+          <w:szCs w:val="24"/>
+        </w:rPr>
+        <w:t xml:space="preserve">L'effet n'est pas diffus, il se localise. Sur les sept dimensions, une seule ressort : la nutrition, avec 6,8 points, significative à 10 pour cent, et c'est précisément la dimension qui dépend le plus directement du budget courant du ménage. L'assainissement va dans le même sens, à 4,6 points, sans atteindre la significativité. Les cinq autres dimensions restent comprises entre 0,5 et 2,4 points, toutes non significatives.</w:t>
+      </w:r>
+    </w:p>
+    <w:p>
+      <w:pPr>
+        <w:spacing w:after="160" w:line="360"/>
+        <w:jc w:val="both"/>
+      </w:pPr>
+      <w:r>
+        <w:rPr>
+          <w:rFonts w:ascii="Times New Roman" w:cs="Times New Roman" w:eastAsia="Times New Roman" w:hAnsi="Times New Roman"/>
+          <w:sz w:val="24"/>
+          <w:szCs w:val="24"/>
+        </w:rPr>
+        <w:t xml:space="preserve">Par groupe d'âge, l'effet n'est établi que chez les 0 à 4 ans, à 9,1 points, significatif à 5 pour cent. Effet par âge et effet par dimension se répondent : les besoins des plus jeunes passent d'abord par l'alimentation. En revanche, aucun test d'égalité ne conclut, ni entre milieux, ni selon le genre du chef, ni entre tranches d'âge : les sous-groupes se distinguent par la significativité de leur effet, non par une ampleur supérieure.</w:t>
       </w:r>
     </w:p>
     <w:p>
@@ -1914,7 +1928,7 @@
           <w:sz w:val="20"/>
           <w:szCs w:val="20"/>
         </w:rPr>
-        <w:t xml:space="preserve">  ·  Effets par dimension</w:t>
+        <w:t xml:space="preserve">  ·  Effet selon le montant</w:t>
       </w:r>
       <w:r>
         <w:rPr>
@@ -1939,35 +1953,52 @@
           <w:sz w:val="30"/>
           <w:szCs w:val="30"/>
         </w:rPr>
-        <w:t xml:space="preserve">Cet effet n'est pas diffus : il se localise.</w:t>
-      </w:r>
-    </w:p>
-    <w:p>
-      <w:pPr>
-        <w:spacing w:after="160" w:line="360"/>
-        <w:jc w:val="both"/>
-      </w:pPr>
-      <w:r>
-        <w:rPr>
-          <w:rFonts w:ascii="Times New Roman" w:cs="Times New Roman" w:eastAsia="Times New Roman" w:hAnsi="Times New Roman"/>
-          <w:sz w:val="24"/>
-          <w:szCs w:val="24"/>
-        </w:rPr>
-        <w:t xml:space="preserve">L'effet n'est pas diffus, il se localise. Sur les sept dimensions, une seule ressort : la nutrition, avec 6,8 points, significative à 10 pour cent, et c'est précisément la dimension qui dépend le plus directement du budget courant du ménage. L'assainissement va dans le même sens, à 4,6 points, sans atteindre la significativité. Les cinq autres dimensions restent comprises entre 0,5 et 2,4 points, toutes non significatives.</w:t>
-      </w:r>
-    </w:p>
-    <w:p>
-      <w:pPr>
-        <w:spacing w:after="160" w:line="360"/>
-        <w:jc w:val="both"/>
-      </w:pPr>
-      <w:r>
-        <w:rPr>
-          <w:rFonts w:ascii="Times New Roman" w:cs="Times New Roman" w:eastAsia="Times New Roman" w:hAnsi="Times New Roman"/>
-          <w:sz w:val="24"/>
-          <w:szCs w:val="24"/>
-        </w:rPr>
-        <w:t xml:space="preserve">Par groupe d'âge, l'effet n'est établi que chez les 0 à 4 ans, à 9,1 points, significatif à 5 pour cent. Effet par âge et effet par dimension se répondent : les besoins des plus jeunes passent d'abord par l'alimentation. En revanche, aucun test d'égalité ne conclut, ni entre milieux, ni selon le genre du chef, ni entre tranches d'âge : les sous-groupes se distinguent par la significativité de leur effet, non par une ampleur supérieure.</w:t>
+        <w:t xml:space="preserve">Dernier volet, l'intensité du traitement.</w:t>
+      </w:r>
+    </w:p>
+    <w:p>
+      <w:pPr>
+        <w:spacing w:after="160" w:line="360"/>
+        <w:jc w:val="both"/>
+      </w:pPr>
+      <w:r>
+        <w:rPr>
+          <w:rFonts w:ascii="Times New Roman" w:cs="Times New Roman" w:eastAsia="Times New Roman" w:hAnsi="Times New Roman"/>
+          <w:sz w:val="24"/>
+          <w:szCs w:val="24"/>
+        </w:rPr>
+        <w:t xml:space="preserve">Dernier volet, l'intensité du traitement. L'écart défavorable se concentre sur les plus faibles montants : seuls les deux premiers quintiles sont significatifs, à 12,9 et 9,9 points. Il ne se retrouve pas pour les transferts les plus élevés, le dernier quintile étant même très légèrement négatif. La pente dose-réponse, estimée sur le logarithme du montant, vaut moins 0,025 et est significative à 10 pour cent : plus le montant reçu est élevé, plus l'écart tend à se réduire.</w:t>
+      </w:r>
+    </w:p>
+    <w:p>
+      <w:pPr>
+        <w:spacing w:after="160" w:line="360"/>
+        <w:jc w:val="both"/>
+      </w:pPr>
+      <w:r>
+        <w:rPr>
+          <w:rFonts w:ascii="Times New Roman" w:cs="Times New Roman" w:eastAsia="Times New Roman" w:hAnsi="Times New Roman"/>
+          <w:sz w:val="24"/>
+          <w:szCs w:val="24"/>
+        </w:rPr>
+        <w:t xml:space="preserve">Je dois toutefois nuancer : le profil n'est pas strictement monotone, le quatrième quintile remontant sans être significatif. Et le montant relevant du choix du migrant, ce gradient se lit comme une association conditionnelle, non comme un effet causal du montant.</w:t>
+      </w:r>
+    </w:p>
+    <w:p>
+      <w:pPr>
+        <w:pStyle w:val="Heading1"/>
+        <w:spacing w:after="200" w:before="400"/>
+      </w:pPr>
+      <w:r>
+        <w:rPr>
+          <w:rFonts w:ascii="Times New Roman" w:cs="Times New Roman" w:eastAsia="Times New Roman" w:hAnsi="Times New Roman"/>
+          <w:b/>
+          <w:bCs/>
+          <w:color w:val="0E6E96"/>
+          <w:sz w:val="30"/>
+          <w:szCs w:val="30"/>
+        </w:rPr>
+        <w:t xml:space="preserve">Cinquième temps · Robustesse et discussion</w:t>
       </w:r>
     </w:p>
     <w:p>
@@ -1998,7 +2029,7 @@
           <w:sz w:val="20"/>
           <w:szCs w:val="20"/>
         </w:rPr>
-        <w:t xml:space="preserve">  ·  Effet selon le montant</w:t>
+        <w:t xml:space="preserve">  ·  Tests de robustesse</w:t>
       </w:r>
       <w:r>
         <w:rPr>
@@ -2023,52 +2054,21 @@
           <w:sz w:val="30"/>
           <w:szCs w:val="30"/>
         </w:rPr>
-        <w:t xml:space="preserve">Dernier volet, l'intensité du traitement.</w:t>
-      </w:r>
-    </w:p>
-    <w:p>
-      <w:pPr>
-        <w:spacing w:after="160" w:line="360"/>
-        <w:jc w:val="both"/>
-      </w:pPr>
-      <w:r>
-        <w:rPr>
-          <w:rFonts w:ascii="Times New Roman" w:cs="Times New Roman" w:eastAsia="Times New Roman" w:hAnsi="Times New Roman"/>
-          <w:sz w:val="24"/>
-          <w:szCs w:val="24"/>
-        </w:rPr>
-        <w:t xml:space="preserve">Dernier volet, l'intensité du traitement. L'écart défavorable se concentre sur les plus faibles montants : seuls les deux premiers quintiles sont significatifs, à 12,9 et 9,9 points. Il ne se retrouve pas pour les transferts les plus élevés, le dernier quintile étant même très légèrement négatif. La pente dose-réponse, estimée sur le logarithme du montant, vaut moins 0,025 et est significative à 10 pour cent : plus le montant reçu est élevé, plus l'écart tend à se réduire.</w:t>
-      </w:r>
-    </w:p>
-    <w:p>
-      <w:pPr>
-        <w:spacing w:after="160" w:line="360"/>
-        <w:jc w:val="both"/>
-      </w:pPr>
-      <w:r>
-        <w:rPr>
-          <w:rFonts w:ascii="Times New Roman" w:cs="Times New Roman" w:eastAsia="Times New Roman" w:hAnsi="Times New Roman"/>
-          <w:sz w:val="24"/>
-          <w:szCs w:val="24"/>
-        </w:rPr>
-        <w:t xml:space="preserve">Je dois toutefois nuancer : le profil n'est pas strictement monotone, le quatrième quintile remontant sans être significatif. Et le montant relevant du choix du migrant, ce gradient se lit comme une association conditionnelle, non comme un effet causal du montant.</w:t>
-      </w:r>
-    </w:p>
-    <w:p>
-      <w:pPr>
-        <w:pStyle w:val="Heading1"/>
-        <w:spacing w:after="200" w:before="400"/>
-      </w:pPr>
-      <w:r>
-        <w:rPr>
-          <w:rFonts w:ascii="Times New Roman" w:cs="Times New Roman" w:eastAsia="Times New Roman" w:hAnsi="Times New Roman"/>
-          <w:b/>
-          <w:bCs/>
-          <w:color w:val="0E6E96"/>
-          <w:sz w:val="30"/>
-          <w:szCs w:val="30"/>
-        </w:rPr>
-        <w:t xml:space="preserve">Cinquième temps · Robustesse et discussion</w:t>
+        <w:t xml:space="preserve">Ce résultat a été mis à l'épreuve de trois façons.</w:t>
+      </w:r>
+    </w:p>
+    <w:p>
+      <w:pPr>
+        <w:spacing w:after="160" w:line="360"/>
+        <w:jc w:val="both"/>
+      </w:pPr>
+      <w:r>
+        <w:rPr>
+          <w:rFonts w:ascii="Times New Roman" w:cs="Times New Roman" w:eastAsia="Times New Roman" w:hAnsi="Times New Roman"/>
+          <w:sz w:val="24"/>
+          <w:szCs w:val="24"/>
+        </w:rPr>
+        <w:t xml:space="preserve">Le résultat a été mis à l'épreuve de trois façons. Le choix de la méthode d'appariement, d'abord : les trois algorithmes donnent un effet de 0,050 à 0,064, tous significatifs au moins à 10 pour cent. Le seuil de privation ensuite : testé de une à sept dimensions, l'ampleur suit une courbe en cloche, maximale au seuil retenu et significative seulement pour deux, trois et quatre dimensions. Cela nous apprend quelque chose : l'effet se joue au milieu de la distribution des privations, pas dans son noyau. Enfin, une implémentation indépendante du même estimateur retrouve le résultat.</w:t>
       </w:r>
     </w:p>
     <w:p>
@@ -2099,16 +2099,16 @@
           <w:sz w:val="20"/>
           <w:szCs w:val="20"/>
         </w:rPr>
-        <w:t xml:space="preserve">  ·  Tests de robustesse</w:t>
-      </w:r>
-      <w:r>
-        <w:rPr>
-          <w:rFonts w:ascii="Times New Roman" w:cs="Times New Roman" w:eastAsia="Times New Roman" w:hAnsi="Times New Roman"/>
-          <w:color w:val="6E747E"/>
-          <w:sz w:val="20"/>
-          <w:szCs w:val="20"/>
-        </w:rPr>
-        <w:t xml:space="preserve">	1 min</w:t>
+        <w:t xml:space="preserve">  ·  Sensibilité à la définition du traitement</w:t>
+      </w:r>
+      <w:r>
+        <w:rPr>
+          <w:rFonts w:ascii="Times New Roman" w:cs="Times New Roman" w:eastAsia="Times New Roman" w:hAnsi="Times New Roman"/>
+          <w:color w:val="6E747E"/>
+          <w:sz w:val="20"/>
+          <w:szCs w:val="20"/>
+        </w:rPr>
+        <w:t xml:space="preserve">	45 s</w:t>
       </w:r>
     </w:p>
     <w:p>
@@ -2124,21 +2124,21 @@
           <w:sz w:val="30"/>
           <w:szCs w:val="30"/>
         </w:rPr>
-        <w:t xml:space="preserve">Ce résultat a été mis à l'épreuve de trois façons.</w:t>
-      </w:r>
-    </w:p>
-    <w:p>
-      <w:pPr>
-        <w:spacing w:after="160" w:line="360"/>
-        <w:jc w:val="both"/>
-      </w:pPr>
-      <w:r>
-        <w:rPr>
-          <w:rFonts w:ascii="Times New Roman" w:cs="Times New Roman" w:eastAsia="Times New Roman" w:hAnsi="Times New Roman"/>
-          <w:sz w:val="24"/>
-          <w:szCs w:val="24"/>
-        </w:rPr>
-        <w:t xml:space="preserve">Le résultat a été mis à l'épreuve de trois façons. Le choix de la méthode d'appariement, d'abord : les trois algorithmes donnent un effet de 0,050 à 0,064, tous significatifs au moins à 10 pour cent. Le seuil de privation ensuite : testé de une à sept dimensions, l'ampleur suit une courbe en cloche, maximale au seuil retenu et significative seulement pour deux, trois et quatre dimensions. Cela nous apprend quelque chose : l'effet se joue au milieu de la distribution des privations, pas dans son noyau. Enfin, une implémentation indépendante du même estimateur retrouve le résultat.</w:t>
+        <w:t xml:space="preserve">Un test mérite d'être signalé, car il nuance la portée du résultat.</w:t>
+      </w:r>
+    </w:p>
+    <w:p>
+      <w:pPr>
+        <w:spacing w:after="160" w:line="360"/>
+        <w:jc w:val="both"/>
+      </w:pPr>
+      <w:r>
+        <w:rPr>
+          <w:rFonts w:ascii="Times New Roman" w:cs="Times New Roman" w:eastAsia="Times New Roman" w:hAnsi="Times New Roman"/>
+          <w:sz w:val="24"/>
+          <w:szCs w:val="24"/>
+        </w:rPr>
+        <w:t xml:space="preserve">Un test mérite d'être signalé, car il nuance la portée du résultat. Si l'on restreint les traités aux bénéficiaires des deux vagues, l'effet tombe à 0,022 en double différence et à moins 0,008 avec appariement, tous deux non significatifs. L'exposition de ces ménages, déjà en cours en 2018, relève d'une autre question que celle du design principal. Autrement dit : le signe et l'ordre de grandeur résistent à l'algorithme comme au seuil, mais la définition du traitement les fait disparaître.</w:t>
       </w:r>
     </w:p>
     <w:p>
@@ -2169,16 +2169,16 @@
           <w:sz w:val="20"/>
           <w:szCs w:val="20"/>
         </w:rPr>
-        <w:t xml:space="preserve">  ·  Sensibilité à la définition du traitement</w:t>
-      </w:r>
-      <w:r>
-        <w:rPr>
-          <w:rFonts w:ascii="Times New Roman" w:cs="Times New Roman" w:eastAsia="Times New Roman" w:hAnsi="Times New Roman"/>
-          <w:color w:val="6E747E"/>
-          <w:sz w:val="20"/>
-          <w:szCs w:val="20"/>
-        </w:rPr>
-        <w:t xml:space="preserve">	45 s</w:t>
+        <w:t xml:space="preserve">  ·  Mécanismes d'interprétation</w:t>
+      </w:r>
+      <w:r>
+        <w:rPr>
+          <w:rFonts w:ascii="Times New Roman" w:cs="Times New Roman" w:eastAsia="Times New Roman" w:hAnsi="Times New Roman"/>
+          <w:color w:val="6E747E"/>
+          <w:sz w:val="20"/>
+          <w:szCs w:val="20"/>
+        </w:rPr>
+        <w:t xml:space="preserve">	1 min 30</w:t>
       </w:r>
     </w:p>
     <w:p>
@@ -2194,21 +2194,63 @@
           <w:sz w:val="30"/>
           <w:szCs w:val="30"/>
         </w:rPr>
-        <w:t xml:space="preserve">Un test mérite d'être signalé, car il nuance la portée du résultat.</w:t>
-      </w:r>
-    </w:p>
-    <w:p>
-      <w:pPr>
-        <w:spacing w:after="160" w:line="360"/>
-        <w:jc w:val="both"/>
-      </w:pPr>
-      <w:r>
-        <w:rPr>
-          <w:rFonts w:ascii="Times New Roman" w:cs="Times New Roman" w:eastAsia="Times New Roman" w:hAnsi="Times New Roman"/>
-          <w:sz w:val="24"/>
-          <w:szCs w:val="24"/>
-        </w:rPr>
-        <w:t xml:space="preserve">Un test mérite d'être signalé, car il nuance la portée du résultat. Si l'on restreint les traités aux bénéficiaires des deux vagues, l'effet tombe à 0,022 en double différence et à moins 0,008 avec appariement, tous deux non significatifs. L'exposition de ces ménages, déjà en cours en 2018, relève d'une autre question que celle du design principal. Autrement dit : le signe et l'ordre de grandeur résistent à l'algorithme comme au seuil, mais la définition du traitement les fait disparaître.</w:t>
+        <w:t xml:space="preserve">Comment expliquer qu'une ressource de cette ampleur ne réduise pas les privations ?</w:t>
+      </w:r>
+    </w:p>
+    <w:p>
+      <w:pPr>
+        <w:spacing w:after="160" w:line="360"/>
+        <w:jc w:val="both"/>
+      </w:pPr>
+      <w:r>
+        <w:rPr>
+          <w:rFonts w:ascii="Times New Roman" w:cs="Times New Roman" w:eastAsia="Times New Roman" w:hAnsi="Times New Roman"/>
+          <w:sz w:val="24"/>
+          <w:szCs w:val="24"/>
+        </w:rPr>
+        <w:t xml:space="preserve">Comment expliquer qu'une ressource de cette ampleur ne réduise pas les privations ? Trois mécanismes me paraissent devoir être avancés.</w:t>
+      </w:r>
+    </w:p>
+    <w:p>
+      <w:pPr>
+        <w:spacing w:after="160" w:line="360"/>
+        <w:jc w:val="both"/>
+      </w:pPr>
+      <w:r>
+        <w:rPr>
+          <w:rFonts w:ascii="Times New Roman" w:cs="Times New Roman" w:eastAsia="Times New Roman" w:hAnsi="Times New Roman"/>
+          <w:sz w:val="24"/>
+          <w:szCs w:val="24"/>
+        </w:rPr>
+        <w:t xml:space="preserve">L'usage des fonds, d'abord. 68,5 pour cent des transferts relèvent du soutien courant et moins d'un dixième va explicitement à la santé ou à la scolarité. Un flux qui finance l'ordinaire du ménage a peu de raisons de déplacer les seuils de privation retenus par l'indice.</w:t>
+      </w:r>
+    </w:p>
+    <w:p>
+      <w:pPr>
+        <w:spacing w:after="160" w:line="360"/>
+        <w:jc w:val="both"/>
+      </w:pPr>
+      <w:r>
+        <w:rPr>
+          <w:rFonts w:ascii="Times New Roman" w:cs="Times New Roman" w:eastAsia="Times New Roman" w:hAnsi="Times New Roman"/>
+          <w:sz w:val="24"/>
+          <w:szCs w:val="24"/>
+        </w:rPr>
+        <w:t xml:space="preserve">La contrainte d'offre, ensuite. L'eau, l'assainissement et l'accès aux soins supposent des investissements collectifs que le pouvoir d'achat privé ne remplace pas. Le fait que la privation en santé touche 97 pour cent des enfants aux deux vagues, quasiment sans écart entre bénéficiaires et témoins en 2021, en est l'illustration la plus nette.</w:t>
+      </w:r>
+    </w:p>
+    <w:p>
+      <w:pPr>
+        <w:spacing w:after="160" w:line="360"/>
+        <w:jc w:val="both"/>
+      </w:pPr>
+      <w:r>
+        <w:rPr>
+          <w:rFonts w:ascii="Times New Roman" w:cs="Times New Roman" w:eastAsia="Times New Roman" w:hAnsi="Times New Roman"/>
+          <w:sz w:val="24"/>
+          <w:szCs w:val="24"/>
+        </w:rPr>
+        <w:t xml:space="preserve">La marge sur laquelle l'effet opère, enfin. La sensibilité au seuil montre que l'écart se joue chez les enfants situés au milieu de la distribution. Le noyau des enfants cumulant six ou sept privations relève de déficits structurels qu'aucun flux monétaire privé ne déplace en trois ans.</w:t>
       </w:r>
     </w:p>
     <w:p>
@@ -2239,16 +2281,16 @@
           <w:sz w:val="20"/>
           <w:szCs w:val="20"/>
         </w:rPr>
-        <w:t xml:space="preserve">  ·  Mécanismes d'interprétation</w:t>
-      </w:r>
-      <w:r>
-        <w:rPr>
-          <w:rFonts w:ascii="Times New Roman" w:cs="Times New Roman" w:eastAsia="Times New Roman" w:hAnsi="Times New Roman"/>
-          <w:color w:val="6E747E"/>
-          <w:sz w:val="20"/>
-          <w:szCs w:val="20"/>
-        </w:rPr>
-        <w:t xml:space="preserve">	1 min 30</w:t>
+        <w:t xml:space="preserve">  ·  Validation des hypothèses</w:t>
+      </w:r>
+      <w:r>
+        <w:rPr>
+          <w:rFonts w:ascii="Times New Roman" w:cs="Times New Roman" w:eastAsia="Times New Roman" w:hAnsi="Times New Roman"/>
+          <w:color w:val="6E747E"/>
+          <w:sz w:val="20"/>
+          <w:szCs w:val="20"/>
+        </w:rPr>
+        <w:t xml:space="preserve">	30 s</w:t>
       </w:r>
     </w:p>
     <w:p>
@@ -2264,63 +2306,38 @@
           <w:sz w:val="30"/>
           <w:szCs w:val="30"/>
         </w:rPr>
-        <w:t xml:space="preserve">Comment expliquer qu'une ressource de cette ampleur ne réduise pas les privations ?</w:t>
-      </w:r>
-    </w:p>
-    <w:p>
-      <w:pPr>
-        <w:spacing w:after="160" w:line="360"/>
-        <w:jc w:val="both"/>
-      </w:pPr>
-      <w:r>
-        <w:rPr>
-          <w:rFonts w:ascii="Times New Roman" w:cs="Times New Roman" w:eastAsia="Times New Roman" w:hAnsi="Times New Roman"/>
-          <w:sz w:val="24"/>
-          <w:szCs w:val="24"/>
-        </w:rPr>
-        <w:t xml:space="preserve">Comment expliquer qu'une ressource de cette ampleur ne réduise pas les privations ? Trois mécanismes me paraissent devoir être avancés.</w:t>
-      </w:r>
-    </w:p>
-    <w:p>
-      <w:pPr>
-        <w:spacing w:after="160" w:line="360"/>
-        <w:jc w:val="both"/>
-      </w:pPr>
-      <w:r>
-        <w:rPr>
-          <w:rFonts w:ascii="Times New Roman" w:cs="Times New Roman" w:eastAsia="Times New Roman" w:hAnsi="Times New Roman"/>
-          <w:sz w:val="24"/>
-          <w:szCs w:val="24"/>
-        </w:rPr>
-        <w:t xml:space="preserve">L'usage des fonds, d'abord. 68,5 pour cent des transferts relèvent du soutien courant et moins d'un dixième va explicitement à la santé ou à la scolarité. Un flux qui finance l'ordinaire du ménage a peu de raisons de déplacer les seuils de privation retenus par l'indice.</w:t>
-      </w:r>
-    </w:p>
-    <w:p>
-      <w:pPr>
-        <w:spacing w:after="160" w:line="360"/>
-        <w:jc w:val="both"/>
-      </w:pPr>
-      <w:r>
-        <w:rPr>
-          <w:rFonts w:ascii="Times New Roman" w:cs="Times New Roman" w:eastAsia="Times New Roman" w:hAnsi="Times New Roman"/>
-          <w:sz w:val="24"/>
-          <w:szCs w:val="24"/>
-        </w:rPr>
-        <w:t xml:space="preserve">La contrainte d'offre, ensuite. L'eau, l'assainissement et l'accès aux soins supposent des investissements collectifs que le pouvoir d'achat privé ne remplace pas. Le fait que la privation en santé touche 97 pour cent des enfants aux deux vagues, quasiment sans écart entre bénéficiaires et témoins en 2021, en est l'illustration la plus nette.</w:t>
-      </w:r>
-    </w:p>
-    <w:p>
-      <w:pPr>
-        <w:spacing w:after="160" w:line="360"/>
-        <w:jc w:val="both"/>
-      </w:pPr>
-      <w:r>
-        <w:rPr>
-          <w:rFonts w:ascii="Times New Roman" w:cs="Times New Roman" w:eastAsia="Times New Roman" w:hAnsi="Times New Roman"/>
-          <w:sz w:val="24"/>
-          <w:szCs w:val="24"/>
-        </w:rPr>
-        <w:t xml:space="preserve">La marge sur laquelle l'effet opère, enfin. La sensibilité au seuil montre que l'écart se joue chez les enfants situés au milieu de la distribution. Le noyau des enfants cumulant six ou sept privations relève de déficits structurels qu'aucun flux monétaire privé ne déplace en trois ans.</w:t>
+        <w:t xml:space="preserve">Que deviennent alors mes deux hypothèses ?</w:t>
+      </w:r>
+    </w:p>
+    <w:p>
+      <w:pPr>
+        <w:spacing w:after="160" w:line="360"/>
+        <w:jc w:val="both"/>
+      </w:pPr>
+      <w:r>
+        <w:rPr>
+          <w:rFonts w:ascii="Times New Roman" w:cs="Times New Roman" w:eastAsia="Times New Roman" w:hAnsi="Times New Roman"/>
+          <w:sz w:val="24"/>
+          <w:szCs w:val="24"/>
+        </w:rPr>
+        <w:t xml:space="preserve">Au terme de ce parcours, la première hypothèse n'est pas validée : l'effet est de signe défavorable et aucune réduction n'est observée sur l'horizon. La seconde est partiellement validée : l'effet est bien hétérogène selon les dimensions et selon le montant, mais aucun test d'égalité ne conclut par milieu, genre du chef ou tranche d'âge.</w:t>
+      </w:r>
+    </w:p>
+    <w:p>
+      <w:pPr>
+        <w:pStyle w:val="Heading1"/>
+        <w:spacing w:after="200" w:before="400"/>
+      </w:pPr>
+      <w:r>
+        <w:rPr>
+          <w:rFonts w:ascii="Times New Roman" w:cs="Times New Roman" w:eastAsia="Times New Roman" w:hAnsi="Times New Roman"/>
+          <w:b/>
+          <w:bCs/>
+          <w:color w:val="0E6E96"/>
+          <w:sz w:val="30"/>
+          <w:szCs w:val="30"/>
+        </w:rPr>
+        <w:t xml:space="preserve">Sixième temps · Conclusion et recommandations</w:t>
       </w:r>
     </w:p>
     <w:p>
@@ -2351,16 +2368,16 @@
           <w:sz w:val="20"/>
           <w:szCs w:val="20"/>
         </w:rPr>
-        <w:t xml:space="preserve">  ·  Validation des hypothèses</w:t>
-      </w:r>
-      <w:r>
-        <w:rPr>
-          <w:rFonts w:ascii="Times New Roman" w:cs="Times New Roman" w:eastAsia="Times New Roman" w:hAnsi="Times New Roman"/>
-          <w:color w:val="6E747E"/>
-          <w:sz w:val="20"/>
-          <w:szCs w:val="20"/>
-        </w:rPr>
-        <w:t xml:space="preserve">	30 s</w:t>
+        <w:t xml:space="preserve">  ·  Conclusion générale</w:t>
+      </w:r>
+      <w:r>
+        <w:rPr>
+          <w:rFonts w:ascii="Times New Roman" w:cs="Times New Roman" w:eastAsia="Times New Roman" w:hAnsi="Times New Roman"/>
+          <w:color w:val="6E747E"/>
+          <w:sz w:val="20"/>
+          <w:szCs w:val="20"/>
+        </w:rPr>
+        <w:t xml:space="preserve">	1 min</w:t>
       </w:r>
     </w:p>
     <w:p>
@@ -2376,38 +2393,21 @@
           <w:sz w:val="30"/>
           <w:szCs w:val="30"/>
         </w:rPr>
-        <w:t xml:space="preserve">Que deviennent alors mes deux hypothèses ?</w:t>
-      </w:r>
-    </w:p>
-    <w:p>
-      <w:pPr>
-        <w:spacing w:after="160" w:line="360"/>
-        <w:jc w:val="both"/>
-      </w:pPr>
-      <w:r>
-        <w:rPr>
-          <w:rFonts w:ascii="Times New Roman" w:cs="Times New Roman" w:eastAsia="Times New Roman" w:hAnsi="Times New Roman"/>
-          <w:sz w:val="24"/>
-          <w:szCs w:val="24"/>
-        </w:rPr>
-        <w:t xml:space="preserve">Au terme de ce parcours, la première hypothèse n'est pas validée : l'effet est de signe défavorable et aucune réduction n'est observée sur l'horizon. La seconde est partiellement validée : l'effet est bien hétérogène selon les dimensions et selon le montant, mais aucun test d'égalité ne conclut par milieu, genre du chef ou tranche d'âge.</w:t>
-      </w:r>
-    </w:p>
-    <w:p>
-      <w:pPr>
-        <w:pStyle w:val="Heading1"/>
-        <w:spacing w:after="200" w:before="400"/>
-      </w:pPr>
-      <w:r>
-        <w:rPr>
-          <w:rFonts w:ascii="Times New Roman" w:cs="Times New Roman" w:eastAsia="Times New Roman" w:hAnsi="Times New Roman"/>
-          <w:b/>
-          <w:bCs/>
-          <w:color w:val="0E6E96"/>
-          <w:sz w:val="30"/>
-          <w:szCs w:val="30"/>
-        </w:rPr>
-        <w:t xml:space="preserve">Sixième temps · Conclusion et recommandations</w:t>
+        <w:t xml:space="preserve">Quatre apports se dégagent de ce travail.</w:t>
+      </w:r>
+    </w:p>
+    <w:p>
+      <w:pPr>
+        <w:spacing w:after="160" w:line="360"/>
+        <w:jc w:val="both"/>
+      </w:pPr>
+      <w:r>
+        <w:rPr>
+          <w:rFonts w:ascii="Times New Roman" w:cs="Times New Roman" w:eastAsia="Times New Roman" w:hAnsi="Times New Roman"/>
+          <w:sz w:val="24"/>
+          <w:szCs w:val="24"/>
+        </w:rPr>
+        <w:t xml:space="preserve">Quatre apports se dégagent. Une mesure de la pauvreté multidimensionnelle des enfants sur deux vagues de l'EHCVM, selon l'approche MODA. Le constat d'un recul réel de l'incidence, de 63,5 à 57,8 pour cent, sur fond d'une pauvreté qui reste massive. Le résultat central, à savoir que les transferts ne réduisent pas, à trois ans, la pauvreté multidimensionnelle des enfants. Et sa localisation précise : la nutrition, les 0 à 4 ans et les plus faibles montants reçus.</w:t>
       </w:r>
     </w:p>
     <w:p>
@@ -2438,16 +2438,16 @@
           <w:sz w:val="20"/>
           <w:szCs w:val="20"/>
         </w:rPr>
-        <w:t xml:space="preserve">  ·  Conclusion générale</w:t>
-      </w:r>
-      <w:r>
-        <w:rPr>
-          <w:rFonts w:ascii="Times New Roman" w:cs="Times New Roman" w:eastAsia="Times New Roman" w:hAnsi="Times New Roman"/>
-          <w:color w:val="6E747E"/>
-          <w:sz w:val="20"/>
-          <w:szCs w:val="20"/>
-        </w:rPr>
-        <w:t xml:space="preserve">	1 min</w:t>
+        <w:t xml:space="preserve">  ·  Recommandations</w:t>
+      </w:r>
+      <w:r>
+        <w:rPr>
+          <w:rFonts w:ascii="Times New Roman" w:cs="Times New Roman" w:eastAsia="Times New Roman" w:hAnsi="Times New Roman"/>
+          <w:color w:val="6E747E"/>
+          <w:sz w:val="20"/>
+          <w:szCs w:val="20"/>
+        </w:rPr>
+        <w:t xml:space="preserve">	1 min 30</w:t>
       </w:r>
     </w:p>
     <w:p>
@@ -2463,21 +2463,49 @@
           <w:sz w:val="30"/>
           <w:szCs w:val="30"/>
         </w:rPr>
-        <w:t xml:space="preserve">Quatre apports se dégagent de ce travail.</w:t>
-      </w:r>
-    </w:p>
-    <w:p>
-      <w:pPr>
-        <w:spacing w:after="160" w:line="360"/>
-        <w:jc w:val="both"/>
-      </w:pPr>
-      <w:r>
-        <w:rPr>
-          <w:rFonts w:ascii="Times New Roman" w:cs="Times New Roman" w:eastAsia="Times New Roman" w:hAnsi="Times New Roman"/>
-          <w:sz w:val="24"/>
-          <w:szCs w:val="24"/>
-        </w:rPr>
-        <w:t xml:space="preserve">Quatre apports se dégagent. Une mesure de la pauvreté multidimensionnelle des enfants sur deux vagues de l'EHCVM, selon l'approche MODA. Le constat d'un recul réel de l'incidence, de 63,5 à 57,8 pour cent, sur fond d'une pauvreté qui reste massive. Le résultat central, à savoir que les transferts ne réduisent pas, à trois ans, la pauvreté multidimensionnelle des enfants. Et sa localisation précise : la nutrition, les 0 à 4 ans et les plus faibles montants reçus.</w:t>
+        <w:t xml:space="preserve">Les recommandations suivent l'ordre de ces faits.</w:t>
+      </w:r>
+    </w:p>
+    <w:p>
+      <w:pPr>
+        <w:spacing w:after="160" w:line="360"/>
+        <w:jc w:val="both"/>
+      </w:pPr>
+      <w:r>
+        <w:rPr>
+          <w:rFonts w:ascii="Times New Roman" w:cs="Times New Roman" w:eastAsia="Times New Roman" w:hAnsi="Times New Roman"/>
+          <w:sz w:val="24"/>
+          <w:szCs w:val="24"/>
+        </w:rPr>
+        <w:t xml:space="preserve">Les recommandations suivent l'ordre de ces faits.</w:t>
+      </w:r>
+    </w:p>
+    <w:p>
+      <w:pPr>
+        <w:spacing w:after="160" w:line="360"/>
+        <w:jc w:val="both"/>
+      </w:pPr>
+      <w:r>
+        <w:rPr>
+          <w:rFonts w:ascii="Times New Roman" w:cs="Times New Roman" w:eastAsia="Times New Roman" w:hAnsi="Times New Roman"/>
+          <w:sz w:val="24"/>
+          <w:szCs w:val="24"/>
+        </w:rPr>
+        <w:t xml:space="preserve">Là où l'écart se concentre, d'abord : donner la priorité à la sécurité alimentaire des enfants dans les zones d'émigration, cibler les enfants de 0 à 4 ans des ménages bénéficiaires, et accompagner en priorité les ménages qui reçoivent les plus faibles montants. J'insiste sur un point : recevoir des transferts ne doit pas valoir exclusion des filets sociaux, puisque c'est précisément chez ces ménages que la trajectoire est la moins favorable.</w:t>
+      </w:r>
+    </w:p>
+    <w:p>
+      <w:pPr>
+        <w:spacing w:after="160" w:line="360"/>
+        <w:jc w:val="both"/>
+      </w:pPr>
+      <w:r>
+        <w:rPr>
+          <w:rFonts w:ascii="Times New Roman" w:cs="Times New Roman" w:eastAsia="Times New Roman" w:hAnsi="Times New Roman"/>
+          <w:sz w:val="24"/>
+          <w:szCs w:val="24"/>
+        </w:rPr>
+        <w:t xml:space="preserve">Sur les conditions de conversion des transferts, ensuite : réduire les coûts de transaction des envois formels, compléter les transferts par l'offre publique de services de base, et renforcer le suivi statistique des transferts. Le message est simple : le transfert privé ne remplace pas l'investissement collectif, il le suppose.</w:t>
       </w:r>
     </w:p>
     <w:p>
@@ -2508,16 +2536,16 @@
           <w:sz w:val="20"/>
           <w:szCs w:val="20"/>
         </w:rPr>
-        <w:t xml:space="preserve">  ·  Recommandations</w:t>
-      </w:r>
-      <w:r>
-        <w:rPr>
-          <w:rFonts w:ascii="Times New Roman" w:cs="Times New Roman" w:eastAsia="Times New Roman" w:hAnsi="Times New Roman"/>
-          <w:color w:val="6E747E"/>
-          <w:sz w:val="20"/>
-          <w:szCs w:val="20"/>
-        </w:rPr>
-        <w:t xml:space="preserve">	1 min 30</w:t>
+        <w:t xml:space="preserve">  ·  Limites de l'étude</w:t>
+      </w:r>
+      <w:r>
+        <w:rPr>
+          <w:rFonts w:ascii="Times New Roman" w:cs="Times New Roman" w:eastAsia="Times New Roman" w:hAnsi="Times New Roman"/>
+          <w:color w:val="6E747E"/>
+          <w:sz w:val="20"/>
+          <w:szCs w:val="20"/>
+        </w:rPr>
+        <w:t xml:space="preserve">	1 min</w:t>
       </w:r>
     </w:p>
     <w:p>
@@ -2533,49 +2561,21 @@
           <w:sz w:val="30"/>
           <w:szCs w:val="30"/>
         </w:rPr>
-        <w:t xml:space="preserve">Les recommandations suivent l'ordre de ces faits.</w:t>
-      </w:r>
-    </w:p>
-    <w:p>
-      <w:pPr>
-        <w:spacing w:after="160" w:line="360"/>
-        <w:jc w:val="both"/>
-      </w:pPr>
-      <w:r>
-        <w:rPr>
-          <w:rFonts w:ascii="Times New Roman" w:cs="Times New Roman" w:eastAsia="Times New Roman" w:hAnsi="Times New Roman"/>
-          <w:sz w:val="24"/>
-          <w:szCs w:val="24"/>
-        </w:rPr>
-        <w:t xml:space="preserve">Les recommandations suivent l'ordre de ces faits.</w:t>
-      </w:r>
-    </w:p>
-    <w:p>
-      <w:pPr>
-        <w:spacing w:after="160" w:line="360"/>
-        <w:jc w:val="both"/>
-      </w:pPr>
-      <w:r>
-        <w:rPr>
-          <w:rFonts w:ascii="Times New Roman" w:cs="Times New Roman" w:eastAsia="Times New Roman" w:hAnsi="Times New Roman"/>
-          <w:sz w:val="24"/>
-          <w:szCs w:val="24"/>
-        </w:rPr>
-        <w:t xml:space="preserve">Là où l'écart se concentre, d'abord : donner la priorité à la sécurité alimentaire des enfants dans les zones d'émigration, cibler les enfants de 0 à 4 ans des ménages bénéficiaires, et accompagner en priorité les ménages qui reçoivent les plus faibles montants. J'insiste sur un point : recevoir des transferts ne doit pas valoir exclusion des filets sociaux, puisque c'est précisément chez ces ménages que la trajectoire est la moins favorable.</w:t>
-      </w:r>
-    </w:p>
-    <w:p>
-      <w:pPr>
-        <w:spacing w:after="160" w:line="360"/>
-        <w:jc w:val="both"/>
-      </w:pPr>
-      <w:r>
-        <w:rPr>
-          <w:rFonts w:ascii="Times New Roman" w:cs="Times New Roman" w:eastAsia="Times New Roman" w:hAnsi="Times New Roman"/>
-          <w:sz w:val="24"/>
-          <w:szCs w:val="24"/>
-        </w:rPr>
-        <w:t xml:space="preserve">Sur les conditions de conversion des transferts, ensuite : réduire les coûts de transaction des envois formels, compléter les transferts par l'offre publique de services de base, et renforcer le suivi statistique des transferts. Le message est simple : le transfert privé ne remplace pas l'investissement collectif, il le suppose.</w:t>
+        <w:t xml:space="preserve">Ce travail a ses limites, et je préfère les énoncer moi-même.</w:t>
+      </w:r>
+    </w:p>
+    <w:p>
+      <w:pPr>
+        <w:spacing w:after="160" w:line="360"/>
+        <w:jc w:val="both"/>
+      </w:pPr>
+      <w:r>
+        <w:rPr>
+          <w:rFonts w:ascii="Times New Roman" w:cs="Times New Roman" w:eastAsia="Times New Roman" w:hAnsi="Times New Roman"/>
+          <w:sz w:val="24"/>
+          <w:szCs w:val="24"/>
+        </w:rPr>
+        <w:t xml:space="preserve">Ce travail a ses limites, et je préfère les énoncer moi-même. L'hypothèse de tendances parallèles n'est pas testable directement, deux vagues seulement étant disponibles ; l'appariement sur les niveaux initiaux la rend plus crédible sans la démontrer. Les enfants vieillissent entre les deux enquêtes et sont évalués sur la grille de leur âge courant ; le fait de figer les groupes d'âge à la période de base neutralise l'essentiel de cet effet. Enfin, la nutrition et la santé reposent sur les seuls indicateurs strictement comparables entre les deux vagues, car un indicateur redéfini entre 2018 et 2021 produirait un effet mesuré sans contenu causal.</w:t>
       </w:r>
     </w:p>
     <w:p>
@@ -2598,76 +2598,6 @@
           <w:szCs w:val="20"/>
         </w:rPr>
         <w:t xml:space="preserve">Diapositive 28</w:t>
-      </w:r>
-      <w:r>
-        <w:rPr>
-          <w:rFonts w:ascii="Times New Roman" w:cs="Times New Roman" w:eastAsia="Times New Roman" w:hAnsi="Times New Roman"/>
-          <w:color w:val="6E747E"/>
-          <w:sz w:val="20"/>
-          <w:szCs w:val="20"/>
-        </w:rPr>
-        <w:t xml:space="preserve">  ·  Limites de l'étude</w:t>
-      </w:r>
-      <w:r>
-        <w:rPr>
-          <w:rFonts w:ascii="Times New Roman" w:cs="Times New Roman" w:eastAsia="Times New Roman" w:hAnsi="Times New Roman"/>
-          <w:color w:val="6E747E"/>
-          <w:sz w:val="20"/>
-          <w:szCs w:val="20"/>
-        </w:rPr>
-        <w:t xml:space="preserve">	1 min</w:t>
-      </w:r>
-    </w:p>
-    <w:p>
-      <w:pPr>
-        <w:spacing w:after="200" w:before="60"/>
-      </w:pPr>
-      <w:r>
-        <w:rPr>
-          <w:rFonts w:ascii="Times New Roman" w:cs="Times New Roman" w:eastAsia="Times New Roman" w:hAnsi="Times New Roman"/>
-          <w:b/>
-          <w:bCs/>
-          <w:color w:val="0E6E96"/>
-          <w:sz w:val="30"/>
-          <w:szCs w:val="30"/>
-        </w:rPr>
-        <w:t xml:space="preserve">Ce travail a ses limites, et je préfère les énoncer moi-même.</w:t>
-      </w:r>
-    </w:p>
-    <w:p>
-      <w:pPr>
-        <w:spacing w:after="160" w:line="360"/>
-        <w:jc w:val="both"/>
-      </w:pPr>
-      <w:r>
-        <w:rPr>
-          <w:rFonts w:ascii="Times New Roman" w:cs="Times New Roman" w:eastAsia="Times New Roman" w:hAnsi="Times New Roman"/>
-          <w:sz w:val="24"/>
-          <w:szCs w:val="24"/>
-        </w:rPr>
-        <w:t xml:space="preserve">Ce travail a ses limites, et je préfère les énoncer moi-même. L'hypothèse de tendances parallèles n'est pas testable directement, deux vagues seulement étant disponibles ; l'appariement sur les niveaux initiaux la rend plus crédible sans la démontrer. Les enfants vieillissent entre les deux enquêtes et sont évalués sur la grille de leur âge courant ; le fait de figer les groupes d'âge à la période de base neutralise l'essentiel de cet effet. Enfin, la nutrition et la santé reposent sur les seuls indicateurs strictement comparables entre les deux vagues, car un indicateur redéfini entre 2018 et 2021 produirait un effet mesuré sans contenu causal.</w:t>
-      </w:r>
-    </w:p>
-    <w:p>
-      <w:pPr>
-        <w:pBdr>
-          <w:bottom w:val="single" w:color="1CABE2" w:sz="6"/>
-        </w:pBdr>
-        <w:tabs>
-          <w:tab w:val="right" w:pos="9026"/>
-        </w:tabs>
-        <w:spacing w:after="120" w:before="320"/>
-      </w:pPr>
-      <w:r>
-        <w:rPr>
-          <w:rFonts w:ascii="Times New Roman" w:cs="Times New Roman" w:eastAsia="Times New Roman" w:hAnsi="Times New Roman"/>
-          <w:b/>
-          <w:bCs/>
-          <w:color w:val="0E6E96"/>
-          <w:sz w:val="20"/>
-          <w:szCs w:val="20"/>
-        </w:rPr>
-        <w:t xml:space="preserve">Diapositive 29</w:t>
       </w:r>
       <w:r>
         <w:rPr>

</xml_diff>

<commit_message>
Remplacer le terme panel par la notion de suivi
Les quatre occurrences du diaporama et celle du discours cedent la
place a des formulations en termes de suivi : menages suivis, donnees
de suivi, echantillon apparie.

Co-Authored-By: Claude <noreply@anthropic.com>
Claude-Session: https://claude.ai/code/session_01837AJxDdpW6rUH9DV9QD1H
</commit_message>
<xml_diff>
--- a/Presentation/discours/discours_soutenance.docx
+++ b/Presentation/discours/discours_soutenance.docx
@@ -891,7 +891,7 @@
           <w:sz w:val="24"/>
           <w:szCs w:val="24"/>
         </w:rPr>
-        <w:t xml:space="preserve">Le troisième enseignement est une lacune. Les travaux existants raisonnent le plus souvent au niveau du ménage et sur des indicateurs monétaires. Aucune étude recensée ne combine, en Afrique de l'Ouest, une mesure multidimensionnelle de la pauvreté infantile et une identification sur données de panel. C'est précisément l'espace que ce mémoire occupe.</w:t>
+        <w:t xml:space="preserve">Le troisième enseignement est une lacune. Les travaux existants raisonnent le plus souvent au niveau du ménage et sur des indicateurs monétaires. Aucune étude recensée ne combine, en Afrique de l'Ouest, une mesure multidimensionnelle de la pauvreté infantile et une identification sur données de suivi. C'est précisément l'espace que ce mémoire occupe.</w:t>
       </w:r>
     </w:p>
     <w:p>
@@ -978,7 +978,7 @@
           <w:sz w:val="24"/>
           <w:szCs w:val="24"/>
         </w:rPr>
-        <w:t xml:space="preserve">Le travail repose sur les deux vagues de l'Enquête harmonisée sur les conditions de vie des ménages : la première de 2018-2019, la seconde de 2021-2022. Leur appariement donne un panel de 6 127 ménages suivis d'une vague à l'autre.</w:t>
+        <w:t xml:space="preserve">Le travail repose sur les deux vagues de l'Enquête harmonisée sur les conditions de vie des ménages : la première de 2018-2019, la seconde de 2021-2022. Leur appariement permet de suivre 6 127 ménages d'une vague à l'autre.</w:t>
       </w:r>
     </w:p>
     <w:p>
@@ -1698,7 +1698,7 @@
           <w:sz w:val="24"/>
           <w:szCs w:val="24"/>
         </w:rPr>
-        <w:t xml:space="preserve">Avant de commenter l'effet, un mot sur la qualité de l'appariement, dont dépend la crédibilité de tout ce qui suit. Le logit est estimé sur 17 735 enfants. La différence standardisée moyenne entre traités et témoins passe de 11,4 pour cent avant appariement à 2,4 pour cent après, très en deçà du seuil usuel de 10 pour cent, et le test joint de nullité des covariables n'est plus rejeté. Le panel apparié compte 16 210 observations-enfants sur le support commun.</w:t>
+        <w:t xml:space="preserve">Avant de commenter l'effet, un mot sur la qualité de l'appariement, dont dépend la crédibilité de tout ce qui suit. Le logit est estimé sur 17 735 enfants. La différence standardisée moyenne entre traités et témoins passe de 11,4 pour cent avant appariement à 2,4 pour cent après, très en deçà du seuil usuel de 10 pour cent, et le test joint de nullité des covariables n'est plus rejeté. L'échantillon apparié compte 16 210 observations-enfants sur le support commun.</w:t>
       </w:r>
     </w:p>
     <w:p>

</xml_diff>

<commit_message>
Remplacer le terme panel par la notion de suivi (#761)
Les quatre occurrences du diaporama et celle du discours cedent la
place a des formulations en termes de suivi : menages suivis, donnees
de suivi, echantillon apparie.


Claude-Session: https://claude.ai/code/session_01837AJxDdpW6rUH9DV9QD1H

Co-authored-by: Claude <noreply@anthropic.com>
</commit_message>
<xml_diff>
--- a/Presentation/discours/discours_soutenance.docx
+++ b/Presentation/discours/discours_soutenance.docx
@@ -891,7 +891,7 @@
           <w:sz w:val="24"/>
           <w:szCs w:val="24"/>
         </w:rPr>
-        <w:t xml:space="preserve">Le troisième enseignement est une lacune. Les travaux existants raisonnent le plus souvent au niveau du ménage et sur des indicateurs monétaires. Aucune étude recensée ne combine, en Afrique de l'Ouest, une mesure multidimensionnelle de la pauvreté infantile et une identification sur données de panel. C'est précisément l'espace que ce mémoire occupe.</w:t>
+        <w:t xml:space="preserve">Le troisième enseignement est une lacune. Les travaux existants raisonnent le plus souvent au niveau du ménage et sur des indicateurs monétaires. Aucune étude recensée ne combine, en Afrique de l'Ouest, une mesure multidimensionnelle de la pauvreté infantile et une identification sur données de suivi. C'est précisément l'espace que ce mémoire occupe.</w:t>
       </w:r>
     </w:p>
     <w:p>
@@ -978,7 +978,7 @@
           <w:sz w:val="24"/>
           <w:szCs w:val="24"/>
         </w:rPr>
-        <w:t xml:space="preserve">Le travail repose sur les deux vagues de l'Enquête harmonisée sur les conditions de vie des ménages : la première de 2018-2019, la seconde de 2021-2022. Leur appariement donne un panel de 6 127 ménages suivis d'une vague à l'autre.</w:t>
+        <w:t xml:space="preserve">Le travail repose sur les deux vagues de l'Enquête harmonisée sur les conditions de vie des ménages : la première de 2018-2019, la seconde de 2021-2022. Leur appariement permet de suivre 6 127 ménages d'une vague à l'autre.</w:t>
       </w:r>
     </w:p>
     <w:p>
@@ -1698,7 +1698,7 @@
           <w:sz w:val="24"/>
           <w:szCs w:val="24"/>
         </w:rPr>
-        <w:t xml:space="preserve">Avant de commenter l'effet, un mot sur la qualité de l'appariement, dont dépend la crédibilité de tout ce qui suit. Le logit est estimé sur 17 735 enfants. La différence standardisée moyenne entre traités et témoins passe de 11,4 pour cent avant appariement à 2,4 pour cent après, très en deçà du seuil usuel de 10 pour cent, et le test joint de nullité des covariables n'est plus rejeté. Le panel apparié compte 16 210 observations-enfants sur le support commun.</w:t>
+        <w:t xml:space="preserve">Avant de commenter l'effet, un mot sur la qualité de l'appariement, dont dépend la crédibilité de tout ce qui suit. Le logit est estimé sur 17 735 enfants. La différence standardisée moyenne entre traités et témoins passe de 11,4 pour cent avant appariement à 2,4 pour cent après, très en deçà du seuil usuel de 10 pour cent, et le test joint de nullité des covariables n'est plus rejeté. L'échantillon apparié compte 16 210 observations-enfants sur le support commun.</w:t>
       </w:r>
     </w:p>
     <w:p>

</xml_diff>

<commit_message>
Supprimer les redondances du discours et du diaporama
Discours : dix-huit paragraphes reprenaient mot pour mot la phrase
d'attaque qui les precede. Quatre sont supprimes, les autres commencent
desormais ou l'attaque s'arrete.

Diaporama : le bloc de lecture du resultat central annoncait les trois
diapositives suivantes, il est retire ; le renvoi a H1 faisait double
emploi avec la diapositive de validation ; la stabilite selon le genre
du chef etait deja lisible dans le tableau qui la surmonte.

Co-Authored-By: Claude <noreply@anthropic.com>
Claude-Session: https://claude.ai/code/session_01837AJxDdpW6rUH9DV9QD1H
</commit_message>
<xml_diff>
--- a/Presentation/discours/discours_soutenance.docx
+++ b/Presentation/discours/discours_soutenance.docx
@@ -190,20 +190,6 @@
           <w:sz w:val="24"/>
           <w:szCs w:val="24"/>
         </w:rPr>
-        <w:t xml:space="preserve">Monsieur le Président du jury, Madame et Messieurs les membres du jury, Monsieur le Directeur de mémoire, mesdames et messieurs, bonjour.</w:t>
-      </w:r>
-    </w:p>
-    <w:p>
-      <w:pPr>
-        <w:spacing w:after="160" w:line="360"/>
-        <w:jc w:val="both"/>
-      </w:pPr>
-      <w:r>
-        <w:rPr>
-          <w:rFonts w:ascii="Times New Roman" w:cs="Times New Roman" w:eastAsia="Times New Roman" w:hAnsi="Times New Roman"/>
-          <w:sz w:val="24"/>
-          <w:szCs w:val="24"/>
-        </w:rPr>
         <w:t xml:space="preserve">Je vous remercie de votre présence. Je vais vous présenter les résultats de mon mémoire de fin d'études, consacré à l'impact des transferts de migrants sur la pauvreté multidimensionnelle des enfants au Sénégal. Ce travail a été mené sous la direction de Monsieur Mamadou Abdoulaye Diallo, que je remercie pour son accompagnement.</w:t>
       </w:r>
     </w:p>
@@ -291,7 +277,7 @@
           <w:sz w:val="24"/>
           <w:szCs w:val="24"/>
         </w:rPr>
-        <w:t xml:space="preserve">Mon exposé suivra six temps. Je poserai d'abord le contexte et la question de recherche. Je situerai ensuite le travail dans la littérature. Je présenterai le cadre méthodologique, c'est-à-dire les données, la mesure de la pauvreté et la stratégie d'identification. Viendront alors les résultats, puis leur mise à l'épreuve et leur interprétation. Je terminerai par la conclusion et les recommandations.</w:t>
+        <w:t xml:space="preserve">Je poserai d'abord le contexte et la question de recherche. Je situerai ensuite le travail dans la littérature. Je présenterai le cadre méthodologique, c'est-à-dire les données, la mesure de la pauvreté et la stratégie d'identification. Viendront alors les résultats, puis leur mise à l'épreuve et leur interprétation. Je terminerai par la conclusion et les recommandations.</w:t>
       </w:r>
     </w:p>
     <w:p>
@@ -378,20 +364,6 @@
           <w:sz w:val="24"/>
           <w:szCs w:val="24"/>
         </w:rPr>
-        <w:t xml:space="preserve">Deux réalités coexistent au Sénégal, et c'est de leur rencontre que naît ce travail.</w:t>
-      </w:r>
-    </w:p>
-    <w:p>
-      <w:pPr>
-        <w:spacing w:after="160" w:line="360"/>
-        <w:jc w:val="both"/>
-      </w:pPr>
-      <w:r>
-        <w:rPr>
-          <w:rFonts w:ascii="Times New Roman" w:cs="Times New Roman" w:eastAsia="Times New Roman" w:hAnsi="Times New Roman"/>
-          <w:sz w:val="24"/>
-          <w:szCs w:val="24"/>
-        </w:rPr>
         <w:t xml:space="preserve">La première est financière. Les transferts reçus de la diaspora sont passés de 233 millions de dollars en 2000 à 2 220 millions en 2017, soit de 166 à 1 242 milliards de francs CFA. Ils représentent 12,1 pour cent du produit intérieur brut, ce qui place le Sénégal au quatrième rang des récepteurs d'Afrique subsaharienne. Rapportés au ménage, les montants reçus avoisinent le seuil de pauvreté monétaire annuel par tête : il ne s'agit donc pas d'un appoint marginal, mais d'une ressource qui peut, en théorie, changer les conditions de vie.</w:t>
       </w:r>
     </w:p>
@@ -493,7 +465,7 @@
           <w:sz w:val="24"/>
           <w:szCs w:val="24"/>
         </w:rPr>
-        <w:t xml:space="preserve">D'où la question qui structure ce mémoire : dans quelle mesure les transferts de migrants réduisent-ils la pauvreté multidimensionnelle des enfants au Sénégal ?</w:t>
+        <w:t xml:space="preserve">Dans quelle mesure les transferts de migrants réduisent-ils la pauvreté multidimensionnelle des enfants au Sénégal ?</w:t>
       </w:r>
     </w:p>
     <w:p>
@@ -678,7 +650,7 @@
           <w:sz w:val="24"/>
           <w:szCs w:val="24"/>
         </w:rPr>
-        <w:t xml:space="preserve">Un mot d'abord sur la migration elle-même, car la décision de migrer et celle d'envoyer des fonds sont indissociables. La théorie néoclassique explique la migration par un calcul d'investissement : l'individu migre si la valeur actualisée des gains attendus à destination, nette des coûts du déplacement, excède ses gains d'origine, la décision se fondant sur le revenu espéré plutôt qu'effectif. Les envois de fonds sont alors le rendement de cet investissement migratoire.</w:t>
+        <w:t xml:space="preserve">La décision de migrer et celle d'envoyer des fonds sont indissociables. La théorie néoclassique explique la migration par un calcul d'investissement : l'individu migre si la valeur actualisée des gains attendus à destination, nette des coûts du déplacement, excède ses gains d'origine, la décision se fondant sur le revenu espéré plutôt qu'effectif. Les envois de fonds sont alors le rendement de cet investissement migratoire.</w:t>
       </w:r>
     </w:p>
     <w:p>
@@ -1261,7 +1233,7 @@
           <w:sz w:val="24"/>
           <w:szCs w:val="24"/>
         </w:rPr>
-        <w:t xml:space="preserve">Première brique, l'appariement par score de propension. Un modèle logit estime, pour chaque enfant, la probabilité de vivre dans un ménage bénéficiaire, à partir des caractéristiques du chef de ménage, de la taille du ménage, de la dépense par tête, du milieu et de la région, ainsi que du genre et de l'âge de l'enfant. Chaque enfant traité est ensuite apparié à ses quatre plus proches voisins, sur le support commun. Cette étape corrige la sélection sur les caractéristiques observables, mais elle laisse subsister tout ce qui ne s'observe pas.</w:t>
+        <w:t xml:space="preserve">Un modèle logit estime, pour chaque enfant, la probabilité de vivre dans un ménage bénéficiaire, à partir des caractéristiques du chef de ménage, de la taille du ménage, de la dépense par tête, du milieu et de la région, ainsi que du genre et de l'âge de l'enfant. Chaque enfant traité est ensuite apparié à ses quatre plus proches voisins, sur le support commun. Cette étape corrige la sélection sur les caractéristiques observables, mais elle laisse subsister tout ce qui ne s'observe pas.</w:t>
       </w:r>
     </w:p>
     <w:p>
@@ -1331,7 +1303,7 @@
           <w:sz w:val="24"/>
           <w:szCs w:val="24"/>
         </w:rPr>
-        <w:t xml:space="preserve">Seconde brique, la double différence. Elle compare l'évolution des bénéficiaires entre 2018 et 2021 à celle des témoins sur la même période. Ce faisant, elle élimine tous les déterminants inobservés qui restent stables dans le temps, par exemple les aptitudes du ménage ou son rapport à la scolarisation. Mais prise seule, elle suppose des groupes comparables au départ, ce qui n'est pas le cas ici.</w:t>
+        <w:t xml:space="preserve">Elle compare l'évolution des bénéficiaires entre 2018 et 2021 à celle des témoins sur la même période. Ce faisant, elle élimine tous les déterminants inobservés qui restent stables dans le temps, par exemple les aptitudes du ménage ou son rapport à la scolarisation. Mais prise seule, elle suppose des groupes comparables au départ, ce qui n'est pas le cas ici.</w:t>
       </w:r>
     </w:p>
     <w:p>
@@ -1401,7 +1373,7 @@
           <w:sz w:val="24"/>
           <w:szCs w:val="24"/>
         </w:rPr>
-        <w:t xml:space="preserve">L'estimateur retenu combine les deux, suivant Heckman et ses coauteurs : la double différence est calculée sur les seuls enfants appariés, chaque témoin entrant avec le poids que lui donne l'appariement. Les deux limites se compensent alors : l'appariement rend les groupes comparables sur l'observable, la double différence neutralise l'inobservable stable.</w:t>
+        <w:t xml:space="preserve">Il suit Heckman et ses coauteurs : la double différence est calculée sur les seuls enfants appariés, chaque témoin entrant avec le poids que lui donne l'appariement. Les deux limites se compensent alors : l'appariement rend les groupes comparables sur l'observable, la double différence neutralise l'inobservable stable.</w:t>
       </w:r>
     </w:p>
     <w:p>
@@ -1488,7 +1460,7 @@
           <w:sz w:val="24"/>
           <w:szCs w:val="24"/>
         </w:rPr>
-        <w:t xml:space="preserve">Avant l'effet des transferts, un état des lieux. L'incidence de la pauvreté multidimensionnelle recule de 63,5 pour cent en 2018 à 57,8 pour cent en 2021. Mais l'intensité, c'est-à-dire le nombre moyen de privations parmi les enfants pauvres, reste quasi stable, à un peu plus de 70 pour cent. Autrement dit, il y a moins d'enfants pauvres, mais ceux qui le restent cumulent toujours près de cinq privations sur sept. La distribution, à droite, montre que le seuil de quatre dimensions se situe au voisinage du mode.</w:t>
+        <w:t xml:space="preserve">L'incidence de la pauvreté multidimensionnelle recule de 63,5 pour cent en 2018 à 57,8 pour cent en 2021. Mais l'intensité, c'est-à-dire le nombre moyen de privations parmi les enfants pauvres, reste quasi stable, à un peu plus de 70 pour cent. Autrement dit, il y a moins d'enfants pauvres, mais ceux qui le restent cumulent toujours près de cinq privations sur sept. La distribution, à droite, montre que le seuil de quatre dimensions se situe au voisinage du mode.</w:t>
       </w:r>
     </w:p>
     <w:p>
@@ -1785,20 +1757,6 @@
           <w:sz w:val="24"/>
           <w:szCs w:val="24"/>
         </w:rPr>
-        <w:t xml:space="preserve">J'en viens au résultat central, et je vais l'énoncer sans détour.</w:t>
-      </w:r>
-    </w:p>
-    <w:p>
-      <w:pPr>
-        <w:spacing w:after="160" w:line="360"/>
-        <w:jc w:val="both"/>
-      </w:pPr>
-      <w:r>
-        <w:rPr>
-          <w:rFonts w:ascii="Times New Roman" w:cs="Times New Roman" w:eastAsia="Times New Roman" w:hAnsi="Times New Roman"/>
-          <w:sz w:val="24"/>
-          <w:szCs w:val="24"/>
-        </w:rPr>
         <w:t xml:space="preserve">Sur la période 2018-2021, la pauvreté multidimensionnelle des enfants des ménages bénéficiaires recule plus lentement que celle des témoins appariés. L'écart est de 6,4 points de pourcentage, significatif au seuil de 5 pour cent. Le résultat ne tient pas au choix de l'algorithme : les trois appariements concordent, de 0,050 à 0,064. La double différence sans appariement, qui ne corrige pas l'avantage initial, donne le même signe atténué, à 0,035.</w:t>
       </w:r>
     </w:p>
@@ -1967,7 +1925,7 @@
           <w:sz w:val="24"/>
           <w:szCs w:val="24"/>
         </w:rPr>
-        <w:t xml:space="preserve">Dernier volet, l'intensité du traitement. L'écart défavorable se concentre sur les plus faibles montants : seuls les deux premiers quintiles sont significatifs, à 12,9 et 9,9 points. Il ne se retrouve pas pour les transferts les plus élevés, le dernier quintile étant même très légèrement négatif. La pente dose-réponse, estimée sur le logarithme du montant, vaut moins 0,025 et est significative à 10 pour cent : plus le montant reçu est élevé, plus l'écart tend à se réduire.</w:t>
+        <w:t xml:space="preserve">L'écart défavorable se concentre sur les plus faibles montants : seuls les deux premiers quintiles sont significatifs, à 12,9 et 9,9 points. Il ne se retrouve pas pour les transferts les plus élevés, le dernier quintile étant même très légèrement négatif. La pente dose-réponse, estimée sur le logarithme du montant, vaut moins 0,025 et est significative à 10 pour cent : plus le montant reçu est élevé, plus l'écart tend à se réduire.</w:t>
       </w:r>
     </w:p>
     <w:p>
@@ -2138,7 +2096,7 @@
           <w:sz w:val="24"/>
           <w:szCs w:val="24"/>
         </w:rPr>
-        <w:t xml:space="preserve">Un test mérite d'être signalé, car il nuance la portée du résultat. Si l'on restreint les traités aux bénéficiaires des deux vagues, l'effet tombe à 0,022 en double différence et à moins 0,008 avec appariement, tous deux non significatifs. L'exposition de ces ménages, déjà en cours en 2018, relève d'une autre question que celle du design principal. Autrement dit : le signe et l'ordre de grandeur résistent à l'algorithme comme au seuil, mais la définition du traitement les fait disparaître.</w:t>
+        <w:t xml:space="preserve">Si l'on restreint les traités aux bénéficiaires des deux vagues, l'effet tombe à 0,022 en double différence et à moins 0,008 avec appariement, tous deux non significatifs. L'exposition de ces ménages, déjà en cours en 2018, relève d'une autre question que celle du design principal. Autrement dit : le signe et l'ordre de grandeur résistent à l'algorithme comme au seuil, mais la définition du traitement les fait disparaître.</w:t>
       </w:r>
     </w:p>
     <w:p>
@@ -2208,7 +2166,7 @@
           <w:sz w:val="24"/>
           <w:szCs w:val="24"/>
         </w:rPr>
-        <w:t xml:space="preserve">Comment expliquer qu'une ressource de cette ampleur ne réduise pas les privations ? Trois mécanismes me paraissent devoir être avancés.</w:t>
+        <w:t xml:space="preserve">Trois mécanismes me paraissent devoir être avancés.</w:t>
       </w:r>
     </w:p>
     <w:p>
@@ -2407,7 +2365,7 @@
           <w:sz w:val="24"/>
           <w:szCs w:val="24"/>
         </w:rPr>
-        <w:t xml:space="preserve">Quatre apports se dégagent. Une mesure de la pauvreté multidimensionnelle des enfants sur deux vagues de l'EHCVM, selon l'approche MODA. Le constat d'un recul réel de l'incidence, de 63,5 à 57,8 pour cent, sur fond d'une pauvreté qui reste massive. Le résultat central, à savoir que les transferts ne réduisent pas, à trois ans, la pauvreté multidimensionnelle des enfants. Et sa localisation précise : la nutrition, les 0 à 4 ans et les plus faibles montants reçus.</w:t>
+        <w:t xml:space="preserve">Une mesure de la pauvreté multidimensionnelle des enfants sur deux vagues de l'EHCVM, selon l'approche MODA. Le constat d'un recul réel de l'incidence, de 63,5 à 57,8 pour cent, sur fond d'une pauvreté qui reste massive. Le résultat central, à savoir que les transferts ne réduisent pas, à trois ans, la pauvreté multidimensionnelle des enfants. Et sa localisation précise : la nutrition, les 0 à 4 ans et les plus faibles montants reçus.</w:t>
       </w:r>
     </w:p>
     <w:p>
@@ -2477,20 +2435,6 @@
           <w:sz w:val="24"/>
           <w:szCs w:val="24"/>
         </w:rPr>
-        <w:t xml:space="preserve">Les recommandations suivent l'ordre de ces faits.</w:t>
-      </w:r>
-    </w:p>
-    <w:p>
-      <w:pPr>
-        <w:spacing w:after="160" w:line="360"/>
-        <w:jc w:val="both"/>
-      </w:pPr>
-      <w:r>
-        <w:rPr>
-          <w:rFonts w:ascii="Times New Roman" w:cs="Times New Roman" w:eastAsia="Times New Roman" w:hAnsi="Times New Roman"/>
-          <w:sz w:val="24"/>
-          <w:szCs w:val="24"/>
-        </w:rPr>
         <w:t xml:space="preserve">Là où l'écart se concentre, d'abord : donner la priorité à la sécurité alimentaire des enfants dans les zones d'émigration, cibler les enfants de 0 à 4 ans des ménages bénéficiaires, et accompagner en priorité les ménages qui reçoivent les plus faibles montants. J'insiste sur un point : recevoir des transferts ne doit pas valoir exclusion des filets sociaux, puisque c'est précisément chez ces ménages que la trajectoire est la moins favorable.</w:t>
       </w:r>
     </w:p>
@@ -2575,7 +2519,7 @@
           <w:sz w:val="24"/>
           <w:szCs w:val="24"/>
         </w:rPr>
-        <w:t xml:space="preserve">Ce travail a ses limites, et je préfère les énoncer moi-même. L'hypothèse de tendances parallèles n'est pas testable directement, deux vagues seulement étant disponibles ; l'appariement sur les niveaux initiaux la rend plus crédible sans la démontrer. Les enfants vieillissent entre les deux enquêtes et sont évalués sur la grille de leur âge courant ; le fait de figer les groupes d'âge à la période de base neutralise l'essentiel de cet effet. Enfin, la nutrition et la santé reposent sur les seuls indicateurs strictement comparables entre les deux vagues, car un indicateur redéfini entre 2018 et 2021 produirait un effet mesuré sans contenu causal.</w:t>
+        <w:t xml:space="preserve">L'hypothèse de tendances parallèles n'est pas testable directement, deux vagues seulement étant disponibles ; l'appariement sur les niveaux initiaux la rend plus crédible sans la démontrer. Les enfants vieillissent entre les deux enquêtes et sont évalués sur la grille de leur âge courant ; le fait de figer les groupes d'âge à la période de base neutralise l'essentiel de cet effet. Enfin, la nutrition et la santé reposent sur les seuls indicateurs strictement comparables entre les deux vagues, car un indicateur redéfini entre 2018 et 2021 produirait un effet mesuré sans contenu causal.</w:t>
       </w:r>
     </w:p>
     <w:p>
@@ -2645,7 +2589,7 @@
           <w:sz w:val="24"/>
           <w:szCs w:val="24"/>
         </w:rPr>
-        <w:t xml:space="preserve">Trois prolongements me semblent utiles : analyser les mécanismes de transmission à travers les dépenses d'éducation, de santé et de logement ; intégrer la durée d'exposition aux transferts et leurs usages effectifs, que le statut binaire ne capte pas ; et étendre l'analyse aux autres pays de l'UEMOA couverts par l'EHCVM, dont le questionnaire est harmonisé.</w:t>
+        <w:t xml:space="preserve">Analyser les mécanismes de transmission à travers les dépenses d'éducation, de santé et de logement ; intégrer la durée d'exposition aux transferts et leurs usages effectifs, que le statut binaire ne capte pas ; et étendre l'analyse aux autres pays de l'UEMOA couverts par l'EHCVM, dont le questionnaire est harmonisé.</w:t>
       </w:r>
     </w:p>
     <w:p>
@@ -2732,7 +2676,7 @@
           <w:sz w:val="24"/>
           <w:szCs w:val="24"/>
         </w:rPr>
-        <w:t xml:space="preserve">Je vous remercie de votre attention et je me tiens à votre disposition pour vos questions.</w:t>
+        <w:t xml:space="preserve">Je me tiens à votre disposition pour vos questions.</w:t>
       </w:r>
     </w:p>
     <w:p>

</xml_diff>

<commit_message>
Supprimer les redondances du discours et du diaporama (#762)
Discours : dix-huit paragraphes reprenaient mot pour mot la phrase
d'attaque qui les precede. Quatre sont supprimes, les autres commencent
desormais ou l'attaque s'arrete.

Diaporama : le bloc de lecture du resultat central annoncait les trois
diapositives suivantes, il est retire ; le renvoi a H1 faisait double
emploi avec la diapositive de validation ; la stabilite selon le genre
du chef etait deja lisible dans le tableau qui la surmonte.


Claude-Session: https://claude.ai/code/session_01837AJxDdpW6rUH9DV9QD1H

Co-authored-by: Claude <noreply@anthropic.com>
</commit_message>
<xml_diff>
--- a/Presentation/discours/discours_soutenance.docx
+++ b/Presentation/discours/discours_soutenance.docx
@@ -190,20 +190,6 @@
           <w:sz w:val="24"/>
           <w:szCs w:val="24"/>
         </w:rPr>
-        <w:t xml:space="preserve">Monsieur le Président du jury, Madame et Messieurs les membres du jury, Monsieur le Directeur de mémoire, mesdames et messieurs, bonjour.</w:t>
-      </w:r>
-    </w:p>
-    <w:p>
-      <w:pPr>
-        <w:spacing w:after="160" w:line="360"/>
-        <w:jc w:val="both"/>
-      </w:pPr>
-      <w:r>
-        <w:rPr>
-          <w:rFonts w:ascii="Times New Roman" w:cs="Times New Roman" w:eastAsia="Times New Roman" w:hAnsi="Times New Roman"/>
-          <w:sz w:val="24"/>
-          <w:szCs w:val="24"/>
-        </w:rPr>
         <w:t xml:space="preserve">Je vous remercie de votre présence. Je vais vous présenter les résultats de mon mémoire de fin d'études, consacré à l'impact des transferts de migrants sur la pauvreté multidimensionnelle des enfants au Sénégal. Ce travail a été mené sous la direction de Monsieur Mamadou Abdoulaye Diallo, que je remercie pour son accompagnement.</w:t>
       </w:r>
     </w:p>
@@ -291,7 +277,7 @@
           <w:sz w:val="24"/>
           <w:szCs w:val="24"/>
         </w:rPr>
-        <w:t xml:space="preserve">Mon exposé suivra six temps. Je poserai d'abord le contexte et la question de recherche. Je situerai ensuite le travail dans la littérature. Je présenterai le cadre méthodologique, c'est-à-dire les données, la mesure de la pauvreté et la stratégie d'identification. Viendront alors les résultats, puis leur mise à l'épreuve et leur interprétation. Je terminerai par la conclusion et les recommandations.</w:t>
+        <w:t xml:space="preserve">Je poserai d'abord le contexte et la question de recherche. Je situerai ensuite le travail dans la littérature. Je présenterai le cadre méthodologique, c'est-à-dire les données, la mesure de la pauvreté et la stratégie d'identification. Viendront alors les résultats, puis leur mise à l'épreuve et leur interprétation. Je terminerai par la conclusion et les recommandations.</w:t>
       </w:r>
     </w:p>
     <w:p>
@@ -378,20 +364,6 @@
           <w:sz w:val="24"/>
           <w:szCs w:val="24"/>
         </w:rPr>
-        <w:t xml:space="preserve">Deux réalités coexistent au Sénégal, et c'est de leur rencontre que naît ce travail.</w:t>
-      </w:r>
-    </w:p>
-    <w:p>
-      <w:pPr>
-        <w:spacing w:after="160" w:line="360"/>
-        <w:jc w:val="both"/>
-      </w:pPr>
-      <w:r>
-        <w:rPr>
-          <w:rFonts w:ascii="Times New Roman" w:cs="Times New Roman" w:eastAsia="Times New Roman" w:hAnsi="Times New Roman"/>
-          <w:sz w:val="24"/>
-          <w:szCs w:val="24"/>
-        </w:rPr>
         <w:t xml:space="preserve">La première est financière. Les transferts reçus de la diaspora sont passés de 233 millions de dollars en 2000 à 2 220 millions en 2017, soit de 166 à 1 242 milliards de francs CFA. Ils représentent 12,1 pour cent du produit intérieur brut, ce qui place le Sénégal au quatrième rang des récepteurs d'Afrique subsaharienne. Rapportés au ménage, les montants reçus avoisinent le seuil de pauvreté monétaire annuel par tête : il ne s'agit donc pas d'un appoint marginal, mais d'une ressource qui peut, en théorie, changer les conditions de vie.</w:t>
       </w:r>
     </w:p>
@@ -493,7 +465,7 @@
           <w:sz w:val="24"/>
           <w:szCs w:val="24"/>
         </w:rPr>
-        <w:t xml:space="preserve">D'où la question qui structure ce mémoire : dans quelle mesure les transferts de migrants réduisent-ils la pauvreté multidimensionnelle des enfants au Sénégal ?</w:t>
+        <w:t xml:space="preserve">Dans quelle mesure les transferts de migrants réduisent-ils la pauvreté multidimensionnelle des enfants au Sénégal ?</w:t>
       </w:r>
     </w:p>
     <w:p>
@@ -678,7 +650,7 @@
           <w:sz w:val="24"/>
           <w:szCs w:val="24"/>
         </w:rPr>
-        <w:t xml:space="preserve">Un mot d'abord sur la migration elle-même, car la décision de migrer et celle d'envoyer des fonds sont indissociables. La théorie néoclassique explique la migration par un calcul d'investissement : l'individu migre si la valeur actualisée des gains attendus à destination, nette des coûts du déplacement, excède ses gains d'origine, la décision se fondant sur le revenu espéré plutôt qu'effectif. Les envois de fonds sont alors le rendement de cet investissement migratoire.</w:t>
+        <w:t xml:space="preserve">La décision de migrer et celle d'envoyer des fonds sont indissociables. La théorie néoclassique explique la migration par un calcul d'investissement : l'individu migre si la valeur actualisée des gains attendus à destination, nette des coûts du déplacement, excède ses gains d'origine, la décision se fondant sur le revenu espéré plutôt qu'effectif. Les envois de fonds sont alors le rendement de cet investissement migratoire.</w:t>
       </w:r>
     </w:p>
     <w:p>
@@ -1261,7 +1233,7 @@
           <w:sz w:val="24"/>
           <w:szCs w:val="24"/>
         </w:rPr>
-        <w:t xml:space="preserve">Première brique, l'appariement par score de propension. Un modèle logit estime, pour chaque enfant, la probabilité de vivre dans un ménage bénéficiaire, à partir des caractéristiques du chef de ménage, de la taille du ménage, de la dépense par tête, du milieu et de la région, ainsi que du genre et de l'âge de l'enfant. Chaque enfant traité est ensuite apparié à ses quatre plus proches voisins, sur le support commun. Cette étape corrige la sélection sur les caractéristiques observables, mais elle laisse subsister tout ce qui ne s'observe pas.</w:t>
+        <w:t xml:space="preserve">Un modèle logit estime, pour chaque enfant, la probabilité de vivre dans un ménage bénéficiaire, à partir des caractéristiques du chef de ménage, de la taille du ménage, de la dépense par tête, du milieu et de la région, ainsi que du genre et de l'âge de l'enfant. Chaque enfant traité est ensuite apparié à ses quatre plus proches voisins, sur le support commun. Cette étape corrige la sélection sur les caractéristiques observables, mais elle laisse subsister tout ce qui ne s'observe pas.</w:t>
       </w:r>
     </w:p>
     <w:p>
@@ -1331,7 +1303,7 @@
           <w:sz w:val="24"/>
           <w:szCs w:val="24"/>
         </w:rPr>
-        <w:t xml:space="preserve">Seconde brique, la double différence. Elle compare l'évolution des bénéficiaires entre 2018 et 2021 à celle des témoins sur la même période. Ce faisant, elle élimine tous les déterminants inobservés qui restent stables dans le temps, par exemple les aptitudes du ménage ou son rapport à la scolarisation. Mais prise seule, elle suppose des groupes comparables au départ, ce qui n'est pas le cas ici.</w:t>
+        <w:t xml:space="preserve">Elle compare l'évolution des bénéficiaires entre 2018 et 2021 à celle des témoins sur la même période. Ce faisant, elle élimine tous les déterminants inobservés qui restent stables dans le temps, par exemple les aptitudes du ménage ou son rapport à la scolarisation. Mais prise seule, elle suppose des groupes comparables au départ, ce qui n'est pas le cas ici.</w:t>
       </w:r>
     </w:p>
     <w:p>
@@ -1401,7 +1373,7 @@
           <w:sz w:val="24"/>
           <w:szCs w:val="24"/>
         </w:rPr>
-        <w:t xml:space="preserve">L'estimateur retenu combine les deux, suivant Heckman et ses coauteurs : la double différence est calculée sur les seuls enfants appariés, chaque témoin entrant avec le poids que lui donne l'appariement. Les deux limites se compensent alors : l'appariement rend les groupes comparables sur l'observable, la double différence neutralise l'inobservable stable.</w:t>
+        <w:t xml:space="preserve">Il suit Heckman et ses coauteurs : la double différence est calculée sur les seuls enfants appariés, chaque témoin entrant avec le poids que lui donne l'appariement. Les deux limites se compensent alors : l'appariement rend les groupes comparables sur l'observable, la double différence neutralise l'inobservable stable.</w:t>
       </w:r>
     </w:p>
     <w:p>
@@ -1488,7 +1460,7 @@
           <w:sz w:val="24"/>
           <w:szCs w:val="24"/>
         </w:rPr>
-        <w:t xml:space="preserve">Avant l'effet des transferts, un état des lieux. L'incidence de la pauvreté multidimensionnelle recule de 63,5 pour cent en 2018 à 57,8 pour cent en 2021. Mais l'intensité, c'est-à-dire le nombre moyen de privations parmi les enfants pauvres, reste quasi stable, à un peu plus de 70 pour cent. Autrement dit, il y a moins d'enfants pauvres, mais ceux qui le restent cumulent toujours près de cinq privations sur sept. La distribution, à droite, montre que le seuil de quatre dimensions se situe au voisinage du mode.</w:t>
+        <w:t xml:space="preserve">L'incidence de la pauvreté multidimensionnelle recule de 63,5 pour cent en 2018 à 57,8 pour cent en 2021. Mais l'intensité, c'est-à-dire le nombre moyen de privations parmi les enfants pauvres, reste quasi stable, à un peu plus de 70 pour cent. Autrement dit, il y a moins d'enfants pauvres, mais ceux qui le restent cumulent toujours près de cinq privations sur sept. La distribution, à droite, montre que le seuil de quatre dimensions se situe au voisinage du mode.</w:t>
       </w:r>
     </w:p>
     <w:p>
@@ -1785,20 +1757,6 @@
           <w:sz w:val="24"/>
           <w:szCs w:val="24"/>
         </w:rPr>
-        <w:t xml:space="preserve">J'en viens au résultat central, et je vais l'énoncer sans détour.</w:t>
-      </w:r>
-    </w:p>
-    <w:p>
-      <w:pPr>
-        <w:spacing w:after="160" w:line="360"/>
-        <w:jc w:val="both"/>
-      </w:pPr>
-      <w:r>
-        <w:rPr>
-          <w:rFonts w:ascii="Times New Roman" w:cs="Times New Roman" w:eastAsia="Times New Roman" w:hAnsi="Times New Roman"/>
-          <w:sz w:val="24"/>
-          <w:szCs w:val="24"/>
-        </w:rPr>
         <w:t xml:space="preserve">Sur la période 2018-2021, la pauvreté multidimensionnelle des enfants des ménages bénéficiaires recule plus lentement que celle des témoins appariés. L'écart est de 6,4 points de pourcentage, significatif au seuil de 5 pour cent. Le résultat ne tient pas au choix de l'algorithme : les trois appariements concordent, de 0,050 à 0,064. La double différence sans appariement, qui ne corrige pas l'avantage initial, donne le même signe atténué, à 0,035.</w:t>
       </w:r>
     </w:p>
@@ -1967,7 +1925,7 @@
           <w:sz w:val="24"/>
           <w:szCs w:val="24"/>
         </w:rPr>
-        <w:t xml:space="preserve">Dernier volet, l'intensité du traitement. L'écart défavorable se concentre sur les plus faibles montants : seuls les deux premiers quintiles sont significatifs, à 12,9 et 9,9 points. Il ne se retrouve pas pour les transferts les plus élevés, le dernier quintile étant même très légèrement négatif. La pente dose-réponse, estimée sur le logarithme du montant, vaut moins 0,025 et est significative à 10 pour cent : plus le montant reçu est élevé, plus l'écart tend à se réduire.</w:t>
+        <w:t xml:space="preserve">L'écart défavorable se concentre sur les plus faibles montants : seuls les deux premiers quintiles sont significatifs, à 12,9 et 9,9 points. Il ne se retrouve pas pour les transferts les plus élevés, le dernier quintile étant même très légèrement négatif. La pente dose-réponse, estimée sur le logarithme du montant, vaut moins 0,025 et est significative à 10 pour cent : plus le montant reçu est élevé, plus l'écart tend à se réduire.</w:t>
       </w:r>
     </w:p>
     <w:p>
@@ -2138,7 +2096,7 @@
           <w:sz w:val="24"/>
           <w:szCs w:val="24"/>
         </w:rPr>
-        <w:t xml:space="preserve">Un test mérite d'être signalé, car il nuance la portée du résultat. Si l'on restreint les traités aux bénéficiaires des deux vagues, l'effet tombe à 0,022 en double différence et à moins 0,008 avec appariement, tous deux non significatifs. L'exposition de ces ménages, déjà en cours en 2018, relève d'une autre question que celle du design principal. Autrement dit : le signe et l'ordre de grandeur résistent à l'algorithme comme au seuil, mais la définition du traitement les fait disparaître.</w:t>
+        <w:t xml:space="preserve">Si l'on restreint les traités aux bénéficiaires des deux vagues, l'effet tombe à 0,022 en double différence et à moins 0,008 avec appariement, tous deux non significatifs. L'exposition de ces ménages, déjà en cours en 2018, relève d'une autre question que celle du design principal. Autrement dit : le signe et l'ordre de grandeur résistent à l'algorithme comme au seuil, mais la définition du traitement les fait disparaître.</w:t>
       </w:r>
     </w:p>
     <w:p>
@@ -2208,7 +2166,7 @@
           <w:sz w:val="24"/>
           <w:szCs w:val="24"/>
         </w:rPr>
-        <w:t xml:space="preserve">Comment expliquer qu'une ressource de cette ampleur ne réduise pas les privations ? Trois mécanismes me paraissent devoir être avancés.</w:t>
+        <w:t xml:space="preserve">Trois mécanismes me paraissent devoir être avancés.</w:t>
       </w:r>
     </w:p>
     <w:p>
@@ -2407,7 +2365,7 @@
           <w:sz w:val="24"/>
           <w:szCs w:val="24"/>
         </w:rPr>
-        <w:t xml:space="preserve">Quatre apports se dégagent. Une mesure de la pauvreté multidimensionnelle des enfants sur deux vagues de l'EHCVM, selon l'approche MODA. Le constat d'un recul réel de l'incidence, de 63,5 à 57,8 pour cent, sur fond d'une pauvreté qui reste massive. Le résultat central, à savoir que les transferts ne réduisent pas, à trois ans, la pauvreté multidimensionnelle des enfants. Et sa localisation précise : la nutrition, les 0 à 4 ans et les plus faibles montants reçus.</w:t>
+        <w:t xml:space="preserve">Une mesure de la pauvreté multidimensionnelle des enfants sur deux vagues de l'EHCVM, selon l'approche MODA. Le constat d'un recul réel de l'incidence, de 63,5 à 57,8 pour cent, sur fond d'une pauvreté qui reste massive. Le résultat central, à savoir que les transferts ne réduisent pas, à trois ans, la pauvreté multidimensionnelle des enfants. Et sa localisation précise : la nutrition, les 0 à 4 ans et les plus faibles montants reçus.</w:t>
       </w:r>
     </w:p>
     <w:p>
@@ -2477,20 +2435,6 @@
           <w:sz w:val="24"/>
           <w:szCs w:val="24"/>
         </w:rPr>
-        <w:t xml:space="preserve">Les recommandations suivent l'ordre de ces faits.</w:t>
-      </w:r>
-    </w:p>
-    <w:p>
-      <w:pPr>
-        <w:spacing w:after="160" w:line="360"/>
-        <w:jc w:val="both"/>
-      </w:pPr>
-      <w:r>
-        <w:rPr>
-          <w:rFonts w:ascii="Times New Roman" w:cs="Times New Roman" w:eastAsia="Times New Roman" w:hAnsi="Times New Roman"/>
-          <w:sz w:val="24"/>
-          <w:szCs w:val="24"/>
-        </w:rPr>
         <w:t xml:space="preserve">Là où l'écart se concentre, d'abord : donner la priorité à la sécurité alimentaire des enfants dans les zones d'émigration, cibler les enfants de 0 à 4 ans des ménages bénéficiaires, et accompagner en priorité les ménages qui reçoivent les plus faibles montants. J'insiste sur un point : recevoir des transferts ne doit pas valoir exclusion des filets sociaux, puisque c'est précisément chez ces ménages que la trajectoire est la moins favorable.</w:t>
       </w:r>
     </w:p>
@@ -2575,7 +2519,7 @@
           <w:sz w:val="24"/>
           <w:szCs w:val="24"/>
         </w:rPr>
-        <w:t xml:space="preserve">Ce travail a ses limites, et je préfère les énoncer moi-même. L'hypothèse de tendances parallèles n'est pas testable directement, deux vagues seulement étant disponibles ; l'appariement sur les niveaux initiaux la rend plus crédible sans la démontrer. Les enfants vieillissent entre les deux enquêtes et sont évalués sur la grille de leur âge courant ; le fait de figer les groupes d'âge à la période de base neutralise l'essentiel de cet effet. Enfin, la nutrition et la santé reposent sur les seuls indicateurs strictement comparables entre les deux vagues, car un indicateur redéfini entre 2018 et 2021 produirait un effet mesuré sans contenu causal.</w:t>
+        <w:t xml:space="preserve">L'hypothèse de tendances parallèles n'est pas testable directement, deux vagues seulement étant disponibles ; l'appariement sur les niveaux initiaux la rend plus crédible sans la démontrer. Les enfants vieillissent entre les deux enquêtes et sont évalués sur la grille de leur âge courant ; le fait de figer les groupes d'âge à la période de base neutralise l'essentiel de cet effet. Enfin, la nutrition et la santé reposent sur les seuls indicateurs strictement comparables entre les deux vagues, car un indicateur redéfini entre 2018 et 2021 produirait un effet mesuré sans contenu causal.</w:t>
       </w:r>
     </w:p>
     <w:p>
@@ -2645,7 +2589,7 @@
           <w:sz w:val="24"/>
           <w:szCs w:val="24"/>
         </w:rPr>
-        <w:t xml:space="preserve">Trois prolongements me semblent utiles : analyser les mécanismes de transmission à travers les dépenses d'éducation, de santé et de logement ; intégrer la durée d'exposition aux transferts et leurs usages effectifs, que le statut binaire ne capte pas ; et étendre l'analyse aux autres pays de l'UEMOA couverts par l'EHCVM, dont le questionnaire est harmonisé.</w:t>
+        <w:t xml:space="preserve">Analyser les mécanismes de transmission à travers les dépenses d'éducation, de santé et de logement ; intégrer la durée d'exposition aux transferts et leurs usages effectifs, que le statut binaire ne capte pas ; et étendre l'analyse aux autres pays de l'UEMOA couverts par l'EHCVM, dont le questionnaire est harmonisé.</w:t>
       </w:r>
     </w:p>
     <w:p>
@@ -2732,7 +2676,7 @@
           <w:sz w:val="24"/>
           <w:szCs w:val="24"/>
         </w:rPr>
-        <w:t xml:space="preserve">Je vous remercie de votre attention et je me tiens à votre disposition pour vos questions.</w:t>
+        <w:t xml:space="preserve">Je me tiens à votre disposition pour vos questions.</w:t>
       </w:r>
     </w:p>
     <w:p>

</xml_diff>